<commit_message>
VICII Improvements. Better separtion between c ang g access cycles in VICII. Now much more demos works perfectly.
</commit_message>
<xml_diff>
--- a/docs/C64Data/C64_DEBUG_File_Format.docx
+++ b/docs/C64Data/C64_DEBUG_File_Format.docx
@@ -561,7 +561,7 @@
       <w:pPr>
         <w:pStyle w:val="Ttulo1"/>
       </w:pPr>
-      <w:bookmarkStart w:id="0" w:name="_Toc238462332"/>
+      <w:bookmarkStart w:id="0" w:name="_Toc238487550"/>
       <w:r>
         <w:lastRenderedPageBreak/>
         <w:t>Contents</w:t>
@@ -596,7 +596,7 @@
       <w:r>
         <w:fldChar w:fldCharType="separate"/>
       </w:r>
-      <w:hyperlink w:anchor="_Toc238462332" w:history="1">
+      <w:hyperlink w:anchor="_Toc238487550" w:history="1">
         <w:r>
           <w:rPr>
             <w:rStyle w:val="Hipervnculo"/>
@@ -623,7 +623,7 @@
             <w:noProof/>
             <w:webHidden/>
           </w:rPr>
-          <w:instrText xml:space="preserve"> PAGEREF _Toc238462332 \h </w:instrText>
+          <w:instrText xml:space="preserve"> PAGEREF _Toc238487550 \h </w:instrText>
         </w:r>
         <w:r>
           <w:rPr>
@@ -674,7 +674,7 @@
           <w14:ligatures w14:val="standardContextual"/>
         </w:rPr>
       </w:pPr>
-      <w:hyperlink w:anchor="_Toc238462333" w:history="1">
+      <w:hyperlink w:anchor="_Toc238487551" w:history="1">
         <w:r>
           <w:rPr>
             <w:rStyle w:val="Hipervnculo"/>
@@ -701,7 +701,7 @@
             <w:noProof/>
             <w:webHidden/>
           </w:rPr>
-          <w:instrText xml:space="preserve"> PAGEREF _Toc238462333 \h </w:instrText>
+          <w:instrText xml:space="preserve"> PAGEREF _Toc238487551 \h </w:instrText>
         </w:r>
         <w:r>
           <w:rPr>
@@ -752,7 +752,7 @@
           <w14:ligatures w14:val="standardContextual"/>
         </w:rPr>
       </w:pPr>
-      <w:hyperlink w:anchor="_Toc238462334" w:history="1">
+      <w:hyperlink w:anchor="_Toc238487552" w:history="1">
         <w:r>
           <w:rPr>
             <w:rStyle w:val="Hipervnculo"/>
@@ -779,7 +779,7 @@
             <w:noProof/>
             <w:webHidden/>
           </w:rPr>
-          <w:instrText xml:space="preserve"> PAGEREF _Toc238462334 \h </w:instrText>
+          <w:instrText xml:space="preserve"> PAGEREF _Toc238487552 \h </w:instrText>
         </w:r>
         <w:r>
           <w:rPr>
@@ -829,7 +829,7 @@
           <w14:ligatures w14:val="standardContextual"/>
         </w:rPr>
       </w:pPr>
-      <w:hyperlink w:anchor="_Toc238462335" w:history="1">
+      <w:hyperlink w:anchor="_Toc238487553" w:history="1">
         <w:r>
           <w:rPr>
             <w:rStyle w:val="Hipervnculo"/>
@@ -856,7 +856,7 @@
             <w:noProof/>
             <w:webHidden/>
           </w:rPr>
-          <w:instrText xml:space="preserve"> PAGEREF _Toc238462335 \h </w:instrText>
+          <w:instrText xml:space="preserve"> PAGEREF _Toc238487553 \h </w:instrText>
         </w:r>
         <w:r>
           <w:rPr>
@@ -907,7 +907,7 @@
           <w14:ligatures w14:val="standardContextual"/>
         </w:rPr>
       </w:pPr>
-      <w:hyperlink w:anchor="_Toc238462336" w:history="1">
+      <w:hyperlink w:anchor="_Toc238487554" w:history="1">
         <w:r>
           <w:rPr>
             <w:rStyle w:val="Hipervnculo"/>
@@ -934,7 +934,7 @@
             <w:noProof/>
             <w:webHidden/>
           </w:rPr>
-          <w:instrText xml:space="preserve"> PAGEREF _Toc238462336 \h </w:instrText>
+          <w:instrText xml:space="preserve"> PAGEREF _Toc238487554 \h </w:instrText>
         </w:r>
         <w:r>
           <w:rPr>
@@ -984,7 +984,7 @@
           <w14:ligatures w14:val="standardContextual"/>
         </w:rPr>
       </w:pPr>
-      <w:hyperlink w:anchor="_Toc238462337" w:history="1">
+      <w:hyperlink w:anchor="_Toc238487555" w:history="1">
         <w:r>
           <w:rPr>
             <w:rStyle w:val="Hipervnculo"/>
@@ -1011,7 +1011,7 @@
             <w:noProof/>
             <w:webHidden/>
           </w:rPr>
-          <w:instrText xml:space="preserve"> PAGEREF _Toc238462337 \h </w:instrText>
+          <w:instrText xml:space="preserve"> PAGEREF _Toc238487555 \h </w:instrText>
         </w:r>
         <w:r>
           <w:rPr>
@@ -1061,7 +1061,7 @@
           <w14:ligatures w14:val="standardContextual"/>
         </w:rPr>
       </w:pPr>
-      <w:hyperlink w:anchor="_Toc238462338" w:history="1">
+      <w:hyperlink w:anchor="_Toc238487556" w:history="1">
         <w:r>
           <w:rPr>
             <w:rStyle w:val="Hipervnculo"/>
@@ -1088,7 +1088,7 @@
             <w:noProof/>
             <w:webHidden/>
           </w:rPr>
-          <w:instrText xml:space="preserve"> PAGEREF _Toc238462338 \h </w:instrText>
+          <w:instrText xml:space="preserve"> PAGEREF _Toc238487556 \h </w:instrText>
         </w:r>
         <w:r>
           <w:rPr>
@@ -1139,7 +1139,7 @@
           <w14:ligatures w14:val="standardContextual"/>
         </w:rPr>
       </w:pPr>
-      <w:hyperlink w:anchor="_Toc238462339" w:history="1">
+      <w:hyperlink w:anchor="_Toc238487557" w:history="1">
         <w:r>
           <w:rPr>
             <w:rStyle w:val="Hipervnculo"/>
@@ -1166,7 +1166,7 @@
             <w:noProof/>
             <w:webHidden/>
           </w:rPr>
-          <w:instrText xml:space="preserve"> PAGEREF _Toc238462339 \h </w:instrText>
+          <w:instrText xml:space="preserve"> PAGEREF _Toc238487557 \h </w:instrText>
         </w:r>
         <w:r>
           <w:rPr>
@@ -1216,7 +1216,7 @@
           <w14:ligatures w14:val="standardContextual"/>
         </w:rPr>
       </w:pPr>
-      <w:hyperlink w:anchor="_Toc238462340" w:history="1">
+      <w:hyperlink w:anchor="_Toc238487558" w:history="1">
         <w:r>
           <w:rPr>
             <w:rStyle w:val="Hipervnculo"/>
@@ -1243,7 +1243,7 @@
             <w:noProof/>
             <w:webHidden/>
           </w:rPr>
-          <w:instrText xml:space="preserve"> PAGEREF _Toc238462340 \h </w:instrText>
+          <w:instrText xml:space="preserve"> PAGEREF _Toc238487558 \h </w:instrText>
         </w:r>
         <w:r>
           <w:rPr>
@@ -1293,7 +1293,7 @@
           <w14:ligatures w14:val="standardContextual"/>
         </w:rPr>
       </w:pPr>
-      <w:hyperlink w:anchor="_Toc238462341" w:history="1">
+      <w:hyperlink w:anchor="_Toc238487559" w:history="1">
         <w:r>
           <w:rPr>
             <w:rStyle w:val="Hipervnculo"/>
@@ -1320,7 +1320,7 @@
             <w:noProof/>
             <w:webHidden/>
           </w:rPr>
-          <w:instrText xml:space="preserve"> PAGEREF _Toc238462341 \h </w:instrText>
+          <w:instrText xml:space="preserve"> PAGEREF _Toc238487559 \h </w:instrText>
         </w:r>
         <w:r>
           <w:rPr>
@@ -1371,7 +1371,7 @@
           <w14:ligatures w14:val="standardContextual"/>
         </w:rPr>
       </w:pPr>
-      <w:hyperlink w:anchor="_Toc238462342" w:history="1">
+      <w:hyperlink w:anchor="_Toc238487560" w:history="1">
         <w:r>
           <w:rPr>
             <w:rStyle w:val="Hipervnculo"/>
@@ -1398,7 +1398,7 @@
             <w:noProof/>
             <w:webHidden/>
           </w:rPr>
-          <w:instrText xml:space="preserve"> PAGEREF _Toc238462342 \h </w:instrText>
+          <w:instrText xml:space="preserve"> PAGEREF _Toc238487560 \h </w:instrText>
         </w:r>
         <w:r>
           <w:rPr>
@@ -1448,7 +1448,7 @@
           <w14:ligatures w14:val="standardContextual"/>
         </w:rPr>
       </w:pPr>
-      <w:hyperlink w:anchor="_Toc238462343" w:history="1">
+      <w:hyperlink w:anchor="_Toc238487561" w:history="1">
         <w:r>
           <w:rPr>
             <w:rStyle w:val="Hipervnculo"/>
@@ -1475,7 +1475,7 @@
             <w:noProof/>
             <w:webHidden/>
           </w:rPr>
-          <w:instrText xml:space="preserve"> PAGEREF _Toc238462343 \h </w:instrText>
+          <w:instrText xml:space="preserve"> PAGEREF _Toc238487561 \h </w:instrText>
         </w:r>
         <w:r>
           <w:rPr>
@@ -1525,7 +1525,7 @@
           <w14:ligatures w14:val="standardContextual"/>
         </w:rPr>
       </w:pPr>
-      <w:hyperlink w:anchor="_Toc238462344" w:history="1">
+      <w:hyperlink w:anchor="_Toc238487562" w:history="1">
         <w:r>
           <w:rPr>
             <w:rStyle w:val="Hipervnculo"/>
@@ -1552,7 +1552,7 @@
             <w:noProof/>
             <w:webHidden/>
           </w:rPr>
-          <w:instrText xml:space="preserve"> PAGEREF _Toc238462344 \h </w:instrText>
+          <w:instrText xml:space="preserve"> PAGEREF _Toc238487562 \h </w:instrText>
         </w:r>
         <w:r>
           <w:rPr>
@@ -1602,7 +1602,7 @@
           <w14:ligatures w14:val="standardContextual"/>
         </w:rPr>
       </w:pPr>
-      <w:hyperlink w:anchor="_Toc238462345" w:history="1">
+      <w:hyperlink w:anchor="_Toc238487563" w:history="1">
         <w:r>
           <w:rPr>
             <w:rStyle w:val="Hipervnculo"/>
@@ -1629,7 +1629,7 @@
             <w:noProof/>
             <w:webHidden/>
           </w:rPr>
-          <w:instrText xml:space="preserve"> PAGEREF _Toc238462345 \h </w:instrText>
+          <w:instrText xml:space="preserve"> PAGEREF _Toc238487563 \h </w:instrText>
         </w:r>
         <w:r>
           <w:rPr>
@@ -1679,7 +1679,7 @@
           <w14:ligatures w14:val="standardContextual"/>
         </w:rPr>
       </w:pPr>
-      <w:hyperlink w:anchor="_Toc238462346" w:history="1">
+      <w:hyperlink w:anchor="_Toc238487564" w:history="1">
         <w:r>
           <w:rPr>
             <w:rStyle w:val="Hipervnculo"/>
@@ -1706,7 +1706,7 @@
             <w:noProof/>
             <w:webHidden/>
           </w:rPr>
-          <w:instrText xml:space="preserve"> PAGEREF _Toc238462346 \h </w:instrText>
+          <w:instrText xml:space="preserve"> PAGEREF _Toc238487564 \h </w:instrText>
         </w:r>
         <w:r>
           <w:rPr>
@@ -1756,7 +1756,7 @@
           <w14:ligatures w14:val="standardContextual"/>
         </w:rPr>
       </w:pPr>
-      <w:hyperlink w:anchor="_Toc238462347" w:history="1">
+      <w:hyperlink w:anchor="_Toc238487565" w:history="1">
         <w:r>
           <w:rPr>
             <w:rStyle w:val="Hipervnculo"/>
@@ -1783,7 +1783,7 @@
             <w:noProof/>
             <w:webHidden/>
           </w:rPr>
-          <w:instrText xml:space="preserve"> PAGEREF _Toc238462347 \h </w:instrText>
+          <w:instrText xml:space="preserve"> PAGEREF _Toc238487565 \h </w:instrText>
         </w:r>
         <w:r>
           <w:rPr>
@@ -1833,7 +1833,7 @@
           <w14:ligatures w14:val="standardContextual"/>
         </w:rPr>
       </w:pPr>
-      <w:hyperlink w:anchor="_Toc238462348" w:history="1">
+      <w:hyperlink w:anchor="_Toc238487566" w:history="1">
         <w:r>
           <w:rPr>
             <w:rStyle w:val="Hipervnculo"/>
@@ -1860,7 +1860,7 @@
             <w:noProof/>
             <w:webHidden/>
           </w:rPr>
-          <w:instrText xml:space="preserve"> PAGEREF _Toc238462348 \h </w:instrText>
+          <w:instrText xml:space="preserve"> PAGEREF _Toc238487566 \h </w:instrText>
         </w:r>
         <w:r>
           <w:rPr>
@@ -1911,7 +1911,7 @@
           <w14:ligatures w14:val="standardContextual"/>
         </w:rPr>
       </w:pPr>
-      <w:hyperlink w:anchor="_Toc238462349" w:history="1">
+      <w:hyperlink w:anchor="_Toc238487567" w:history="1">
         <w:r>
           <w:rPr>
             <w:rStyle w:val="Hipervnculo"/>
@@ -1938,7 +1938,7 @@
             <w:noProof/>
             <w:webHidden/>
           </w:rPr>
-          <w:instrText xml:space="preserve"> PAGEREF _Toc238462349 \h </w:instrText>
+          <w:instrText xml:space="preserve"> PAGEREF _Toc238487567 \h </w:instrText>
         </w:r>
         <w:r>
           <w:rPr>
@@ -1988,7 +1988,7 @@
           <w14:ligatures w14:val="standardContextual"/>
         </w:rPr>
       </w:pPr>
-      <w:hyperlink w:anchor="_Toc238462350" w:history="1">
+      <w:hyperlink w:anchor="_Toc238487568" w:history="1">
         <w:r>
           <w:rPr>
             <w:rStyle w:val="Hipervnculo"/>
@@ -2015,7 +2015,7 @@
             <w:noProof/>
             <w:webHidden/>
           </w:rPr>
-          <w:instrText xml:space="preserve"> PAGEREF _Toc238462350 \h </w:instrText>
+          <w:instrText xml:space="preserve"> PAGEREF _Toc238487568 \h </w:instrText>
         </w:r>
         <w:r>
           <w:rPr>
@@ -2065,7 +2065,7 @@
           <w14:ligatures w14:val="standardContextual"/>
         </w:rPr>
       </w:pPr>
-      <w:hyperlink w:anchor="_Toc238462351" w:history="1">
+      <w:hyperlink w:anchor="_Toc238487569" w:history="1">
         <w:r>
           <w:rPr>
             <w:rStyle w:val="Hipervnculo"/>
@@ -2092,7 +2092,7 @@
             <w:noProof/>
             <w:webHidden/>
           </w:rPr>
-          <w:instrText xml:space="preserve"> PAGEREF _Toc238462351 \h </w:instrText>
+          <w:instrText xml:space="preserve"> PAGEREF _Toc238487569 \h </w:instrText>
         </w:r>
         <w:r>
           <w:rPr>
@@ -2140,7 +2140,7 @@
           <w14:ligatures w14:val="standardContextual"/>
         </w:rPr>
       </w:pPr>
-      <w:hyperlink w:anchor="_Toc238462352" w:history="1">
+      <w:hyperlink w:anchor="_Toc238487570" w:history="1">
         <w:r>
           <w:rPr>
             <w:rStyle w:val="Hipervnculo"/>
@@ -2167,7 +2167,7 @@
             <w:noProof/>
             <w:webHidden/>
           </w:rPr>
-          <w:instrText xml:space="preserve"> PAGEREF _Toc238462352 \h </w:instrText>
+          <w:instrText xml:space="preserve"> PAGEREF _Toc238487570 \h </w:instrText>
         </w:r>
         <w:r>
           <w:rPr>
@@ -2215,13 +2215,13 @@
           <w14:ligatures w14:val="standardContextual"/>
         </w:rPr>
       </w:pPr>
-      <w:hyperlink w:anchor="_Toc238462353" w:history="1">
+      <w:hyperlink w:anchor="_Toc238487571" w:history="1">
         <w:r>
           <w:rPr>
             <w:rStyle w:val="Hipervnculo"/>
             <w:noProof/>
           </w:rPr>
-          <w:t>VICII — Graphics read / pixel composition</w:t>
+          <w:t>VICII — Video Matrix / graphics pipeline / pixel composition</w:t>
         </w:r>
         <w:r>
           <w:rPr>
@@ -2242,7 +2242,7 @@
             <w:noProof/>
             <w:webHidden/>
           </w:rPr>
-          <w:instrText xml:space="preserve"> PAGEREF _Toc238462353 \h </w:instrText>
+          <w:instrText xml:space="preserve"> PAGEREF _Toc238487571 \h </w:instrText>
         </w:r>
         <w:r>
           <w:rPr>
@@ -2290,7 +2290,7 @@
           <w14:ligatures w14:val="standardContextual"/>
         </w:rPr>
       </w:pPr>
-      <w:hyperlink w:anchor="_Toc238462354" w:history="1">
+      <w:hyperlink w:anchor="_Toc238487572" w:history="1">
         <w:r>
           <w:rPr>
             <w:rStyle w:val="Hipervnculo"/>
@@ -2317,7 +2317,7 @@
             <w:noProof/>
             <w:webHidden/>
           </w:rPr>
-          <w:instrText xml:space="preserve"> PAGEREF _Toc238462354 \h </w:instrText>
+          <w:instrText xml:space="preserve"> PAGEREF _Toc238487572 \h </w:instrText>
         </w:r>
         <w:r>
           <w:rPr>
@@ -2365,7 +2365,7 @@
           <w14:ligatures w14:val="standardContextual"/>
         </w:rPr>
       </w:pPr>
-      <w:hyperlink w:anchor="_Toc238462355" w:history="1">
+      <w:hyperlink w:anchor="_Toc238487573" w:history="1">
         <w:r>
           <w:rPr>
             <w:rStyle w:val="Hipervnculo"/>
@@ -2392,7 +2392,7 @@
             <w:noProof/>
             <w:webHidden/>
           </w:rPr>
-          <w:instrText xml:space="preserve"> PAGEREF _Toc238462355 \h </w:instrText>
+          <w:instrText xml:space="preserve"> PAGEREF _Toc238487573 \h </w:instrText>
         </w:r>
         <w:r>
           <w:rPr>
@@ -2440,7 +2440,7 @@
           <w14:ligatures w14:val="standardContextual"/>
         </w:rPr>
       </w:pPr>
-      <w:hyperlink w:anchor="_Toc238462356" w:history="1">
+      <w:hyperlink w:anchor="_Toc238487574" w:history="1">
         <w:r>
           <w:rPr>
             <w:rStyle w:val="Hipervnculo"/>
@@ -2467,7 +2467,7 @@
             <w:noProof/>
             <w:webHidden/>
           </w:rPr>
-          <w:instrText xml:space="preserve"> PAGEREF _Toc238462356 \h </w:instrText>
+          <w:instrText xml:space="preserve"> PAGEREF _Toc238487574 \h </w:instrText>
         </w:r>
         <w:r>
           <w:rPr>
@@ -2515,7 +2515,7 @@
           <w14:ligatures w14:val="standardContextual"/>
         </w:rPr>
       </w:pPr>
-      <w:hyperlink w:anchor="_Toc238462357" w:history="1">
+      <w:hyperlink w:anchor="_Toc238487575" w:history="1">
         <w:r>
           <w:rPr>
             <w:rStyle w:val="Hipervnculo"/>
@@ -2542,7 +2542,7 @@
             <w:noProof/>
             <w:webHidden/>
           </w:rPr>
-          <w:instrText xml:space="preserve"> PAGEREF _Toc238462357 \h </w:instrText>
+          <w:instrText xml:space="preserve"> PAGEREF _Toc238487575 \h </w:instrText>
         </w:r>
         <w:r>
           <w:rPr>
@@ -2590,7 +2590,7 @@
           <w14:ligatures w14:val="standardContextual"/>
         </w:rPr>
       </w:pPr>
-      <w:hyperlink w:anchor="_Toc238462358" w:history="1">
+      <w:hyperlink w:anchor="_Toc238487576" w:history="1">
         <w:r>
           <w:rPr>
             <w:rStyle w:val="Hipervnculo"/>
@@ -2617,7 +2617,7 @@
             <w:noProof/>
             <w:webHidden/>
           </w:rPr>
-          <w:instrText xml:space="preserve"> PAGEREF _Toc238462358 \h </w:instrText>
+          <w:instrText xml:space="preserve"> PAGEREF _Toc238487576 \h </w:instrText>
         </w:r>
         <w:r>
           <w:rPr>
@@ -2668,7 +2668,7 @@
           <w14:ligatures w14:val="standardContextual"/>
         </w:rPr>
       </w:pPr>
-      <w:hyperlink w:anchor="_Toc238462359" w:history="1">
+      <w:hyperlink w:anchor="_Toc238487577" w:history="1">
         <w:r>
           <w:rPr>
             <w:rStyle w:val="Hipervnculo"/>
@@ -2695,7 +2695,7 @@
             <w:noProof/>
             <w:webHidden/>
           </w:rPr>
-          <w:instrText xml:space="preserve"> PAGEREF _Toc238462359 \h </w:instrText>
+          <w:instrText xml:space="preserve"> PAGEREF _Toc238487577 \h </w:instrText>
         </w:r>
         <w:r>
           <w:rPr>
@@ -2715,7 +2715,7 @@
             <w:noProof/>
             <w:webHidden/>
           </w:rPr>
-          <w:t>11</w:t>
+          <w:t>12</w:t>
         </w:r>
         <w:r>
           <w:rPr>
@@ -2745,7 +2745,7 @@
           <w14:ligatures w14:val="standardContextual"/>
         </w:rPr>
       </w:pPr>
-      <w:hyperlink w:anchor="_Toc238462360" w:history="1">
+      <w:hyperlink w:anchor="_Toc238487578" w:history="1">
         <w:r>
           <w:rPr>
             <w:rStyle w:val="Hipervnculo"/>
@@ -2772,7 +2772,7 @@
             <w:noProof/>
             <w:webHidden/>
           </w:rPr>
-          <w:instrText xml:space="preserve"> PAGEREF _Toc238462360 \h </w:instrText>
+          <w:instrText xml:space="preserve"> PAGEREF _Toc238487578 \h </w:instrText>
         </w:r>
         <w:r>
           <w:rPr>
@@ -2792,7 +2792,7 @@
             <w:noProof/>
             <w:webHidden/>
           </w:rPr>
-          <w:t>11</w:t>
+          <w:t>12</w:t>
         </w:r>
         <w:r>
           <w:rPr>
@@ -2822,7 +2822,7 @@
           <w14:ligatures w14:val="standardContextual"/>
         </w:rPr>
       </w:pPr>
-      <w:hyperlink w:anchor="_Toc238462361" w:history="1">
+      <w:hyperlink w:anchor="_Toc238487579" w:history="1">
         <w:r>
           <w:rPr>
             <w:rStyle w:val="Hipervnculo"/>
@@ -2849,7 +2849,7 @@
             <w:noProof/>
             <w:webHidden/>
           </w:rPr>
-          <w:instrText xml:space="preserve"> PAGEREF _Toc238462361 \h </w:instrText>
+          <w:instrText xml:space="preserve"> PAGEREF _Toc238487579 \h </w:instrText>
         </w:r>
         <w:r>
           <w:rPr>
@@ -2869,7 +2869,7 @@
             <w:noProof/>
             <w:webHidden/>
           </w:rPr>
-          <w:t>11</w:t>
+          <w:t>12</w:t>
         </w:r>
         <w:r>
           <w:rPr>
@@ -2900,7 +2900,7 @@
           <w14:ligatures w14:val="standardContextual"/>
         </w:rPr>
       </w:pPr>
-      <w:hyperlink w:anchor="_Toc238462362" w:history="1">
+      <w:hyperlink w:anchor="_Toc238487580" w:history="1">
         <w:r>
           <w:rPr>
             <w:rStyle w:val="Hipervnculo"/>
@@ -2927,7 +2927,7 @@
             <w:noProof/>
             <w:webHidden/>
           </w:rPr>
-          <w:instrText xml:space="preserve"> PAGEREF _Toc238462362 \h </w:instrText>
+          <w:instrText xml:space="preserve"> PAGEREF _Toc238487580 \h </w:instrText>
         </w:r>
         <w:r>
           <w:rPr>
@@ -2947,7 +2947,7 @@
             <w:noProof/>
             <w:webHidden/>
           </w:rPr>
-          <w:t>12</w:t>
+          <w:t>13</w:t>
         </w:r>
         <w:r>
           <w:rPr>
@@ -2977,7 +2977,7 @@
           <w14:ligatures w14:val="standardContextual"/>
         </w:rPr>
       </w:pPr>
-      <w:hyperlink w:anchor="_Toc238462363" w:history="1">
+      <w:hyperlink w:anchor="_Toc238487581" w:history="1">
         <w:r>
           <w:rPr>
             <w:rStyle w:val="Hipervnculo"/>
@@ -3004,7 +3004,7 @@
             <w:noProof/>
             <w:webHidden/>
           </w:rPr>
-          <w:instrText xml:space="preserve"> PAGEREF _Toc238462363 \h </w:instrText>
+          <w:instrText xml:space="preserve"> PAGEREF _Toc238487581 \h </w:instrText>
         </w:r>
         <w:r>
           <w:rPr>
@@ -3024,7 +3024,7 @@
             <w:noProof/>
             <w:webHidden/>
           </w:rPr>
-          <w:t>12</w:t>
+          <w:t>13</w:t>
         </w:r>
         <w:r>
           <w:rPr>
@@ -3054,7 +3054,7 @@
           <w14:ligatures w14:val="standardContextual"/>
         </w:rPr>
       </w:pPr>
-      <w:hyperlink w:anchor="_Toc238462364" w:history="1">
+      <w:hyperlink w:anchor="_Toc238487582" w:history="1">
         <w:r>
           <w:rPr>
             <w:rStyle w:val="Hipervnculo"/>
@@ -3081,7 +3081,7 @@
             <w:noProof/>
             <w:webHidden/>
           </w:rPr>
-          <w:instrText xml:space="preserve"> PAGEREF _Toc238462364 \h </w:instrText>
+          <w:instrText xml:space="preserve"> PAGEREF _Toc238487582 \h </w:instrText>
         </w:r>
         <w:r>
           <w:rPr>
@@ -3101,7 +3101,7 @@
             <w:noProof/>
             <w:webHidden/>
           </w:rPr>
-          <w:t>12</w:t>
+          <w:t>13</w:t>
         </w:r>
         <w:r>
           <w:rPr>
@@ -3132,7 +3132,7 @@
           <w14:ligatures w14:val="standardContextual"/>
         </w:rPr>
       </w:pPr>
-      <w:hyperlink w:anchor="_Toc238462365" w:history="1">
+      <w:hyperlink w:anchor="_Toc238487583" w:history="1">
         <w:r>
           <w:rPr>
             <w:rStyle w:val="Hipervnculo"/>
@@ -3159,7 +3159,7 @@
             <w:noProof/>
             <w:webHidden/>
           </w:rPr>
-          <w:instrText xml:space="preserve"> PAGEREF _Toc238462365 \h </w:instrText>
+          <w:instrText xml:space="preserve"> PAGEREF _Toc238487583 \h </w:instrText>
         </w:r>
         <w:r>
           <w:rPr>
@@ -3179,7 +3179,7 @@
             <w:noProof/>
             <w:webHidden/>
           </w:rPr>
-          <w:t>13</w:t>
+          <w:t>14</w:t>
         </w:r>
         <w:r>
           <w:rPr>
@@ -3209,7 +3209,7 @@
           <w14:ligatures w14:val="standardContextual"/>
         </w:rPr>
       </w:pPr>
-      <w:hyperlink w:anchor="_Toc238462366" w:history="1">
+      <w:hyperlink w:anchor="_Toc238487584" w:history="1">
         <w:r>
           <w:rPr>
             <w:rStyle w:val="Hipervnculo"/>
@@ -3236,7 +3236,7 @@
             <w:noProof/>
             <w:webHidden/>
           </w:rPr>
-          <w:instrText xml:space="preserve"> PAGEREF _Toc238462366 \h </w:instrText>
+          <w:instrText xml:space="preserve"> PAGEREF _Toc238487584 \h </w:instrText>
         </w:r>
         <w:r>
           <w:rPr>
@@ -3256,7 +3256,7 @@
             <w:noProof/>
             <w:webHidden/>
           </w:rPr>
-          <w:t>13</w:t>
+          <w:t>14</w:t>
         </w:r>
         <w:r>
           <w:rPr>
@@ -3286,7 +3286,7 @@
           <w14:ligatures w14:val="standardContextual"/>
         </w:rPr>
       </w:pPr>
-      <w:hyperlink w:anchor="_Toc238462367" w:history="1">
+      <w:hyperlink w:anchor="_Toc238487585" w:history="1">
         <w:r>
           <w:rPr>
             <w:rStyle w:val="Hipervnculo"/>
@@ -3313,7 +3313,7 @@
             <w:noProof/>
             <w:webHidden/>
           </w:rPr>
-          <w:instrText xml:space="preserve"> PAGEREF _Toc238462367 \h </w:instrText>
+          <w:instrText xml:space="preserve"> PAGEREF _Toc238487585 \h </w:instrText>
         </w:r>
         <w:r>
           <w:rPr>
@@ -3333,7 +3333,7 @@
             <w:noProof/>
             <w:webHidden/>
           </w:rPr>
-          <w:t>14</w:t>
+          <w:t>15</w:t>
         </w:r>
         <w:r>
           <w:rPr>
@@ -3363,7 +3363,7 @@
           <w14:ligatures w14:val="standardContextual"/>
         </w:rPr>
       </w:pPr>
-      <w:hyperlink w:anchor="_Toc238462368" w:history="1">
+      <w:hyperlink w:anchor="_Toc238487586" w:history="1">
         <w:r>
           <w:rPr>
             <w:rStyle w:val="Hipervnculo"/>
@@ -3390,7 +3390,7 @@
             <w:noProof/>
             <w:webHidden/>
           </w:rPr>
-          <w:instrText xml:space="preserve"> PAGEREF _Toc238462368 \h </w:instrText>
+          <w:instrText xml:space="preserve"> PAGEREF _Toc238487586 \h </w:instrText>
         </w:r>
         <w:r>
           <w:rPr>
@@ -3410,7 +3410,7 @@
             <w:noProof/>
             <w:webHidden/>
           </w:rPr>
-          <w:t>14</w:t>
+          <w:t>15</w:t>
         </w:r>
         <w:r>
           <w:rPr>
@@ -3440,7 +3440,7 @@
           <w14:ligatures w14:val="standardContextual"/>
         </w:rPr>
       </w:pPr>
-      <w:hyperlink w:anchor="_Toc238462369" w:history="1">
+      <w:hyperlink w:anchor="_Toc238487587" w:history="1">
         <w:r>
           <w:rPr>
             <w:rStyle w:val="Hipervnculo"/>
@@ -3467,7 +3467,7 @@
             <w:noProof/>
             <w:webHidden/>
           </w:rPr>
-          <w:instrText xml:space="preserve"> PAGEREF _Toc238462369 \h </w:instrText>
+          <w:instrText xml:space="preserve"> PAGEREF _Toc238487587 \h </w:instrText>
         </w:r>
         <w:r>
           <w:rPr>
@@ -3487,7 +3487,7 @@
             <w:noProof/>
             <w:webHidden/>
           </w:rPr>
-          <w:t>14</w:t>
+          <w:t>15</w:t>
         </w:r>
         <w:r>
           <w:rPr>
@@ -3517,7 +3517,7 @@
           <w14:ligatures w14:val="standardContextual"/>
         </w:rPr>
       </w:pPr>
-      <w:hyperlink w:anchor="_Toc238462370" w:history="1">
+      <w:hyperlink w:anchor="_Toc238487588" w:history="1">
         <w:r>
           <w:rPr>
             <w:rStyle w:val="Hipervnculo"/>
@@ -3544,7 +3544,7 @@
             <w:noProof/>
             <w:webHidden/>
           </w:rPr>
-          <w:instrText xml:space="preserve"> PAGEREF _Toc238462370 \h </w:instrText>
+          <w:instrText xml:space="preserve"> PAGEREF _Toc238487588 \h </w:instrText>
         </w:r>
         <w:r>
           <w:rPr>
@@ -3564,7 +3564,7 @@
             <w:noProof/>
             <w:webHidden/>
           </w:rPr>
-          <w:t>15</w:t>
+          <w:t>16</w:t>
         </w:r>
         <w:r>
           <w:rPr>
@@ -3589,7 +3589,7 @@
       <w:pPr>
         <w:pStyle w:val="Ttulo"/>
       </w:pPr>
-      <w:bookmarkStart w:id="1" w:name="_Toc238462333"/>
+      <w:bookmarkStart w:id="1" w:name="_Toc238487551"/>
       <w:r>
         <w:lastRenderedPageBreak/>
         <w:t>Foreword</w:t>
@@ -3605,7 +3605,7 @@
       <w:pPr>
         <w:pStyle w:val="Ttulo"/>
       </w:pPr>
-      <w:bookmarkStart w:id="2" w:name="_Toc238462334"/>
+      <w:bookmarkStart w:id="2" w:name="_Toc238487552"/>
       <w:r>
         <w:lastRenderedPageBreak/>
         <w:t>1. Purpose, scope, and models</w:t>
@@ -3622,7 +3622,7 @@
         <w:pStyle w:val="Ttulo1"/>
         <w:spacing w:before="280"/>
       </w:pPr>
-      <w:bookmarkStart w:id="3" w:name="_Toc238462335"/>
+      <w:bookmarkStart w:id="3" w:name="_Toc238487553"/>
       <w:r>
         <w:t>1.1 Scope of this guide</w:t>
       </w:r>
@@ -3647,7 +3647,7 @@
       <w:pPr>
         <w:pStyle w:val="Ttulo"/>
       </w:pPr>
-      <w:bookmarkStart w:id="4" w:name="_Toc238462336"/>
+      <w:bookmarkStart w:id="4" w:name="_Toc238487554"/>
       <w:r>
         <w:lastRenderedPageBreak/>
         <w:t>2. Activation and producer selection</w:t>
@@ -3659,7 +3659,7 @@
         <w:pStyle w:val="Ttulo1"/>
         <w:spacing w:before="280"/>
       </w:pPr>
-      <w:bookmarkStart w:id="5" w:name="_Toc238462337"/>
+      <w:bookmarkStart w:id="5" w:name="_Toc238487555"/>
       <w:r>
         <w:t>2.1 Console command</w:t>
       </w:r>
@@ -4117,7 +4117,7 @@
         <w:pStyle w:val="Ttulo1"/>
         <w:spacing w:before="280"/>
       </w:pPr>
-      <w:bookmarkStart w:id="6" w:name="_Toc238462338"/>
+      <w:bookmarkStart w:id="6" w:name="_Toc238487556"/>
       <w:r>
         <w:t>2.2 Conditions and special paths</w:t>
       </w:r>
@@ -4175,7 +4175,7 @@
       <w:pPr>
         <w:pStyle w:val="Ttulo"/>
       </w:pPr>
-      <w:bookmarkStart w:id="7" w:name="_Toc238462339"/>
+      <w:bookmarkStart w:id="7" w:name="_Toc238487557"/>
       <w:r>
         <w:lastRenderedPageBreak/>
         <w:t>3. Common file structure</w:t>
@@ -4187,7 +4187,7 @@
         <w:pStyle w:val="Ttulo1"/>
         <w:spacing w:before="280"/>
       </w:pPr>
-      <w:bookmarkStart w:id="8" w:name="_Toc238462340"/>
+      <w:bookmarkStart w:id="8" w:name="_Toc238487558"/>
       <w:r>
         <w:t>3.1 Physical hierarchy</w:t>
       </w:r>
@@ -4508,7 +4508,7 @@
         <w:pStyle w:val="Ttulo1"/>
         <w:spacing w:before="280"/>
       </w:pPr>
-      <w:bookmarkStart w:id="9" w:name="_Toc238462341"/>
+      <w:bookmarkStart w:id="9" w:name="_Toc238487559"/>
       <w:r>
         <w:t>3.2 Timing rules</w:t>
       </w:r>
@@ -4590,7 +4590,7 @@
       <w:pPr>
         <w:pStyle w:val="Ttulo"/>
       </w:pPr>
-      <w:bookmarkStart w:id="10" w:name="_Toc238462342"/>
+      <w:bookmarkStart w:id="10" w:name="_Toc238487560"/>
       <w:r>
         <w:lastRenderedPageBreak/>
         <w:t>4. Common framework records</w:t>
@@ -4602,7 +4602,7 @@
         <w:pStyle w:val="Ttulo1"/>
         <w:spacing w:before="280"/>
       </w:pPr>
-      <w:bookmarkStart w:id="11" w:name="_Toc238462343"/>
+      <w:bookmarkStart w:id="11" w:name="_Toc238487561"/>
       <w:r>
         <w:t>CPU — Info Cycle</w:t>
       </w:r>
@@ -4668,7 +4668,7 @@
         <w:pStyle w:val="Ttulo1"/>
         <w:spacing w:before="280"/>
       </w:pPr>
-      <w:bookmarkStart w:id="12" w:name="_Toc238462344"/>
+      <w:bookmarkStart w:id="12" w:name="_Toc238487562"/>
       <w:r>
         <w:t>CPU — Transaction about to execute</w:t>
       </w:r>
@@ -4734,7 +4734,7 @@
         <w:pStyle w:val="Ttulo1"/>
         <w:spacing w:before="280"/>
       </w:pPr>
-      <w:bookmarkStart w:id="13" w:name="_Toc238462345"/>
+      <w:bookmarkStart w:id="13" w:name="_Toc238487563"/>
       <w:r>
         <w:t>CPU — Executed instruction</w:t>
       </w:r>
@@ -4800,7 +4800,7 @@
         <w:pStyle w:val="Ttulo1"/>
         <w:spacing w:before="280"/>
       </w:pPr>
-      <w:bookmarkStart w:id="14" w:name="_Toc238462346"/>
+      <w:bookmarkStart w:id="14" w:name="_Toc238487564"/>
       <w:r>
         <w:t>CPU — Stop</w:t>
       </w:r>
@@ -4867,7 +4867,7 @@
         <w:pStyle w:val="Ttulo1"/>
         <w:spacing w:before="280"/>
       </w:pPr>
-      <w:bookmarkStart w:id="15" w:name="_Toc238462347"/>
+      <w:bookmarkStart w:id="15" w:name="_Toc238487565"/>
       <w:r>
         <w:t>CPU — Interrupts</w:t>
       </w:r>
@@ -4933,7 +4933,7 @@
         <w:pStyle w:val="Ttulo1"/>
         <w:spacing w:before="280"/>
       </w:pPr>
-      <w:bookmarkStart w:id="16" w:name="_Toc238462348"/>
+      <w:bookmarkStart w:id="16" w:name="_Toc238487566"/>
       <w:r>
         <w:t>Memory — Applied Set</w:t>
       </w:r>
@@ -4998,7 +4998,7 @@
       <w:pPr>
         <w:pStyle w:val="Ttulo"/>
       </w:pPr>
-      <w:bookmarkStart w:id="17" w:name="_Toc238462349"/>
+      <w:bookmarkStart w:id="17" w:name="_Toc238487567"/>
       <w:r>
         <w:lastRenderedPageBreak/>
         <w:t>5. Machine-specific components</w:t>
@@ -5010,7 +5010,7 @@
         <w:pStyle w:val="Ttulo1"/>
         <w:spacing w:before="280"/>
       </w:pPr>
-      <w:bookmarkStart w:id="18" w:name="_Toc238462350"/>
+      <w:bookmarkStart w:id="18" w:name="_Toc238487568"/>
       <w:r>
         <w:t>5.1 Selectable inventory</w:t>
       </w:r>
@@ -5617,7 +5617,7 @@
         <w:pStyle w:val="Ttulo1"/>
         <w:spacing w:before="280"/>
       </w:pPr>
-      <w:bookmarkStart w:id="19" w:name="_Toc238462351"/>
+      <w:bookmarkStart w:id="19" w:name="_Toc238487569"/>
       <w:r>
         <w:t>5.2 Record catalog</w:t>
       </w:r>
@@ -5627,7 +5627,7 @@
       <w:pPr>
         <w:pStyle w:val="Ttulo2"/>
       </w:pPr>
-      <w:bookmarkStart w:id="20" w:name="_Toc238462352"/>
+      <w:bookmarkStart w:id="20" w:name="_Toc238487570"/>
       <w:r>
         <w:t>VICII — Info Cycle</w:t>
       </w:r>
@@ -5674,16 +5674,16 @@
         <w:t>Events:</w:t>
       </w:r>
       <w:r>
-        <w:t xml:space="preserve"> Bad line situation and memory-access events precede an optional CPU-phase register-write record; sprite-composition and pixel-drawing events follow it within the same absolute cycle.</w:t>
+        <w:t xml:space="preserve"> In shared graphics cycles the g-access event precedes the c-access event; an optional CPU-phase register-write record follows all VIC-II bus activity. Sprite composition and pixel drawing occur later in the same absolute cycle.</w:t>
       </w:r>
     </w:p>
     <w:p>
       <w:pPr>
         <w:pStyle w:val="Ttulo2"/>
       </w:pPr>
-      <w:bookmarkStart w:id="21" w:name="_Toc238462353"/>
-      <w:r>
-        <w:t>VICII — Graphics read / pixel composition</w:t>
+      <w:bookmarkStart w:id="21" w:name="_Toc238487571"/>
+      <w:r>
+        <w:t>VICII — Video Matrix / graphics pipeline / pixel composition</w:t>
       </w:r>
       <w:bookmarkEnd w:id="21"/>
     </w:p>
@@ -5695,7 +5695,7 @@
         <w:t>Producer:</w:t>
       </w:r>
       <w:r>
-        <w:t xml:space="preserve"> src/COMMODORE/VICII/VICII.cpp :: debugReadingGraphics and debugDrawPixelAt</w:t>
+        <w:t xml:space="preserve"> src/COMMODORE/VICII/VICII.cpp :: debugReadingVideoMatrix, debugReadingGraphics and debugDrawPixelAt</w:t>
       </w:r>
     </w:p>
     <w:p>
@@ -5706,7 +5706,7 @@
         <w:t>Fields:</w:t>
       </w:r>
       <w:r>
-        <w:t xml:space="preserve"> Reading Graphics: Data, GAccessIndex, VLMI, VC, RC, and Idle. Drawing pixels: Raster, XScroll, GraphicPixel, FirstByte, and LastByte; FirstByte/LastByte are OUT when the complete slice lies beyond the 320-pixel graphics buffer.</w:t>
+        <w:t xml:space="preserve"> Reading Video Matrix &amp; Color RAM: Screen, Color, VLMI, VC, and Invalid. Reading Graphics: Data, GAccessIndex, VLMI, VC, RC, and Idle. Drawing pixels: Raster, XScroll, GraphicPixel, FirstByte, and LastByte; FirstByte/LastByte are OUT when the complete slice lies beyond the 320-pixel graphics buffer.</w:t>
       </w:r>
     </w:p>
     <w:p>
@@ -5717,7 +5717,7 @@
         <w:t>Timing:</w:t>
       </w:r>
       <w:r>
-        <w:t xml:space="preserve"> Reading Graphics is appended after the current g-access has completed and before VC, VLMI, and GAccessIndex advance, so its counters are the values actually used by that access. Drawing pixels is appended during final slice composition after the current CPU-phase VIC-II register write has become visible.</w:t>
+        <w:t xml:space="preserve"> c-access runs in phi2 of cycles 15..54 and prepares the matrix/color entry for the following g-access. g-access runs in phi1 of cycles 16..55, is logged before VC/VLMI/GAccessIndex advance, and therefore precedes c-access when both occur in one recovered CPU cycle. Drawing pixels is appended during final slice composition after the current CPU-phase VIC-II register write has become visible.</w:t>
       </w:r>
     </w:p>
     <w:p>
@@ -5728,16 +5728,19 @@
         <w:t>Events:</w:t>
       </w:r>
       <w:r>
-        <w:t xml:space="preserve"> The graphics-read record correlates the fetched byte with its logical matrix position and emulator-side output slot. The pixel record maps the current eight-pixel raster slice to the inclusive source-byte interval selected after applying XSCROLL and clipping to graphics pixels 0..319.</w:t>
+        <w:t xml:space="preserve"> Cycle 15 contains only the first c-access; cycles 16..54 log g-access and then c-access; cycle 55 contains only the final g-access. Invalid=1 identifies a DMA-delay/FLI c-access that supplied fallback bus </w:t>
+      </w:r>
+      <w:r>
+        <w:lastRenderedPageBreak/>
+        <w:t>data. The pixel record maps the eight-pixel raster slice to the inclusive source-byte interval selected after XSCROLL and clipping to graphics pixels 0..319.</w:t>
       </w:r>
     </w:p>
     <w:p>
       <w:pPr>
         <w:pStyle w:val="Ttulo2"/>
       </w:pPr>
-      <w:bookmarkStart w:id="22" w:name="_Toc238462354"/>
-      <w:r>
-        <w:lastRenderedPageBreak/>
+      <w:bookmarkStart w:id="22" w:name="_Toc238487572"/>
+      <w:r>
         <w:t>VICII — CPU transaction prediction</w:t>
       </w:r>
       <w:bookmarkEnd w:id="22"/>
@@ -5790,7 +5793,7 @@
       <w:pPr>
         <w:pStyle w:val="Ttulo2"/>
       </w:pPr>
-      <w:bookmarkStart w:id="23" w:name="_Toc238462355"/>
+      <w:bookmarkStart w:id="23" w:name="_Toc238487573"/>
       <w:r>
         <w:t>VICII — CPU stop applied / VIC-II register write</w:t>
       </w:r>
@@ -5826,7 +5829,7 @@
         <w:t>Timing:</w:t>
       </w:r>
       <w:r>
-        <w:t xml:space="preserve"> The register-write event is emitted during the CPU phase of the reported absolute cycle, after VIC-II bus activity and before final pixel/IRQ processing.</w:t>
+        <w:t xml:space="preserve"> The register-write event is emitted during the CPU phase of the reported absolute cycle, after the VIC-II phi1 access and any stolen phi2 c-access, and before final pixel/IRQ processing.</w:t>
       </w:r>
     </w:p>
     <w:p>
@@ -5837,14 +5840,14 @@
         <w:t>Events:</w:t>
       </w:r>
       <w:r>
-        <w:t xml:space="preserve"> Its position after memory-access events in the same Info Cycle represents VIC phi1 followed by CPU phi2.</w:t>
+        <w:t xml:space="preserve"> Its position after all memory-access events in the same Info Cycle makes the effective phase order explicit.</w:t>
       </w:r>
     </w:p>
     <w:p>
       <w:pPr>
         <w:pStyle w:val="Ttulo2"/>
       </w:pPr>
-      <w:bookmarkStart w:id="24" w:name="_Toc238462356"/>
+      <w:bookmarkStart w:id="24" w:name="_Toc238487574"/>
       <w:r>
         <w:t>CIA1/CIA2 — Info Cycle</w:t>
       </w:r>
@@ -5898,7 +5901,7 @@
       <w:pPr>
         <w:pStyle w:val="Ttulo2"/>
       </w:pPr>
-      <w:bookmarkStart w:id="25" w:name="_Toc238462357"/>
+      <w:bookmarkStart w:id="25" w:name="_Toc238487575"/>
       <w:r>
         <w:t>SID — Info Cycle</w:t>
       </w:r>
@@ -5952,7 +5955,7 @@
       <w:pPr>
         <w:pStyle w:val="Ttulo2"/>
       </w:pPr>
-      <w:bookmarkStart w:id="26" w:name="_Toc238462358"/>
+      <w:bookmarkStart w:id="26" w:name="_Toc238487576"/>
       <w:r>
         <w:t>PLA / C64 Memory</w:t>
       </w:r>
@@ -5996,6 +5999,7 @@
         <w:rPr>
           <w:b/>
         </w:rPr>
+        <w:lastRenderedPageBreak/>
         <w:t>Events:</w:t>
       </w:r>
       <w:r>
@@ -6006,7 +6010,7 @@
       <w:pPr>
         <w:pStyle w:val="Ttulo"/>
       </w:pPr>
-      <w:bookmarkStart w:id="27" w:name="_Toc238462359"/>
+      <w:bookmarkStart w:id="27" w:name="_Toc238487577"/>
       <w:r>
         <w:lastRenderedPageBreak/>
         <w:t>6. Interpretation method</w:t>
@@ -6018,7 +6022,7 @@
         <w:pStyle w:val="Ttulo1"/>
         <w:spacing w:before="280"/>
       </w:pPr>
-      <w:bookmarkStart w:id="28" w:name="_Toc238462360"/>
+      <w:bookmarkStart w:id="28" w:name="_Toc238487578"/>
       <w:r>
         <w:t>6.1 Recommended procedure</w:t>
       </w:r>
@@ -6101,7 +6105,7 @@
         <w:pStyle w:val="Ttulo1"/>
         <w:spacing w:before="280"/>
       </w:pPr>
-      <w:bookmarkStart w:id="29" w:name="_Toc238462361"/>
+      <w:bookmarkStart w:id="29" w:name="_Toc238487579"/>
       <w:r>
         <w:t>6.2 Annotated example</w:t>
       </w:r>
@@ -6225,7 +6229,7 @@
       <w:pPr>
         <w:pStyle w:val="Ttulo"/>
       </w:pPr>
-      <w:bookmarkStart w:id="30" w:name="_Toc238462362"/>
+      <w:bookmarkStart w:id="30" w:name="_Toc238487580"/>
       <w:r>
         <w:lastRenderedPageBreak/>
         <w:t>7. Limitations and maintenance</w:t>
@@ -6237,7 +6241,7 @@
         <w:pStyle w:val="Ttulo1"/>
         <w:spacing w:before="280"/>
       </w:pPr>
-      <w:bookmarkStart w:id="31" w:name="_Toc238462363"/>
+      <w:bookmarkStart w:id="31" w:name="_Toc238487581"/>
       <w:r>
         <w:t>7.1 Specific limitations</w:t>
       </w:r>
@@ -6296,7 +6300,7 @@
         <w:pStyle w:val="Ttulo1"/>
         <w:spacing w:before="280"/>
       </w:pPr>
-      <w:bookmarkStart w:id="32" w:name="_Toc238462364"/>
+      <w:bookmarkStart w:id="32" w:name="_Toc238487582"/>
       <w:r>
         <w:t>7.2 Maintenance contract</w:t>
       </w:r>
@@ -6354,7 +6358,7 @@
       <w:pPr>
         <w:pStyle w:val="Ttulo"/>
       </w:pPr>
-      <w:bookmarkStart w:id="33" w:name="_Toc238462365"/>
+      <w:bookmarkStart w:id="33" w:name="_Toc238487583"/>
       <w:r>
         <w:lastRenderedPageBreak/>
         <w:t>Appendices</w:t>
@@ -6365,7 +6369,7 @@
       <w:pPr>
         <w:pStyle w:val="Ttulo1"/>
       </w:pPr>
-      <w:bookmarkStart w:id="34" w:name="_Toc238462366"/>
+      <w:bookmarkStart w:id="34" w:name="_Toc238487584"/>
       <w:r>
         <w:t>Appendix A. Provenance and revision</w:t>
       </w:r>
@@ -6387,7 +6391,7 @@
         <w:pStyle w:val="Ttulo1"/>
         <w:spacing w:before="280"/>
       </w:pPr>
-      <w:bookmarkStart w:id="35" w:name="_Toc238462367"/>
+      <w:bookmarkStart w:id="35" w:name="_Toc238487585"/>
       <w:r>
         <w:t>A.1 Watched source files</w:t>
       </w:r>
@@ -7346,7 +7350,7 @@
         <w:pStyle w:val="Ttulo1"/>
         <w:spacing w:before="280"/>
       </w:pPr>
-      <w:bookmarkStart w:id="36" w:name="_Toc238462368"/>
+      <w:bookmarkStart w:id="36" w:name="_Toc238487586"/>
       <w:r>
         <w:t>A.2 Revision history</w:t>
       </w:r>
@@ -7517,7 +7521,7 @@
       <w:pPr>
         <w:pStyle w:val="Ttulo1"/>
       </w:pPr>
-      <w:bookmarkStart w:id="37" w:name="_Toc238462369"/>
+      <w:bookmarkStart w:id="37" w:name="_Toc238487587"/>
       <w:r>
         <w:t>Illustrations</w:t>
       </w:r>
@@ -7557,7 +7561,7 @@
       <w:pPr>
         <w:pStyle w:val="Ttulo1"/>
       </w:pPr>
-      <w:bookmarkStart w:id="38" w:name="_Toc238462370"/>
+      <w:bookmarkStart w:id="38" w:name="_Toc238487588"/>
       <w:r>
         <w:lastRenderedPageBreak/>
         <w:t>Equations</w:t>
@@ -7663,7 +7667,7 @@
         <w:noProof/>
       </w:rPr>
       <w:drawing>
-        <wp:inline distT="0" distB="0" distL="0" distR="0" wp14:anchorId="4A33D1AE" wp14:editId="40FFDFBF">
+        <wp:inline distT="0" distB="0" distL="0" distR="0" wp14:anchorId="603CBEB5" wp14:editId="156CFC99">
           <wp:extent cx="576000" cy="459360"/>
           <wp:effectExtent l="0" t="0" r="0" b="0"/>
           <wp:docPr id="1" name="ARGOS framework mark" descr="ARGOS framework mark"/>
@@ -8073,10 +8077,10 @@
         <w:noProof/>
       </w:rPr>
       <w:drawing>
-        <wp:inline distT="0" distB="0" distL="0" distR="0" wp14:anchorId="33376C91" wp14:editId="704CC9C5">
+        <wp:inline distT="0" distB="0" distL="0" distR="0" wp14:anchorId="11234111" wp14:editId="1083E798">
           <wp:extent cx="1512000" cy="1205820"/>
           <wp:effectExtent l="0" t="0" r="0" b="0"/>
-          <wp:docPr id="1056899792" name="ARGOS framework mark" descr="ARGOS framework mark"/>
+          <wp:docPr id="320708355" name="ARGOS framework mark" descr="ARGOS framework mark"/>
           <wp:cNvGraphicFramePr>
             <a:graphicFrameLocks xmlns:a="http://schemas.openxmlformats.org/drawingml/2006/main" noChangeAspect="1"/>
           </wp:cNvGraphicFramePr>
@@ -11049,19 +11053,19 @@
   <w:num w:numId="26" w16cid:durableId="846600881">
     <w:abstractNumId w:val="20"/>
   </w:num>
-  <w:num w:numId="27" w16cid:durableId="162595743">
+  <w:num w:numId="27" w16cid:durableId="361328675">
     <w:abstractNumId w:val="0"/>
   </w:num>
-  <w:num w:numId="28" w16cid:durableId="43066896">
+  <w:num w:numId="28" w16cid:durableId="1890989841">
     <w:abstractNumId w:val="0"/>
   </w:num>
-  <w:num w:numId="29" w16cid:durableId="988825851">
+  <w:num w:numId="29" w16cid:durableId="1313800851">
     <w:abstractNumId w:val="6"/>
   </w:num>
-  <w:num w:numId="30" w16cid:durableId="1684434530">
+  <w:num w:numId="30" w16cid:durableId="1524904738">
     <w:abstractNumId w:val="0"/>
   </w:num>
-  <w:num w:numId="31" w16cid:durableId="15273098">
+  <w:num w:numId="31" w16cid:durableId="1563785624">
     <w:abstractNumId w:val="0"/>
   </w:num>
 </w:numbering>

</xml_diff>

<commit_message>
VICII minor improvement. Now 10000 members demo works, but others don't still...Pending Nameless, Letsscrollit and Taboo.
</commit_message>
<xml_diff>
--- a/docs/C64Data/C64_DEBUG_File_Format.docx
+++ b/docs/C64Data/C64_DEBUG_File_Format.docx
@@ -561,7 +561,7 @@
       <w:pPr>
         <w:pStyle w:val="Ttulo1"/>
       </w:pPr>
-      <w:bookmarkStart w:id="0" w:name="_Toc238487550"/>
+      <w:bookmarkStart w:id="0" w:name="_Toc238547134"/>
       <w:r>
         <w:lastRenderedPageBreak/>
         <w:t>Contents</w:t>
@@ -596,7 +596,7 @@
       <w:r>
         <w:fldChar w:fldCharType="separate"/>
       </w:r>
-      <w:hyperlink w:anchor="_Toc238487550" w:history="1">
+      <w:hyperlink w:anchor="_Toc238547134" w:history="1">
         <w:r>
           <w:rPr>
             <w:rStyle w:val="Hipervnculo"/>
@@ -623,7 +623,7 @@
             <w:noProof/>
             <w:webHidden/>
           </w:rPr>
-          <w:instrText xml:space="preserve"> PAGEREF _Toc238487550 \h </w:instrText>
+          <w:instrText xml:space="preserve"> PAGEREF _Toc238547134 \h </w:instrText>
         </w:r>
         <w:r>
           <w:rPr>
@@ -674,7 +674,7 @@
           <w14:ligatures w14:val="standardContextual"/>
         </w:rPr>
       </w:pPr>
-      <w:hyperlink w:anchor="_Toc238487551" w:history="1">
+      <w:hyperlink w:anchor="_Toc238547135" w:history="1">
         <w:r>
           <w:rPr>
             <w:rStyle w:val="Hipervnculo"/>
@@ -701,7 +701,7 @@
             <w:noProof/>
             <w:webHidden/>
           </w:rPr>
-          <w:instrText xml:space="preserve"> PAGEREF _Toc238487551 \h </w:instrText>
+          <w:instrText xml:space="preserve"> PAGEREF _Toc238547135 \h </w:instrText>
         </w:r>
         <w:r>
           <w:rPr>
@@ -752,7 +752,7 @@
           <w14:ligatures w14:val="standardContextual"/>
         </w:rPr>
       </w:pPr>
-      <w:hyperlink w:anchor="_Toc238487552" w:history="1">
+      <w:hyperlink w:anchor="_Toc238547136" w:history="1">
         <w:r>
           <w:rPr>
             <w:rStyle w:val="Hipervnculo"/>
@@ -779,7 +779,7 @@
             <w:noProof/>
             <w:webHidden/>
           </w:rPr>
-          <w:instrText xml:space="preserve"> PAGEREF _Toc238487552 \h </w:instrText>
+          <w:instrText xml:space="preserve"> PAGEREF _Toc238547136 \h </w:instrText>
         </w:r>
         <w:r>
           <w:rPr>
@@ -829,7 +829,7 @@
           <w14:ligatures w14:val="standardContextual"/>
         </w:rPr>
       </w:pPr>
-      <w:hyperlink w:anchor="_Toc238487553" w:history="1">
+      <w:hyperlink w:anchor="_Toc238547137" w:history="1">
         <w:r>
           <w:rPr>
             <w:rStyle w:val="Hipervnculo"/>
@@ -856,7 +856,7 @@
             <w:noProof/>
             <w:webHidden/>
           </w:rPr>
-          <w:instrText xml:space="preserve"> PAGEREF _Toc238487553 \h </w:instrText>
+          <w:instrText xml:space="preserve"> PAGEREF _Toc238547137 \h </w:instrText>
         </w:r>
         <w:r>
           <w:rPr>
@@ -907,7 +907,7 @@
           <w14:ligatures w14:val="standardContextual"/>
         </w:rPr>
       </w:pPr>
-      <w:hyperlink w:anchor="_Toc238487554" w:history="1">
+      <w:hyperlink w:anchor="_Toc238547138" w:history="1">
         <w:r>
           <w:rPr>
             <w:rStyle w:val="Hipervnculo"/>
@@ -934,7 +934,7 @@
             <w:noProof/>
             <w:webHidden/>
           </w:rPr>
-          <w:instrText xml:space="preserve"> PAGEREF _Toc238487554 \h </w:instrText>
+          <w:instrText xml:space="preserve"> PAGEREF _Toc238547138 \h </w:instrText>
         </w:r>
         <w:r>
           <w:rPr>
@@ -984,7 +984,7 @@
           <w14:ligatures w14:val="standardContextual"/>
         </w:rPr>
       </w:pPr>
-      <w:hyperlink w:anchor="_Toc238487555" w:history="1">
+      <w:hyperlink w:anchor="_Toc238547139" w:history="1">
         <w:r>
           <w:rPr>
             <w:rStyle w:val="Hipervnculo"/>
@@ -1011,7 +1011,7 @@
             <w:noProof/>
             <w:webHidden/>
           </w:rPr>
-          <w:instrText xml:space="preserve"> PAGEREF _Toc238487555 \h </w:instrText>
+          <w:instrText xml:space="preserve"> PAGEREF _Toc238547139 \h </w:instrText>
         </w:r>
         <w:r>
           <w:rPr>
@@ -1061,7 +1061,7 @@
           <w14:ligatures w14:val="standardContextual"/>
         </w:rPr>
       </w:pPr>
-      <w:hyperlink w:anchor="_Toc238487556" w:history="1">
+      <w:hyperlink w:anchor="_Toc238547140" w:history="1">
         <w:r>
           <w:rPr>
             <w:rStyle w:val="Hipervnculo"/>
@@ -1088,7 +1088,7 @@
             <w:noProof/>
             <w:webHidden/>
           </w:rPr>
-          <w:instrText xml:space="preserve"> PAGEREF _Toc238487556 \h </w:instrText>
+          <w:instrText xml:space="preserve"> PAGEREF _Toc238547140 \h </w:instrText>
         </w:r>
         <w:r>
           <w:rPr>
@@ -1139,7 +1139,7 @@
           <w14:ligatures w14:val="standardContextual"/>
         </w:rPr>
       </w:pPr>
-      <w:hyperlink w:anchor="_Toc238487557" w:history="1">
+      <w:hyperlink w:anchor="_Toc238547141" w:history="1">
         <w:r>
           <w:rPr>
             <w:rStyle w:val="Hipervnculo"/>
@@ -1166,7 +1166,7 @@
             <w:noProof/>
             <w:webHidden/>
           </w:rPr>
-          <w:instrText xml:space="preserve"> PAGEREF _Toc238487557 \h </w:instrText>
+          <w:instrText xml:space="preserve"> PAGEREF _Toc238547141 \h </w:instrText>
         </w:r>
         <w:r>
           <w:rPr>
@@ -1216,7 +1216,7 @@
           <w14:ligatures w14:val="standardContextual"/>
         </w:rPr>
       </w:pPr>
-      <w:hyperlink w:anchor="_Toc238487558" w:history="1">
+      <w:hyperlink w:anchor="_Toc238547142" w:history="1">
         <w:r>
           <w:rPr>
             <w:rStyle w:val="Hipervnculo"/>
@@ -1243,7 +1243,7 @@
             <w:noProof/>
             <w:webHidden/>
           </w:rPr>
-          <w:instrText xml:space="preserve"> PAGEREF _Toc238487558 \h </w:instrText>
+          <w:instrText xml:space="preserve"> PAGEREF _Toc238547142 \h </w:instrText>
         </w:r>
         <w:r>
           <w:rPr>
@@ -1293,7 +1293,7 @@
           <w14:ligatures w14:val="standardContextual"/>
         </w:rPr>
       </w:pPr>
-      <w:hyperlink w:anchor="_Toc238487559" w:history="1">
+      <w:hyperlink w:anchor="_Toc238547143" w:history="1">
         <w:r>
           <w:rPr>
             <w:rStyle w:val="Hipervnculo"/>
@@ -1320,7 +1320,7 @@
             <w:noProof/>
             <w:webHidden/>
           </w:rPr>
-          <w:instrText xml:space="preserve"> PAGEREF _Toc238487559 \h </w:instrText>
+          <w:instrText xml:space="preserve"> PAGEREF _Toc238547143 \h </w:instrText>
         </w:r>
         <w:r>
           <w:rPr>
@@ -1371,7 +1371,7 @@
           <w14:ligatures w14:val="standardContextual"/>
         </w:rPr>
       </w:pPr>
-      <w:hyperlink w:anchor="_Toc238487560" w:history="1">
+      <w:hyperlink w:anchor="_Toc238547144" w:history="1">
         <w:r>
           <w:rPr>
             <w:rStyle w:val="Hipervnculo"/>
@@ -1398,7 +1398,7 @@
             <w:noProof/>
             <w:webHidden/>
           </w:rPr>
-          <w:instrText xml:space="preserve"> PAGEREF _Toc238487560 \h </w:instrText>
+          <w:instrText xml:space="preserve"> PAGEREF _Toc238547144 \h </w:instrText>
         </w:r>
         <w:r>
           <w:rPr>
@@ -1448,7 +1448,7 @@
           <w14:ligatures w14:val="standardContextual"/>
         </w:rPr>
       </w:pPr>
-      <w:hyperlink w:anchor="_Toc238487561" w:history="1">
+      <w:hyperlink w:anchor="_Toc238547145" w:history="1">
         <w:r>
           <w:rPr>
             <w:rStyle w:val="Hipervnculo"/>
@@ -1475,7 +1475,7 @@
             <w:noProof/>
             <w:webHidden/>
           </w:rPr>
-          <w:instrText xml:space="preserve"> PAGEREF _Toc238487561 \h </w:instrText>
+          <w:instrText xml:space="preserve"> PAGEREF _Toc238547145 \h </w:instrText>
         </w:r>
         <w:r>
           <w:rPr>
@@ -1525,7 +1525,7 @@
           <w14:ligatures w14:val="standardContextual"/>
         </w:rPr>
       </w:pPr>
-      <w:hyperlink w:anchor="_Toc238487562" w:history="1">
+      <w:hyperlink w:anchor="_Toc238547146" w:history="1">
         <w:r>
           <w:rPr>
             <w:rStyle w:val="Hipervnculo"/>
@@ -1552,7 +1552,7 @@
             <w:noProof/>
             <w:webHidden/>
           </w:rPr>
-          <w:instrText xml:space="preserve"> PAGEREF _Toc238487562 \h </w:instrText>
+          <w:instrText xml:space="preserve"> PAGEREF _Toc238547146 \h </w:instrText>
         </w:r>
         <w:r>
           <w:rPr>
@@ -1602,7 +1602,7 @@
           <w14:ligatures w14:val="standardContextual"/>
         </w:rPr>
       </w:pPr>
-      <w:hyperlink w:anchor="_Toc238487563" w:history="1">
+      <w:hyperlink w:anchor="_Toc238547147" w:history="1">
         <w:r>
           <w:rPr>
             <w:rStyle w:val="Hipervnculo"/>
@@ -1629,7 +1629,7 @@
             <w:noProof/>
             <w:webHidden/>
           </w:rPr>
-          <w:instrText xml:space="preserve"> PAGEREF _Toc238487563 \h </w:instrText>
+          <w:instrText xml:space="preserve"> PAGEREF _Toc238547147 \h </w:instrText>
         </w:r>
         <w:r>
           <w:rPr>
@@ -1679,7 +1679,7 @@
           <w14:ligatures w14:val="standardContextual"/>
         </w:rPr>
       </w:pPr>
-      <w:hyperlink w:anchor="_Toc238487564" w:history="1">
+      <w:hyperlink w:anchor="_Toc238547148" w:history="1">
         <w:r>
           <w:rPr>
             <w:rStyle w:val="Hipervnculo"/>
@@ -1706,7 +1706,7 @@
             <w:noProof/>
             <w:webHidden/>
           </w:rPr>
-          <w:instrText xml:space="preserve"> PAGEREF _Toc238487564 \h </w:instrText>
+          <w:instrText xml:space="preserve"> PAGEREF _Toc238547148 \h </w:instrText>
         </w:r>
         <w:r>
           <w:rPr>
@@ -1756,7 +1756,7 @@
           <w14:ligatures w14:val="standardContextual"/>
         </w:rPr>
       </w:pPr>
-      <w:hyperlink w:anchor="_Toc238487565" w:history="1">
+      <w:hyperlink w:anchor="_Toc238547149" w:history="1">
         <w:r>
           <w:rPr>
             <w:rStyle w:val="Hipervnculo"/>
@@ -1783,7 +1783,7 @@
             <w:noProof/>
             <w:webHidden/>
           </w:rPr>
-          <w:instrText xml:space="preserve"> PAGEREF _Toc238487565 \h </w:instrText>
+          <w:instrText xml:space="preserve"> PAGEREF _Toc238547149 \h </w:instrText>
         </w:r>
         <w:r>
           <w:rPr>
@@ -1833,7 +1833,7 @@
           <w14:ligatures w14:val="standardContextual"/>
         </w:rPr>
       </w:pPr>
-      <w:hyperlink w:anchor="_Toc238487566" w:history="1">
+      <w:hyperlink w:anchor="_Toc238547150" w:history="1">
         <w:r>
           <w:rPr>
             <w:rStyle w:val="Hipervnculo"/>
@@ -1860,7 +1860,7 @@
             <w:noProof/>
             <w:webHidden/>
           </w:rPr>
-          <w:instrText xml:space="preserve"> PAGEREF _Toc238487566 \h </w:instrText>
+          <w:instrText xml:space="preserve"> PAGEREF _Toc238547150 \h </w:instrText>
         </w:r>
         <w:r>
           <w:rPr>
@@ -1911,7 +1911,7 @@
           <w14:ligatures w14:val="standardContextual"/>
         </w:rPr>
       </w:pPr>
-      <w:hyperlink w:anchor="_Toc238487567" w:history="1">
+      <w:hyperlink w:anchor="_Toc238547151" w:history="1">
         <w:r>
           <w:rPr>
             <w:rStyle w:val="Hipervnculo"/>
@@ -1938,7 +1938,7 @@
             <w:noProof/>
             <w:webHidden/>
           </w:rPr>
-          <w:instrText xml:space="preserve"> PAGEREF _Toc238487567 \h </w:instrText>
+          <w:instrText xml:space="preserve"> PAGEREF _Toc238547151 \h </w:instrText>
         </w:r>
         <w:r>
           <w:rPr>
@@ -1988,7 +1988,7 @@
           <w14:ligatures w14:val="standardContextual"/>
         </w:rPr>
       </w:pPr>
-      <w:hyperlink w:anchor="_Toc238487568" w:history="1">
+      <w:hyperlink w:anchor="_Toc238547152" w:history="1">
         <w:r>
           <w:rPr>
             <w:rStyle w:val="Hipervnculo"/>
@@ -2015,7 +2015,7 @@
             <w:noProof/>
             <w:webHidden/>
           </w:rPr>
-          <w:instrText xml:space="preserve"> PAGEREF _Toc238487568 \h </w:instrText>
+          <w:instrText xml:space="preserve"> PAGEREF _Toc238547152 \h </w:instrText>
         </w:r>
         <w:r>
           <w:rPr>
@@ -2065,7 +2065,7 @@
           <w14:ligatures w14:val="standardContextual"/>
         </w:rPr>
       </w:pPr>
-      <w:hyperlink w:anchor="_Toc238487569" w:history="1">
+      <w:hyperlink w:anchor="_Toc238547153" w:history="1">
         <w:r>
           <w:rPr>
             <w:rStyle w:val="Hipervnculo"/>
@@ -2092,7 +2092,7 @@
             <w:noProof/>
             <w:webHidden/>
           </w:rPr>
-          <w:instrText xml:space="preserve"> PAGEREF _Toc238487569 \h </w:instrText>
+          <w:instrText xml:space="preserve"> PAGEREF _Toc238547153 \h </w:instrText>
         </w:r>
         <w:r>
           <w:rPr>
@@ -2140,7 +2140,7 @@
           <w14:ligatures w14:val="standardContextual"/>
         </w:rPr>
       </w:pPr>
-      <w:hyperlink w:anchor="_Toc238487570" w:history="1">
+      <w:hyperlink w:anchor="_Toc238547154" w:history="1">
         <w:r>
           <w:rPr>
             <w:rStyle w:val="Hipervnculo"/>
@@ -2167,7 +2167,7 @@
             <w:noProof/>
             <w:webHidden/>
           </w:rPr>
-          <w:instrText xml:space="preserve"> PAGEREF _Toc238487570 \h </w:instrText>
+          <w:instrText xml:space="preserve"> PAGEREF _Toc238547154 \h </w:instrText>
         </w:r>
         <w:r>
           <w:rPr>
@@ -2215,7 +2215,7 @@
           <w14:ligatures w14:val="standardContextual"/>
         </w:rPr>
       </w:pPr>
-      <w:hyperlink w:anchor="_Toc238487571" w:history="1">
+      <w:hyperlink w:anchor="_Toc238547155" w:history="1">
         <w:r>
           <w:rPr>
             <w:rStyle w:val="Hipervnculo"/>
@@ -2242,7 +2242,7 @@
             <w:noProof/>
             <w:webHidden/>
           </w:rPr>
-          <w:instrText xml:space="preserve"> PAGEREF _Toc238487571 \h </w:instrText>
+          <w:instrText xml:space="preserve"> PAGEREF _Toc238547155 \h </w:instrText>
         </w:r>
         <w:r>
           <w:rPr>
@@ -2290,7 +2290,7 @@
           <w14:ligatures w14:val="standardContextual"/>
         </w:rPr>
       </w:pPr>
-      <w:hyperlink w:anchor="_Toc238487572" w:history="1">
+      <w:hyperlink w:anchor="_Toc238547156" w:history="1">
         <w:r>
           <w:rPr>
             <w:rStyle w:val="Hipervnculo"/>
@@ -2317,7 +2317,7 @@
             <w:noProof/>
             <w:webHidden/>
           </w:rPr>
-          <w:instrText xml:space="preserve"> PAGEREF _Toc238487572 \h </w:instrText>
+          <w:instrText xml:space="preserve"> PAGEREF _Toc238547156 \h </w:instrText>
         </w:r>
         <w:r>
           <w:rPr>
@@ -2365,7 +2365,7 @@
           <w14:ligatures w14:val="standardContextual"/>
         </w:rPr>
       </w:pPr>
-      <w:hyperlink w:anchor="_Toc238487573" w:history="1">
+      <w:hyperlink w:anchor="_Toc238547157" w:history="1">
         <w:r>
           <w:rPr>
             <w:rStyle w:val="Hipervnculo"/>
@@ -2392,7 +2392,7 @@
             <w:noProof/>
             <w:webHidden/>
           </w:rPr>
-          <w:instrText xml:space="preserve"> PAGEREF _Toc238487573 \h </w:instrText>
+          <w:instrText xml:space="preserve"> PAGEREF _Toc238547157 \h </w:instrText>
         </w:r>
         <w:r>
           <w:rPr>
@@ -2440,7 +2440,7 @@
           <w14:ligatures w14:val="standardContextual"/>
         </w:rPr>
       </w:pPr>
-      <w:hyperlink w:anchor="_Toc238487574" w:history="1">
+      <w:hyperlink w:anchor="_Toc238547158" w:history="1">
         <w:r>
           <w:rPr>
             <w:rStyle w:val="Hipervnculo"/>
@@ -2467,7 +2467,7 @@
             <w:noProof/>
             <w:webHidden/>
           </w:rPr>
-          <w:instrText xml:space="preserve"> PAGEREF _Toc238487574 \h </w:instrText>
+          <w:instrText xml:space="preserve"> PAGEREF _Toc238547158 \h </w:instrText>
         </w:r>
         <w:r>
           <w:rPr>
@@ -2515,7 +2515,7 @@
           <w14:ligatures w14:val="standardContextual"/>
         </w:rPr>
       </w:pPr>
-      <w:hyperlink w:anchor="_Toc238487575" w:history="1">
+      <w:hyperlink w:anchor="_Toc238547159" w:history="1">
         <w:r>
           <w:rPr>
             <w:rStyle w:val="Hipervnculo"/>
@@ -2542,7 +2542,7 @@
             <w:noProof/>
             <w:webHidden/>
           </w:rPr>
-          <w:instrText xml:space="preserve"> PAGEREF _Toc238487575 \h </w:instrText>
+          <w:instrText xml:space="preserve"> PAGEREF _Toc238547159 \h </w:instrText>
         </w:r>
         <w:r>
           <w:rPr>
@@ -2590,7 +2590,7 @@
           <w14:ligatures w14:val="standardContextual"/>
         </w:rPr>
       </w:pPr>
-      <w:hyperlink w:anchor="_Toc238487576" w:history="1">
+      <w:hyperlink w:anchor="_Toc238547160" w:history="1">
         <w:r>
           <w:rPr>
             <w:rStyle w:val="Hipervnculo"/>
@@ -2617,7 +2617,7 @@
             <w:noProof/>
             <w:webHidden/>
           </w:rPr>
-          <w:instrText xml:space="preserve"> PAGEREF _Toc238487576 \h </w:instrText>
+          <w:instrText xml:space="preserve"> PAGEREF _Toc238547160 \h </w:instrText>
         </w:r>
         <w:r>
           <w:rPr>
@@ -2668,7 +2668,7 @@
           <w14:ligatures w14:val="standardContextual"/>
         </w:rPr>
       </w:pPr>
-      <w:hyperlink w:anchor="_Toc238487577" w:history="1">
+      <w:hyperlink w:anchor="_Toc238547161" w:history="1">
         <w:r>
           <w:rPr>
             <w:rStyle w:val="Hipervnculo"/>
@@ -2695,7 +2695,7 @@
             <w:noProof/>
             <w:webHidden/>
           </w:rPr>
-          <w:instrText xml:space="preserve"> PAGEREF _Toc238487577 \h </w:instrText>
+          <w:instrText xml:space="preserve"> PAGEREF _Toc238547161 \h </w:instrText>
         </w:r>
         <w:r>
           <w:rPr>
@@ -2745,7 +2745,7 @@
           <w14:ligatures w14:val="standardContextual"/>
         </w:rPr>
       </w:pPr>
-      <w:hyperlink w:anchor="_Toc238487578" w:history="1">
+      <w:hyperlink w:anchor="_Toc238547162" w:history="1">
         <w:r>
           <w:rPr>
             <w:rStyle w:val="Hipervnculo"/>
@@ -2772,7 +2772,7 @@
             <w:noProof/>
             <w:webHidden/>
           </w:rPr>
-          <w:instrText xml:space="preserve"> PAGEREF _Toc238487578 \h </w:instrText>
+          <w:instrText xml:space="preserve"> PAGEREF _Toc238547162 \h </w:instrText>
         </w:r>
         <w:r>
           <w:rPr>
@@ -2822,7 +2822,7 @@
           <w14:ligatures w14:val="standardContextual"/>
         </w:rPr>
       </w:pPr>
-      <w:hyperlink w:anchor="_Toc238487579" w:history="1">
+      <w:hyperlink w:anchor="_Toc238547163" w:history="1">
         <w:r>
           <w:rPr>
             <w:rStyle w:val="Hipervnculo"/>
@@ -2849,7 +2849,7 @@
             <w:noProof/>
             <w:webHidden/>
           </w:rPr>
-          <w:instrText xml:space="preserve"> PAGEREF _Toc238487579 \h </w:instrText>
+          <w:instrText xml:space="preserve"> PAGEREF _Toc238547163 \h </w:instrText>
         </w:r>
         <w:r>
           <w:rPr>
@@ -2900,7 +2900,7 @@
           <w14:ligatures w14:val="standardContextual"/>
         </w:rPr>
       </w:pPr>
-      <w:hyperlink w:anchor="_Toc238487580" w:history="1">
+      <w:hyperlink w:anchor="_Toc238547164" w:history="1">
         <w:r>
           <w:rPr>
             <w:rStyle w:val="Hipervnculo"/>
@@ -2927,7 +2927,7 @@
             <w:noProof/>
             <w:webHidden/>
           </w:rPr>
-          <w:instrText xml:space="preserve"> PAGEREF _Toc238487580 \h </w:instrText>
+          <w:instrText xml:space="preserve"> PAGEREF _Toc238547164 \h </w:instrText>
         </w:r>
         <w:r>
           <w:rPr>
@@ -2977,7 +2977,7 @@
           <w14:ligatures w14:val="standardContextual"/>
         </w:rPr>
       </w:pPr>
-      <w:hyperlink w:anchor="_Toc238487581" w:history="1">
+      <w:hyperlink w:anchor="_Toc238547165" w:history="1">
         <w:r>
           <w:rPr>
             <w:rStyle w:val="Hipervnculo"/>
@@ -3004,7 +3004,7 @@
             <w:noProof/>
             <w:webHidden/>
           </w:rPr>
-          <w:instrText xml:space="preserve"> PAGEREF _Toc238487581 \h </w:instrText>
+          <w:instrText xml:space="preserve"> PAGEREF _Toc238547165 \h </w:instrText>
         </w:r>
         <w:r>
           <w:rPr>
@@ -3054,7 +3054,7 @@
           <w14:ligatures w14:val="standardContextual"/>
         </w:rPr>
       </w:pPr>
-      <w:hyperlink w:anchor="_Toc238487582" w:history="1">
+      <w:hyperlink w:anchor="_Toc238547166" w:history="1">
         <w:r>
           <w:rPr>
             <w:rStyle w:val="Hipervnculo"/>
@@ -3081,7 +3081,7 @@
             <w:noProof/>
             <w:webHidden/>
           </w:rPr>
-          <w:instrText xml:space="preserve"> PAGEREF _Toc238487582 \h </w:instrText>
+          <w:instrText xml:space="preserve"> PAGEREF _Toc238547166 \h </w:instrText>
         </w:r>
         <w:r>
           <w:rPr>
@@ -3132,7 +3132,7 @@
           <w14:ligatures w14:val="standardContextual"/>
         </w:rPr>
       </w:pPr>
-      <w:hyperlink w:anchor="_Toc238487583" w:history="1">
+      <w:hyperlink w:anchor="_Toc238547167" w:history="1">
         <w:r>
           <w:rPr>
             <w:rStyle w:val="Hipervnculo"/>
@@ -3159,7 +3159,7 @@
             <w:noProof/>
             <w:webHidden/>
           </w:rPr>
-          <w:instrText xml:space="preserve"> PAGEREF _Toc238487583 \h </w:instrText>
+          <w:instrText xml:space="preserve"> PAGEREF _Toc238547167 \h </w:instrText>
         </w:r>
         <w:r>
           <w:rPr>
@@ -3209,7 +3209,7 @@
           <w14:ligatures w14:val="standardContextual"/>
         </w:rPr>
       </w:pPr>
-      <w:hyperlink w:anchor="_Toc238487584" w:history="1">
+      <w:hyperlink w:anchor="_Toc238547168" w:history="1">
         <w:r>
           <w:rPr>
             <w:rStyle w:val="Hipervnculo"/>
@@ -3236,7 +3236,7 @@
             <w:noProof/>
             <w:webHidden/>
           </w:rPr>
-          <w:instrText xml:space="preserve"> PAGEREF _Toc238487584 \h </w:instrText>
+          <w:instrText xml:space="preserve"> PAGEREF _Toc238547168 \h </w:instrText>
         </w:r>
         <w:r>
           <w:rPr>
@@ -3286,7 +3286,7 @@
           <w14:ligatures w14:val="standardContextual"/>
         </w:rPr>
       </w:pPr>
-      <w:hyperlink w:anchor="_Toc238487585" w:history="1">
+      <w:hyperlink w:anchor="_Toc238547169" w:history="1">
         <w:r>
           <w:rPr>
             <w:rStyle w:val="Hipervnculo"/>
@@ -3313,7 +3313,7 @@
             <w:noProof/>
             <w:webHidden/>
           </w:rPr>
-          <w:instrText xml:space="preserve"> PAGEREF _Toc238487585 \h </w:instrText>
+          <w:instrText xml:space="preserve"> PAGEREF _Toc238547169 \h </w:instrText>
         </w:r>
         <w:r>
           <w:rPr>
@@ -3363,7 +3363,7 @@
           <w14:ligatures w14:val="standardContextual"/>
         </w:rPr>
       </w:pPr>
-      <w:hyperlink w:anchor="_Toc238487586" w:history="1">
+      <w:hyperlink w:anchor="_Toc238547170" w:history="1">
         <w:r>
           <w:rPr>
             <w:rStyle w:val="Hipervnculo"/>
@@ -3390,7 +3390,7 @@
             <w:noProof/>
             <w:webHidden/>
           </w:rPr>
-          <w:instrText xml:space="preserve"> PAGEREF _Toc238487586 \h </w:instrText>
+          <w:instrText xml:space="preserve"> PAGEREF _Toc238547170 \h </w:instrText>
         </w:r>
         <w:r>
           <w:rPr>
@@ -3440,7 +3440,7 @@
           <w14:ligatures w14:val="standardContextual"/>
         </w:rPr>
       </w:pPr>
-      <w:hyperlink w:anchor="_Toc238487587" w:history="1">
+      <w:hyperlink w:anchor="_Toc238547171" w:history="1">
         <w:r>
           <w:rPr>
             <w:rStyle w:val="Hipervnculo"/>
@@ -3467,7 +3467,7 @@
             <w:noProof/>
             <w:webHidden/>
           </w:rPr>
-          <w:instrText xml:space="preserve"> PAGEREF _Toc238487587 \h </w:instrText>
+          <w:instrText xml:space="preserve"> PAGEREF _Toc238547171 \h </w:instrText>
         </w:r>
         <w:r>
           <w:rPr>
@@ -3517,7 +3517,7 @@
           <w14:ligatures w14:val="standardContextual"/>
         </w:rPr>
       </w:pPr>
-      <w:hyperlink w:anchor="_Toc238487588" w:history="1">
+      <w:hyperlink w:anchor="_Toc238547172" w:history="1">
         <w:r>
           <w:rPr>
             <w:rStyle w:val="Hipervnculo"/>
@@ -3544,7 +3544,7 @@
             <w:noProof/>
             <w:webHidden/>
           </w:rPr>
-          <w:instrText xml:space="preserve"> PAGEREF _Toc238487588 \h </w:instrText>
+          <w:instrText xml:space="preserve"> PAGEREF _Toc238547172 \h </w:instrText>
         </w:r>
         <w:r>
           <w:rPr>
@@ -3589,7 +3589,7 @@
       <w:pPr>
         <w:pStyle w:val="Ttulo"/>
       </w:pPr>
-      <w:bookmarkStart w:id="1" w:name="_Toc238487551"/>
+      <w:bookmarkStart w:id="1" w:name="_Toc238547135"/>
       <w:r>
         <w:lastRenderedPageBreak/>
         <w:t>Foreword</w:t>
@@ -3605,7 +3605,7 @@
       <w:pPr>
         <w:pStyle w:val="Ttulo"/>
       </w:pPr>
-      <w:bookmarkStart w:id="2" w:name="_Toc238487552"/>
+      <w:bookmarkStart w:id="2" w:name="_Toc238547136"/>
       <w:r>
         <w:lastRenderedPageBreak/>
         <w:t>1. Purpose, scope, and models</w:t>
@@ -3622,7 +3622,7 @@
         <w:pStyle w:val="Ttulo1"/>
         <w:spacing w:before="280"/>
       </w:pPr>
-      <w:bookmarkStart w:id="3" w:name="_Toc238487553"/>
+      <w:bookmarkStart w:id="3" w:name="_Toc238547137"/>
       <w:r>
         <w:t>1.1 Scope of this guide</w:t>
       </w:r>
@@ -3647,7 +3647,7 @@
       <w:pPr>
         <w:pStyle w:val="Ttulo"/>
       </w:pPr>
-      <w:bookmarkStart w:id="4" w:name="_Toc238487554"/>
+      <w:bookmarkStart w:id="4" w:name="_Toc238547138"/>
       <w:r>
         <w:lastRenderedPageBreak/>
         <w:t>2. Activation and producer selection</w:t>
@@ -3659,7 +3659,7 @@
         <w:pStyle w:val="Ttulo1"/>
         <w:spacing w:before="280"/>
       </w:pPr>
-      <w:bookmarkStart w:id="5" w:name="_Toc238487555"/>
+      <w:bookmarkStart w:id="5" w:name="_Toc238547139"/>
       <w:r>
         <w:t>2.1 Console command</w:t>
       </w:r>
@@ -4117,7 +4117,7 @@
         <w:pStyle w:val="Ttulo1"/>
         <w:spacing w:before="280"/>
       </w:pPr>
-      <w:bookmarkStart w:id="6" w:name="_Toc238487556"/>
+      <w:bookmarkStart w:id="6" w:name="_Toc238547140"/>
       <w:r>
         <w:t>2.2 Conditions and special paths</w:t>
       </w:r>
@@ -4175,7 +4175,7 @@
       <w:pPr>
         <w:pStyle w:val="Ttulo"/>
       </w:pPr>
-      <w:bookmarkStart w:id="7" w:name="_Toc238487557"/>
+      <w:bookmarkStart w:id="7" w:name="_Toc238547141"/>
       <w:r>
         <w:lastRenderedPageBreak/>
         <w:t>3. Common file structure</w:t>
@@ -4187,7 +4187,7 @@
         <w:pStyle w:val="Ttulo1"/>
         <w:spacing w:before="280"/>
       </w:pPr>
-      <w:bookmarkStart w:id="8" w:name="_Toc238487558"/>
+      <w:bookmarkStart w:id="8" w:name="_Toc238547142"/>
       <w:r>
         <w:t>3.1 Physical hierarchy</w:t>
       </w:r>
@@ -4508,7 +4508,7 @@
         <w:pStyle w:val="Ttulo1"/>
         <w:spacing w:before="280"/>
       </w:pPr>
-      <w:bookmarkStart w:id="9" w:name="_Toc238487559"/>
+      <w:bookmarkStart w:id="9" w:name="_Toc238547143"/>
       <w:r>
         <w:t>3.2 Timing rules</w:t>
       </w:r>
@@ -4590,7 +4590,7 @@
       <w:pPr>
         <w:pStyle w:val="Ttulo"/>
       </w:pPr>
-      <w:bookmarkStart w:id="10" w:name="_Toc238487560"/>
+      <w:bookmarkStart w:id="10" w:name="_Toc238547144"/>
       <w:r>
         <w:lastRenderedPageBreak/>
         <w:t>4. Common framework records</w:t>
@@ -4602,7 +4602,7 @@
         <w:pStyle w:val="Ttulo1"/>
         <w:spacing w:before="280"/>
       </w:pPr>
-      <w:bookmarkStart w:id="11" w:name="_Toc238487561"/>
+      <w:bookmarkStart w:id="11" w:name="_Toc238547145"/>
       <w:r>
         <w:t>CPU — Info Cycle</w:t>
       </w:r>
@@ -4668,7 +4668,7 @@
         <w:pStyle w:val="Ttulo1"/>
         <w:spacing w:before="280"/>
       </w:pPr>
-      <w:bookmarkStart w:id="12" w:name="_Toc238487562"/>
+      <w:bookmarkStart w:id="12" w:name="_Toc238547146"/>
       <w:r>
         <w:t>CPU — Transaction about to execute</w:t>
       </w:r>
@@ -4734,7 +4734,7 @@
         <w:pStyle w:val="Ttulo1"/>
         <w:spacing w:before="280"/>
       </w:pPr>
-      <w:bookmarkStart w:id="13" w:name="_Toc238487563"/>
+      <w:bookmarkStart w:id="13" w:name="_Toc238547147"/>
       <w:r>
         <w:t>CPU — Executed instruction</w:t>
       </w:r>
@@ -4800,7 +4800,7 @@
         <w:pStyle w:val="Ttulo1"/>
         <w:spacing w:before="280"/>
       </w:pPr>
-      <w:bookmarkStart w:id="14" w:name="_Toc238487564"/>
+      <w:bookmarkStart w:id="14" w:name="_Toc238547148"/>
       <w:r>
         <w:t>CPU — Stop</w:t>
       </w:r>
@@ -4867,7 +4867,7 @@
         <w:pStyle w:val="Ttulo1"/>
         <w:spacing w:before="280"/>
       </w:pPr>
-      <w:bookmarkStart w:id="15" w:name="_Toc238487565"/>
+      <w:bookmarkStart w:id="15" w:name="_Toc238547149"/>
       <w:r>
         <w:t>CPU — Interrupts</w:t>
       </w:r>
@@ -4933,7 +4933,7 @@
         <w:pStyle w:val="Ttulo1"/>
         <w:spacing w:before="280"/>
       </w:pPr>
-      <w:bookmarkStart w:id="16" w:name="_Toc238487566"/>
+      <w:bookmarkStart w:id="16" w:name="_Toc238547150"/>
       <w:r>
         <w:t>Memory — Applied Set</w:t>
       </w:r>
@@ -4998,7 +4998,7 @@
       <w:pPr>
         <w:pStyle w:val="Ttulo"/>
       </w:pPr>
-      <w:bookmarkStart w:id="17" w:name="_Toc238487567"/>
+      <w:bookmarkStart w:id="17" w:name="_Toc238547151"/>
       <w:r>
         <w:lastRenderedPageBreak/>
         <w:t>5. Machine-specific components</w:t>
@@ -5010,7 +5010,7 @@
         <w:pStyle w:val="Ttulo1"/>
         <w:spacing w:before="280"/>
       </w:pPr>
-      <w:bookmarkStart w:id="18" w:name="_Toc238487568"/>
+      <w:bookmarkStart w:id="18" w:name="_Toc238547152"/>
       <w:r>
         <w:t>5.1 Selectable inventory</w:t>
       </w:r>
@@ -5617,7 +5617,7 @@
         <w:pStyle w:val="Ttulo1"/>
         <w:spacing w:before="280"/>
       </w:pPr>
-      <w:bookmarkStart w:id="19" w:name="_Toc238487569"/>
+      <w:bookmarkStart w:id="19" w:name="_Toc238547153"/>
       <w:r>
         <w:t>5.2 Record catalog</w:t>
       </w:r>
@@ -5627,7 +5627,7 @@
       <w:pPr>
         <w:pStyle w:val="Ttulo2"/>
       </w:pPr>
-      <w:bookmarkStart w:id="20" w:name="_Toc238487570"/>
+      <w:bookmarkStart w:id="20" w:name="_Toc238547154"/>
       <w:r>
         <w:t>VICII — Info Cycle</w:t>
       </w:r>
@@ -5681,7 +5681,7 @@
       <w:pPr>
         <w:pStyle w:val="Ttulo2"/>
       </w:pPr>
-      <w:bookmarkStart w:id="21" w:name="_Toc238487571"/>
+      <w:bookmarkStart w:id="21" w:name="_Toc238547155"/>
       <w:r>
         <w:t>VICII — Video Matrix / graphics pipeline / pixel composition</w:t>
       </w:r>
@@ -5739,7 +5739,7 @@
       <w:pPr>
         <w:pStyle w:val="Ttulo2"/>
       </w:pPr>
-      <w:bookmarkStart w:id="22" w:name="_Toc238487572"/>
+      <w:bookmarkStart w:id="22" w:name="_Toc238547156"/>
       <w:r>
         <w:t>VICII — CPU transaction prediction</w:t>
       </w:r>
@@ -5793,7 +5793,7 @@
       <w:pPr>
         <w:pStyle w:val="Ttulo2"/>
       </w:pPr>
-      <w:bookmarkStart w:id="23" w:name="_Toc238487573"/>
+      <w:bookmarkStart w:id="23" w:name="_Toc238547157"/>
       <w:r>
         <w:t>VICII — CPU stop applied / VIC-II register write</w:t>
       </w:r>
@@ -5847,7 +5847,7 @@
       <w:pPr>
         <w:pStyle w:val="Ttulo2"/>
       </w:pPr>
-      <w:bookmarkStart w:id="24" w:name="_Toc238487574"/>
+      <w:bookmarkStart w:id="24" w:name="_Toc238547158"/>
       <w:r>
         <w:t>CIA1/CIA2 — Info Cycle</w:t>
       </w:r>
@@ -5901,7 +5901,7 @@
       <w:pPr>
         <w:pStyle w:val="Ttulo2"/>
       </w:pPr>
-      <w:bookmarkStart w:id="25" w:name="_Toc238487575"/>
+      <w:bookmarkStart w:id="25" w:name="_Toc238547159"/>
       <w:r>
         <w:t>SID — Info Cycle</w:t>
       </w:r>
@@ -5955,7 +5955,7 @@
       <w:pPr>
         <w:pStyle w:val="Ttulo2"/>
       </w:pPr>
-      <w:bookmarkStart w:id="26" w:name="_Toc238487576"/>
+      <w:bookmarkStart w:id="26" w:name="_Toc238547160"/>
       <w:r>
         <w:t>PLA / C64 Memory</w:t>
       </w:r>
@@ -6010,7 +6010,7 @@
       <w:pPr>
         <w:pStyle w:val="Ttulo"/>
       </w:pPr>
-      <w:bookmarkStart w:id="27" w:name="_Toc238487577"/>
+      <w:bookmarkStart w:id="27" w:name="_Toc238547161"/>
       <w:r>
         <w:lastRenderedPageBreak/>
         <w:t>6. Interpretation method</w:t>
@@ -6022,7 +6022,7 @@
         <w:pStyle w:val="Ttulo1"/>
         <w:spacing w:before="280"/>
       </w:pPr>
-      <w:bookmarkStart w:id="28" w:name="_Toc238487578"/>
+      <w:bookmarkStart w:id="28" w:name="_Toc238547162"/>
       <w:r>
         <w:t>6.1 Recommended procedure</w:t>
       </w:r>
@@ -6105,7 +6105,7 @@
         <w:pStyle w:val="Ttulo1"/>
         <w:spacing w:before="280"/>
       </w:pPr>
-      <w:bookmarkStart w:id="29" w:name="_Toc238487579"/>
+      <w:bookmarkStart w:id="29" w:name="_Toc238547163"/>
       <w:r>
         <w:t>6.2 Annotated example</w:t>
       </w:r>
@@ -6229,7 +6229,7 @@
       <w:pPr>
         <w:pStyle w:val="Ttulo"/>
       </w:pPr>
-      <w:bookmarkStart w:id="30" w:name="_Toc238487580"/>
+      <w:bookmarkStart w:id="30" w:name="_Toc238547164"/>
       <w:r>
         <w:lastRenderedPageBreak/>
         <w:t>7. Limitations and maintenance</w:t>
@@ -6241,7 +6241,7 @@
         <w:pStyle w:val="Ttulo1"/>
         <w:spacing w:before="280"/>
       </w:pPr>
-      <w:bookmarkStart w:id="31" w:name="_Toc238487581"/>
+      <w:bookmarkStart w:id="31" w:name="_Toc238547165"/>
       <w:r>
         <w:t>7.1 Specific limitations</w:t>
       </w:r>
@@ -6280,7 +6280,7 @@
         <w:spacing w:after="60"/>
       </w:pPr>
       <w:r>
-        <w:t>CIA1 Additional Info does not represent an additional cycle.</w:t>
+        <w:t>For bad lines, BadlineCAccessStartCycle is the latch cycle, BadlineFirstCAccessCycle is the first attempted access, and BadlineBARequestCycle is the first effective BA cycle.</w:t>
       </w:r>
     </w:p>
     <w:p>
@@ -6292,6 +6292,18 @@
         <w:spacing w:after="60"/>
       </w:pPr>
       <w:r>
+        <w:t>CIA1 Additional Info does not represent an additional cycle.</w:t>
+      </w:r>
+    </w:p>
+    <w:p>
+      <w:pPr>
+        <w:numPr>
+          <w:ilvl w:val="0"/>
+          <w:numId w:val="30"/>
+        </w:numPr>
+        <w:spacing w:after="60"/>
+      </w:pPr>
+      <w:r>
         <w:t>Sprite and pixel events can make the file grow substantially when VIC-II is selected.</w:t>
       </w:r>
     </w:p>
@@ -6300,7 +6312,7 @@
         <w:pStyle w:val="Ttulo1"/>
         <w:spacing w:before="280"/>
       </w:pPr>
-      <w:bookmarkStart w:id="32" w:name="_Toc238487582"/>
+      <w:bookmarkStart w:id="32" w:name="_Toc238547166"/>
       <w:r>
         <w:t>7.2 Maintenance contract</w:t>
       </w:r>
@@ -6358,7 +6370,7 @@
       <w:pPr>
         <w:pStyle w:val="Ttulo"/>
       </w:pPr>
-      <w:bookmarkStart w:id="33" w:name="_Toc238487583"/>
+      <w:bookmarkStart w:id="33" w:name="_Toc238547167"/>
       <w:r>
         <w:lastRenderedPageBreak/>
         <w:t>Appendices</w:t>
@@ -6369,7 +6381,7 @@
       <w:pPr>
         <w:pStyle w:val="Ttulo1"/>
       </w:pPr>
-      <w:bookmarkStart w:id="34" w:name="_Toc238487584"/>
+      <w:bookmarkStart w:id="34" w:name="_Toc238547168"/>
       <w:r>
         <w:t>Appendix A. Provenance and revision</w:t>
       </w:r>
@@ -6391,7 +6403,7 @@
         <w:pStyle w:val="Ttulo1"/>
         <w:spacing w:before="280"/>
       </w:pPr>
-      <w:bookmarkStart w:id="35" w:name="_Toc238487585"/>
+      <w:bookmarkStart w:id="35" w:name="_Toc238547169"/>
       <w:r>
         <w:t>A.1 Watched source files</w:t>
       </w:r>
@@ -7350,7 +7362,7 @@
         <w:pStyle w:val="Ttulo1"/>
         <w:spacing w:before="280"/>
       </w:pPr>
-      <w:bookmarkStart w:id="36" w:name="_Toc238487586"/>
+      <w:bookmarkStart w:id="36" w:name="_Toc238547170"/>
       <w:r>
         <w:t>A.2 Revision history</w:t>
       </w:r>
@@ -7521,7 +7533,7 @@
       <w:pPr>
         <w:pStyle w:val="Ttulo1"/>
       </w:pPr>
-      <w:bookmarkStart w:id="37" w:name="_Toc238487587"/>
+      <w:bookmarkStart w:id="37" w:name="_Toc238547171"/>
       <w:r>
         <w:t>Illustrations</w:t>
       </w:r>
@@ -7546,7 +7558,7 @@
           <w:bCs/>
           <w:noProof/>
         </w:rPr>
-        <w:t>No table of illustrations entries were found.</w:t>
+        <w:t>No se encuentran elementos de tabla de ilustraciones.</w:t>
       </w:r>
       <w:r>
         <w:fldChar w:fldCharType="end"/>
@@ -7561,7 +7573,7 @@
       <w:pPr>
         <w:pStyle w:val="Ttulo1"/>
       </w:pPr>
-      <w:bookmarkStart w:id="38" w:name="_Toc238487588"/>
+      <w:bookmarkStart w:id="38" w:name="_Toc238547172"/>
       <w:r>
         <w:lastRenderedPageBreak/>
         <w:t>Equations</w:t>
@@ -7587,7 +7599,7 @@
           <w:bCs/>
           <w:noProof/>
         </w:rPr>
-        <w:t>No table of illustrations entries were found.</w:t>
+        <w:t>No se encuentran elementos de tabla de ilustraciones.</w:t>
       </w:r>
       <w:r>
         <w:fldChar w:fldCharType="end"/>
@@ -7667,7 +7679,7 @@
         <w:noProof/>
       </w:rPr>
       <w:drawing>
-        <wp:inline distT="0" distB="0" distL="0" distR="0" wp14:anchorId="603CBEB5" wp14:editId="156CFC99">
+        <wp:inline distT="0" distB="0" distL="0" distR="0" wp14:anchorId="08D42849" wp14:editId="4E1A3BE1">
           <wp:extent cx="576000" cy="459360"/>
           <wp:effectExtent l="0" t="0" r="0" b="0"/>
           <wp:docPr id="1" name="ARGOS framework mark" descr="ARGOS framework mark"/>
@@ -8077,10 +8089,10 @@
         <w:noProof/>
       </w:rPr>
       <w:drawing>
-        <wp:inline distT="0" distB="0" distL="0" distR="0" wp14:anchorId="11234111" wp14:editId="1083E798">
+        <wp:inline distT="0" distB="0" distL="0" distR="0" wp14:anchorId="5F780BE4" wp14:editId="1B6D0BE9">
           <wp:extent cx="1512000" cy="1205820"/>
           <wp:effectExtent l="0" t="0" r="0" b="0"/>
-          <wp:docPr id="320708355" name="ARGOS framework mark" descr="ARGOS framework mark"/>
+          <wp:docPr id="1506325887" name="ARGOS framework mark" descr="ARGOS framework mark"/>
           <wp:cNvGraphicFramePr>
             <a:graphicFrameLocks xmlns:a="http://schemas.openxmlformats.org/drawingml/2006/main" noChangeAspect="1"/>
           </wp:cNvGraphicFramePr>
@@ -11053,19 +11065,19 @@
   <w:num w:numId="26" w16cid:durableId="846600881">
     <w:abstractNumId w:val="20"/>
   </w:num>
-  <w:num w:numId="27" w16cid:durableId="361328675">
+  <w:num w:numId="27" w16cid:durableId="1617834892">
     <w:abstractNumId w:val="0"/>
   </w:num>
-  <w:num w:numId="28" w16cid:durableId="1890989841">
+  <w:num w:numId="28" w16cid:durableId="1364479672">
     <w:abstractNumId w:val="0"/>
   </w:num>
-  <w:num w:numId="29" w16cid:durableId="1313800851">
+  <w:num w:numId="29" w16cid:durableId="1094861234">
     <w:abstractNumId w:val="6"/>
   </w:num>
-  <w:num w:numId="30" w16cid:durableId="1524904738">
+  <w:num w:numId="30" w16cid:durableId="908003510">
     <w:abstractNumId w:val="0"/>
   </w:num>
-  <w:num w:numId="31" w16cid:durableId="1563785624">
+  <w:num w:numId="31" w16cid:durableId="1237856484">
     <w:abstractNumId w:val="0"/>
   </w:num>
 </w:numbering>

</xml_diff>

<commit_message>
several demos works. Still pending a couple of them. I think that the most relevant ones are THEFIGHT, 1000members, TABOO and Nameless.
</commit_message>
<xml_diff>
--- a/docs/C64Data/C64_DEBUG_File_Format.docx
+++ b/docs/C64Data/C64_DEBUG_File_Format.docx
@@ -561,7 +561,7 @@
       <w:pPr>
         <w:pStyle w:val="Ttulo1"/>
       </w:pPr>
-      <w:bookmarkStart w:id="0" w:name="_Toc238734137"/>
+      <w:bookmarkStart w:id="0" w:name="_Toc238916846"/>
       <w:r>
         <w:lastRenderedPageBreak/>
         <w:t>Contents</w:t>
@@ -596,7 +596,7 @@
       <w:r>
         <w:fldChar w:fldCharType="separate"/>
       </w:r>
-      <w:hyperlink w:anchor="_Toc238734137" w:history="1">
+      <w:hyperlink w:anchor="_Toc238916846" w:history="1">
         <w:r>
           <w:rPr>
             <w:rStyle w:val="Hipervnculo"/>
@@ -623,7 +623,7 @@
             <w:noProof/>
             <w:webHidden/>
           </w:rPr>
-          <w:instrText xml:space="preserve"> PAGEREF _Toc238734137 \h </w:instrText>
+          <w:instrText xml:space="preserve"> PAGEREF _Toc238916846 \h </w:instrText>
         </w:r>
         <w:r>
           <w:rPr>
@@ -674,7 +674,7 @@
           <w14:ligatures w14:val="standardContextual"/>
         </w:rPr>
       </w:pPr>
-      <w:hyperlink w:anchor="_Toc238734138" w:history="1">
+      <w:hyperlink w:anchor="_Toc238916847" w:history="1">
         <w:r>
           <w:rPr>
             <w:rStyle w:val="Hipervnculo"/>
@@ -701,7 +701,7 @@
             <w:noProof/>
             <w:webHidden/>
           </w:rPr>
-          <w:instrText xml:space="preserve"> PAGEREF _Toc238734138 \h </w:instrText>
+          <w:instrText xml:space="preserve"> PAGEREF _Toc238916847 \h </w:instrText>
         </w:r>
         <w:r>
           <w:rPr>
@@ -752,7 +752,7 @@
           <w14:ligatures w14:val="standardContextual"/>
         </w:rPr>
       </w:pPr>
-      <w:hyperlink w:anchor="_Toc238734139" w:history="1">
+      <w:hyperlink w:anchor="_Toc238916848" w:history="1">
         <w:r>
           <w:rPr>
             <w:rStyle w:val="Hipervnculo"/>
@@ -779,7 +779,7 @@
             <w:noProof/>
             <w:webHidden/>
           </w:rPr>
-          <w:instrText xml:space="preserve"> PAGEREF _Toc238734139 \h </w:instrText>
+          <w:instrText xml:space="preserve"> PAGEREF _Toc238916848 \h </w:instrText>
         </w:r>
         <w:r>
           <w:rPr>
@@ -829,7 +829,7 @@
           <w14:ligatures w14:val="standardContextual"/>
         </w:rPr>
       </w:pPr>
-      <w:hyperlink w:anchor="_Toc238734140" w:history="1">
+      <w:hyperlink w:anchor="_Toc238916849" w:history="1">
         <w:r>
           <w:rPr>
             <w:rStyle w:val="Hipervnculo"/>
@@ -856,7 +856,7 @@
             <w:noProof/>
             <w:webHidden/>
           </w:rPr>
-          <w:instrText xml:space="preserve"> PAGEREF _Toc238734140 \h </w:instrText>
+          <w:instrText xml:space="preserve"> PAGEREF _Toc238916849 \h </w:instrText>
         </w:r>
         <w:r>
           <w:rPr>
@@ -907,7 +907,7 @@
           <w14:ligatures w14:val="standardContextual"/>
         </w:rPr>
       </w:pPr>
-      <w:hyperlink w:anchor="_Toc238734141" w:history="1">
+      <w:hyperlink w:anchor="_Toc238916850" w:history="1">
         <w:r>
           <w:rPr>
             <w:rStyle w:val="Hipervnculo"/>
@@ -934,7 +934,7 @@
             <w:noProof/>
             <w:webHidden/>
           </w:rPr>
-          <w:instrText xml:space="preserve"> PAGEREF _Toc238734141 \h </w:instrText>
+          <w:instrText xml:space="preserve"> PAGEREF _Toc238916850 \h </w:instrText>
         </w:r>
         <w:r>
           <w:rPr>
@@ -984,7 +984,7 @@
           <w14:ligatures w14:val="standardContextual"/>
         </w:rPr>
       </w:pPr>
-      <w:hyperlink w:anchor="_Toc238734142" w:history="1">
+      <w:hyperlink w:anchor="_Toc238916851" w:history="1">
         <w:r>
           <w:rPr>
             <w:rStyle w:val="Hipervnculo"/>
@@ -1011,7 +1011,7 @@
             <w:noProof/>
             <w:webHidden/>
           </w:rPr>
-          <w:instrText xml:space="preserve"> PAGEREF _Toc238734142 \h </w:instrText>
+          <w:instrText xml:space="preserve"> PAGEREF _Toc238916851 \h </w:instrText>
         </w:r>
         <w:r>
           <w:rPr>
@@ -1061,7 +1061,7 @@
           <w14:ligatures w14:val="standardContextual"/>
         </w:rPr>
       </w:pPr>
-      <w:hyperlink w:anchor="_Toc238734143" w:history="1">
+      <w:hyperlink w:anchor="_Toc238916852" w:history="1">
         <w:r>
           <w:rPr>
             <w:rStyle w:val="Hipervnculo"/>
@@ -1088,7 +1088,7 @@
             <w:noProof/>
             <w:webHidden/>
           </w:rPr>
-          <w:instrText xml:space="preserve"> PAGEREF _Toc238734143 \h </w:instrText>
+          <w:instrText xml:space="preserve"> PAGEREF _Toc238916852 \h </w:instrText>
         </w:r>
         <w:r>
           <w:rPr>
@@ -1139,7 +1139,7 @@
           <w14:ligatures w14:val="standardContextual"/>
         </w:rPr>
       </w:pPr>
-      <w:hyperlink w:anchor="_Toc238734144" w:history="1">
+      <w:hyperlink w:anchor="_Toc238916853" w:history="1">
         <w:r>
           <w:rPr>
             <w:rStyle w:val="Hipervnculo"/>
@@ -1166,7 +1166,7 @@
             <w:noProof/>
             <w:webHidden/>
           </w:rPr>
-          <w:instrText xml:space="preserve"> PAGEREF _Toc238734144 \h </w:instrText>
+          <w:instrText xml:space="preserve"> PAGEREF _Toc238916853 \h </w:instrText>
         </w:r>
         <w:r>
           <w:rPr>
@@ -1216,7 +1216,7 @@
           <w14:ligatures w14:val="standardContextual"/>
         </w:rPr>
       </w:pPr>
-      <w:hyperlink w:anchor="_Toc238734145" w:history="1">
+      <w:hyperlink w:anchor="_Toc238916854" w:history="1">
         <w:r>
           <w:rPr>
             <w:rStyle w:val="Hipervnculo"/>
@@ -1243,7 +1243,7 @@
             <w:noProof/>
             <w:webHidden/>
           </w:rPr>
-          <w:instrText xml:space="preserve"> PAGEREF _Toc238734145 \h </w:instrText>
+          <w:instrText xml:space="preserve"> PAGEREF _Toc238916854 \h </w:instrText>
         </w:r>
         <w:r>
           <w:rPr>
@@ -1293,7 +1293,7 @@
           <w14:ligatures w14:val="standardContextual"/>
         </w:rPr>
       </w:pPr>
-      <w:hyperlink w:anchor="_Toc238734146" w:history="1">
+      <w:hyperlink w:anchor="_Toc238916855" w:history="1">
         <w:r>
           <w:rPr>
             <w:rStyle w:val="Hipervnculo"/>
@@ -1320,7 +1320,7 @@
             <w:noProof/>
             <w:webHidden/>
           </w:rPr>
-          <w:instrText xml:space="preserve"> PAGEREF _Toc238734146 \h </w:instrText>
+          <w:instrText xml:space="preserve"> PAGEREF _Toc238916855 \h </w:instrText>
         </w:r>
         <w:r>
           <w:rPr>
@@ -1371,7 +1371,7 @@
           <w14:ligatures w14:val="standardContextual"/>
         </w:rPr>
       </w:pPr>
-      <w:hyperlink w:anchor="_Toc238734147" w:history="1">
+      <w:hyperlink w:anchor="_Toc238916856" w:history="1">
         <w:r>
           <w:rPr>
             <w:rStyle w:val="Hipervnculo"/>
@@ -1398,7 +1398,7 @@
             <w:noProof/>
             <w:webHidden/>
           </w:rPr>
-          <w:instrText xml:space="preserve"> PAGEREF _Toc238734147 \h </w:instrText>
+          <w:instrText xml:space="preserve"> PAGEREF _Toc238916856 \h </w:instrText>
         </w:r>
         <w:r>
           <w:rPr>
@@ -1448,7 +1448,7 @@
           <w14:ligatures w14:val="standardContextual"/>
         </w:rPr>
       </w:pPr>
-      <w:hyperlink w:anchor="_Toc238734148" w:history="1">
+      <w:hyperlink w:anchor="_Toc238916857" w:history="1">
         <w:r>
           <w:rPr>
             <w:rStyle w:val="Hipervnculo"/>
@@ -1475,7 +1475,7 @@
             <w:noProof/>
             <w:webHidden/>
           </w:rPr>
-          <w:instrText xml:space="preserve"> PAGEREF _Toc238734148 \h </w:instrText>
+          <w:instrText xml:space="preserve"> PAGEREF _Toc238916857 \h </w:instrText>
         </w:r>
         <w:r>
           <w:rPr>
@@ -1525,7 +1525,7 @@
           <w14:ligatures w14:val="standardContextual"/>
         </w:rPr>
       </w:pPr>
-      <w:hyperlink w:anchor="_Toc238734149" w:history="1">
+      <w:hyperlink w:anchor="_Toc238916858" w:history="1">
         <w:r>
           <w:rPr>
             <w:rStyle w:val="Hipervnculo"/>
@@ -1552,7 +1552,7 @@
             <w:noProof/>
             <w:webHidden/>
           </w:rPr>
-          <w:instrText xml:space="preserve"> PAGEREF _Toc238734149 \h </w:instrText>
+          <w:instrText xml:space="preserve"> PAGEREF _Toc238916858 \h </w:instrText>
         </w:r>
         <w:r>
           <w:rPr>
@@ -1602,7 +1602,7 @@
           <w14:ligatures w14:val="standardContextual"/>
         </w:rPr>
       </w:pPr>
-      <w:hyperlink w:anchor="_Toc238734150" w:history="1">
+      <w:hyperlink w:anchor="_Toc238916859" w:history="1">
         <w:r>
           <w:rPr>
             <w:rStyle w:val="Hipervnculo"/>
@@ -1629,7 +1629,7 @@
             <w:noProof/>
             <w:webHidden/>
           </w:rPr>
-          <w:instrText xml:space="preserve"> PAGEREF _Toc238734150 \h </w:instrText>
+          <w:instrText xml:space="preserve"> PAGEREF _Toc238916859 \h </w:instrText>
         </w:r>
         <w:r>
           <w:rPr>
@@ -1679,7 +1679,7 @@
           <w14:ligatures w14:val="standardContextual"/>
         </w:rPr>
       </w:pPr>
-      <w:hyperlink w:anchor="_Toc238734151" w:history="1">
+      <w:hyperlink w:anchor="_Toc238916860" w:history="1">
         <w:r>
           <w:rPr>
             <w:rStyle w:val="Hipervnculo"/>
@@ -1706,7 +1706,7 @@
             <w:noProof/>
             <w:webHidden/>
           </w:rPr>
-          <w:instrText xml:space="preserve"> PAGEREF _Toc238734151 \h </w:instrText>
+          <w:instrText xml:space="preserve"> PAGEREF _Toc238916860 \h </w:instrText>
         </w:r>
         <w:r>
           <w:rPr>
@@ -1756,7 +1756,7 @@
           <w14:ligatures w14:val="standardContextual"/>
         </w:rPr>
       </w:pPr>
-      <w:hyperlink w:anchor="_Toc238734152" w:history="1">
+      <w:hyperlink w:anchor="_Toc238916861" w:history="1">
         <w:r>
           <w:rPr>
             <w:rStyle w:val="Hipervnculo"/>
@@ -1783,7 +1783,7 @@
             <w:noProof/>
             <w:webHidden/>
           </w:rPr>
-          <w:instrText xml:space="preserve"> PAGEREF _Toc238734152 \h </w:instrText>
+          <w:instrText xml:space="preserve"> PAGEREF _Toc238916861 \h </w:instrText>
         </w:r>
         <w:r>
           <w:rPr>
@@ -1833,7 +1833,7 @@
           <w14:ligatures w14:val="standardContextual"/>
         </w:rPr>
       </w:pPr>
-      <w:hyperlink w:anchor="_Toc238734153" w:history="1">
+      <w:hyperlink w:anchor="_Toc238916862" w:history="1">
         <w:r>
           <w:rPr>
             <w:rStyle w:val="Hipervnculo"/>
@@ -1860,7 +1860,7 @@
             <w:noProof/>
             <w:webHidden/>
           </w:rPr>
-          <w:instrText xml:space="preserve"> PAGEREF _Toc238734153 \h </w:instrText>
+          <w:instrText xml:space="preserve"> PAGEREF _Toc238916862 \h </w:instrText>
         </w:r>
         <w:r>
           <w:rPr>
@@ -1911,7 +1911,7 @@
           <w14:ligatures w14:val="standardContextual"/>
         </w:rPr>
       </w:pPr>
-      <w:hyperlink w:anchor="_Toc238734154" w:history="1">
+      <w:hyperlink w:anchor="_Toc238916863" w:history="1">
         <w:r>
           <w:rPr>
             <w:rStyle w:val="Hipervnculo"/>
@@ -1938,7 +1938,7 @@
             <w:noProof/>
             <w:webHidden/>
           </w:rPr>
-          <w:instrText xml:space="preserve"> PAGEREF _Toc238734154 \h </w:instrText>
+          <w:instrText xml:space="preserve"> PAGEREF _Toc238916863 \h </w:instrText>
         </w:r>
         <w:r>
           <w:rPr>
@@ -1988,7 +1988,7 @@
           <w14:ligatures w14:val="standardContextual"/>
         </w:rPr>
       </w:pPr>
-      <w:hyperlink w:anchor="_Toc238734155" w:history="1">
+      <w:hyperlink w:anchor="_Toc238916864" w:history="1">
         <w:r>
           <w:rPr>
             <w:rStyle w:val="Hipervnculo"/>
@@ -2015,7 +2015,7 @@
             <w:noProof/>
             <w:webHidden/>
           </w:rPr>
-          <w:instrText xml:space="preserve"> PAGEREF _Toc238734155 \h </w:instrText>
+          <w:instrText xml:space="preserve"> PAGEREF _Toc238916864 \h </w:instrText>
         </w:r>
         <w:r>
           <w:rPr>
@@ -2065,7 +2065,7 @@
           <w14:ligatures w14:val="standardContextual"/>
         </w:rPr>
       </w:pPr>
-      <w:hyperlink w:anchor="_Toc238734156" w:history="1">
+      <w:hyperlink w:anchor="_Toc238916865" w:history="1">
         <w:r>
           <w:rPr>
             <w:rStyle w:val="Hipervnculo"/>
@@ -2092,7 +2092,7 @@
             <w:noProof/>
             <w:webHidden/>
           </w:rPr>
-          <w:instrText xml:space="preserve"> PAGEREF _Toc238734156 \h </w:instrText>
+          <w:instrText xml:space="preserve"> PAGEREF _Toc238916865 \h </w:instrText>
         </w:r>
         <w:r>
           <w:rPr>
@@ -2140,7 +2140,7 @@
           <w14:ligatures w14:val="standardContextual"/>
         </w:rPr>
       </w:pPr>
-      <w:hyperlink w:anchor="_Toc238734157" w:history="1">
+      <w:hyperlink w:anchor="_Toc238916866" w:history="1">
         <w:r>
           <w:rPr>
             <w:rStyle w:val="Hipervnculo"/>
@@ -2167,7 +2167,7 @@
             <w:noProof/>
             <w:webHidden/>
           </w:rPr>
-          <w:instrText xml:space="preserve"> PAGEREF _Toc238734157 \h </w:instrText>
+          <w:instrText xml:space="preserve"> PAGEREF _Toc238916866 \h </w:instrText>
         </w:r>
         <w:r>
           <w:rPr>
@@ -2215,7 +2215,7 @@
           <w14:ligatures w14:val="standardContextual"/>
         </w:rPr>
       </w:pPr>
-      <w:hyperlink w:anchor="_Toc238734158" w:history="1">
+      <w:hyperlink w:anchor="_Toc238916867" w:history="1">
         <w:r>
           <w:rPr>
             <w:rStyle w:val="Hipervnculo"/>
@@ -2242,7 +2242,7 @@
             <w:noProof/>
             <w:webHidden/>
           </w:rPr>
-          <w:instrText xml:space="preserve"> PAGEREF _Toc238734158 \h </w:instrText>
+          <w:instrText xml:space="preserve"> PAGEREF _Toc238916867 \h </w:instrText>
         </w:r>
         <w:r>
           <w:rPr>
@@ -2262,7 +2262,7 @@
             <w:noProof/>
             <w:webHidden/>
           </w:rPr>
-          <w:t>9</w:t>
+          <w:t>10</w:t>
         </w:r>
         <w:r>
           <w:rPr>
@@ -2290,7 +2290,7 @@
           <w14:ligatures w14:val="standardContextual"/>
         </w:rPr>
       </w:pPr>
-      <w:hyperlink w:anchor="_Toc238734159" w:history="1">
+      <w:hyperlink w:anchor="_Toc238916868" w:history="1">
         <w:r>
           <w:rPr>
             <w:rStyle w:val="Hipervnculo"/>
@@ -2317,7 +2317,7 @@
             <w:noProof/>
             <w:webHidden/>
           </w:rPr>
-          <w:instrText xml:space="preserve"> PAGEREF _Toc238734159 \h </w:instrText>
+          <w:instrText xml:space="preserve"> PAGEREF _Toc238916868 \h </w:instrText>
         </w:r>
         <w:r>
           <w:rPr>
@@ -2365,7 +2365,7 @@
           <w14:ligatures w14:val="standardContextual"/>
         </w:rPr>
       </w:pPr>
-      <w:hyperlink w:anchor="_Toc238734160" w:history="1">
+      <w:hyperlink w:anchor="_Toc238916869" w:history="1">
         <w:r>
           <w:rPr>
             <w:rStyle w:val="Hipervnculo"/>
@@ -2392,7 +2392,7 @@
             <w:noProof/>
             <w:webHidden/>
           </w:rPr>
-          <w:instrText xml:space="preserve"> PAGEREF _Toc238734160 \h </w:instrText>
+          <w:instrText xml:space="preserve"> PAGEREF _Toc238916869 \h </w:instrText>
         </w:r>
         <w:r>
           <w:rPr>
@@ -2440,7 +2440,7 @@
           <w14:ligatures w14:val="standardContextual"/>
         </w:rPr>
       </w:pPr>
-      <w:hyperlink w:anchor="_Toc238734161" w:history="1">
+      <w:hyperlink w:anchor="_Toc238916870" w:history="1">
         <w:r>
           <w:rPr>
             <w:rStyle w:val="Hipervnculo"/>
@@ -2467,7 +2467,7 @@
             <w:noProof/>
             <w:webHidden/>
           </w:rPr>
-          <w:instrText xml:space="preserve"> PAGEREF _Toc238734161 \h </w:instrText>
+          <w:instrText xml:space="preserve"> PAGEREF _Toc238916870 \h </w:instrText>
         </w:r>
         <w:r>
           <w:rPr>
@@ -2515,7 +2515,7 @@
           <w14:ligatures w14:val="standardContextual"/>
         </w:rPr>
       </w:pPr>
-      <w:hyperlink w:anchor="_Toc238734162" w:history="1">
+      <w:hyperlink w:anchor="_Toc238916871" w:history="1">
         <w:r>
           <w:rPr>
             <w:rStyle w:val="Hipervnculo"/>
@@ -2542,7 +2542,7 @@
             <w:noProof/>
             <w:webHidden/>
           </w:rPr>
-          <w:instrText xml:space="preserve"> PAGEREF _Toc238734162 \h </w:instrText>
+          <w:instrText xml:space="preserve"> PAGEREF _Toc238916871 \h </w:instrText>
         </w:r>
         <w:r>
           <w:rPr>
@@ -2590,7 +2590,7 @@
           <w14:ligatures w14:val="standardContextual"/>
         </w:rPr>
       </w:pPr>
-      <w:hyperlink w:anchor="_Toc238734163" w:history="1">
+      <w:hyperlink w:anchor="_Toc238916872" w:history="1">
         <w:r>
           <w:rPr>
             <w:rStyle w:val="Hipervnculo"/>
@@ -2617,7 +2617,7 @@
             <w:noProof/>
             <w:webHidden/>
           </w:rPr>
-          <w:instrText xml:space="preserve"> PAGEREF _Toc238734163 \h </w:instrText>
+          <w:instrText xml:space="preserve"> PAGEREF _Toc238916872 \h </w:instrText>
         </w:r>
         <w:r>
           <w:rPr>
@@ -2668,7 +2668,7 @@
           <w14:ligatures w14:val="standardContextual"/>
         </w:rPr>
       </w:pPr>
-      <w:hyperlink w:anchor="_Toc238734164" w:history="1">
+      <w:hyperlink w:anchor="_Toc238916873" w:history="1">
         <w:r>
           <w:rPr>
             <w:rStyle w:val="Hipervnculo"/>
@@ -2695,7 +2695,7 @@
             <w:noProof/>
             <w:webHidden/>
           </w:rPr>
-          <w:instrText xml:space="preserve"> PAGEREF _Toc238734164 \h </w:instrText>
+          <w:instrText xml:space="preserve"> PAGEREF _Toc238916873 \h </w:instrText>
         </w:r>
         <w:r>
           <w:rPr>
@@ -2745,7 +2745,7 @@
           <w14:ligatures w14:val="standardContextual"/>
         </w:rPr>
       </w:pPr>
-      <w:hyperlink w:anchor="_Toc238734165" w:history="1">
+      <w:hyperlink w:anchor="_Toc238916874" w:history="1">
         <w:r>
           <w:rPr>
             <w:rStyle w:val="Hipervnculo"/>
@@ -2772,7 +2772,7 @@
             <w:noProof/>
             <w:webHidden/>
           </w:rPr>
-          <w:instrText xml:space="preserve"> PAGEREF _Toc238734165 \h </w:instrText>
+          <w:instrText xml:space="preserve"> PAGEREF _Toc238916874 \h </w:instrText>
         </w:r>
         <w:r>
           <w:rPr>
@@ -2822,7 +2822,7 @@
           <w14:ligatures w14:val="standardContextual"/>
         </w:rPr>
       </w:pPr>
-      <w:hyperlink w:anchor="_Toc238734166" w:history="1">
+      <w:hyperlink w:anchor="_Toc238916875" w:history="1">
         <w:r>
           <w:rPr>
             <w:rStyle w:val="Hipervnculo"/>
@@ -2849,7 +2849,7 @@
             <w:noProof/>
             <w:webHidden/>
           </w:rPr>
-          <w:instrText xml:space="preserve"> PAGEREF _Toc238734166 \h </w:instrText>
+          <w:instrText xml:space="preserve"> PAGEREF _Toc238916875 \h </w:instrText>
         </w:r>
         <w:r>
           <w:rPr>
@@ -2900,7 +2900,7 @@
           <w14:ligatures w14:val="standardContextual"/>
         </w:rPr>
       </w:pPr>
-      <w:hyperlink w:anchor="_Toc238734167" w:history="1">
+      <w:hyperlink w:anchor="_Toc238916876" w:history="1">
         <w:r>
           <w:rPr>
             <w:rStyle w:val="Hipervnculo"/>
@@ -2927,7 +2927,7 @@
             <w:noProof/>
             <w:webHidden/>
           </w:rPr>
-          <w:instrText xml:space="preserve"> PAGEREF _Toc238734167 \h </w:instrText>
+          <w:instrText xml:space="preserve"> PAGEREF _Toc238916876 \h </w:instrText>
         </w:r>
         <w:r>
           <w:rPr>
@@ -2977,7 +2977,7 @@
           <w14:ligatures w14:val="standardContextual"/>
         </w:rPr>
       </w:pPr>
-      <w:hyperlink w:anchor="_Toc238734168" w:history="1">
+      <w:hyperlink w:anchor="_Toc238916877" w:history="1">
         <w:r>
           <w:rPr>
             <w:rStyle w:val="Hipervnculo"/>
@@ -3004,7 +3004,7 @@
             <w:noProof/>
             <w:webHidden/>
           </w:rPr>
-          <w:instrText xml:space="preserve"> PAGEREF _Toc238734168 \h </w:instrText>
+          <w:instrText xml:space="preserve"> PAGEREF _Toc238916877 \h </w:instrText>
         </w:r>
         <w:r>
           <w:rPr>
@@ -3054,7 +3054,7 @@
           <w14:ligatures w14:val="standardContextual"/>
         </w:rPr>
       </w:pPr>
-      <w:hyperlink w:anchor="_Toc238734169" w:history="1">
+      <w:hyperlink w:anchor="_Toc238916878" w:history="1">
         <w:r>
           <w:rPr>
             <w:rStyle w:val="Hipervnculo"/>
@@ -3081,7 +3081,7 @@
             <w:noProof/>
             <w:webHidden/>
           </w:rPr>
-          <w:instrText xml:space="preserve"> PAGEREF _Toc238734169 \h </w:instrText>
+          <w:instrText xml:space="preserve"> PAGEREF _Toc238916878 \h </w:instrText>
         </w:r>
         <w:r>
           <w:rPr>
@@ -3132,7 +3132,7 @@
           <w14:ligatures w14:val="standardContextual"/>
         </w:rPr>
       </w:pPr>
-      <w:hyperlink w:anchor="_Toc238734170" w:history="1">
+      <w:hyperlink w:anchor="_Toc238916879" w:history="1">
         <w:r>
           <w:rPr>
             <w:rStyle w:val="Hipervnculo"/>
@@ -3159,7 +3159,7 @@
             <w:noProof/>
             <w:webHidden/>
           </w:rPr>
-          <w:instrText xml:space="preserve"> PAGEREF _Toc238734170 \h </w:instrText>
+          <w:instrText xml:space="preserve"> PAGEREF _Toc238916879 \h </w:instrText>
         </w:r>
         <w:r>
           <w:rPr>
@@ -3209,7 +3209,7 @@
           <w14:ligatures w14:val="standardContextual"/>
         </w:rPr>
       </w:pPr>
-      <w:hyperlink w:anchor="_Toc238734171" w:history="1">
+      <w:hyperlink w:anchor="_Toc238916880" w:history="1">
         <w:r>
           <w:rPr>
             <w:rStyle w:val="Hipervnculo"/>
@@ -3236,7 +3236,7 @@
             <w:noProof/>
             <w:webHidden/>
           </w:rPr>
-          <w:instrText xml:space="preserve"> PAGEREF _Toc238734171 \h </w:instrText>
+          <w:instrText xml:space="preserve"> PAGEREF _Toc238916880 \h </w:instrText>
         </w:r>
         <w:r>
           <w:rPr>
@@ -3286,7 +3286,7 @@
           <w14:ligatures w14:val="standardContextual"/>
         </w:rPr>
       </w:pPr>
-      <w:hyperlink w:anchor="_Toc238734172" w:history="1">
+      <w:hyperlink w:anchor="_Toc238916881" w:history="1">
         <w:r>
           <w:rPr>
             <w:rStyle w:val="Hipervnculo"/>
@@ -3313,7 +3313,7 @@
             <w:noProof/>
             <w:webHidden/>
           </w:rPr>
-          <w:instrText xml:space="preserve"> PAGEREF _Toc238734172 \h </w:instrText>
+          <w:instrText xml:space="preserve"> PAGEREF _Toc238916881 \h </w:instrText>
         </w:r>
         <w:r>
           <w:rPr>
@@ -3363,7 +3363,7 @@
           <w14:ligatures w14:val="standardContextual"/>
         </w:rPr>
       </w:pPr>
-      <w:hyperlink w:anchor="_Toc238734173" w:history="1">
+      <w:hyperlink w:anchor="_Toc238916882" w:history="1">
         <w:r>
           <w:rPr>
             <w:rStyle w:val="Hipervnculo"/>
@@ -3390,7 +3390,7 @@
             <w:noProof/>
             <w:webHidden/>
           </w:rPr>
-          <w:instrText xml:space="preserve"> PAGEREF _Toc238734173 \h </w:instrText>
+          <w:instrText xml:space="preserve"> PAGEREF _Toc238916882 \h </w:instrText>
         </w:r>
         <w:r>
           <w:rPr>
@@ -3440,7 +3440,7 @@
           <w14:ligatures w14:val="standardContextual"/>
         </w:rPr>
       </w:pPr>
-      <w:hyperlink w:anchor="_Toc238734174" w:history="1">
+      <w:hyperlink w:anchor="_Toc238916883" w:history="1">
         <w:r>
           <w:rPr>
             <w:rStyle w:val="Hipervnculo"/>
@@ -3467,7 +3467,7 @@
             <w:noProof/>
             <w:webHidden/>
           </w:rPr>
-          <w:instrText xml:space="preserve"> PAGEREF _Toc238734174 \h </w:instrText>
+          <w:instrText xml:space="preserve"> PAGEREF _Toc238916883 \h </w:instrText>
         </w:r>
         <w:r>
           <w:rPr>
@@ -3517,7 +3517,7 @@
           <w14:ligatures w14:val="standardContextual"/>
         </w:rPr>
       </w:pPr>
-      <w:hyperlink w:anchor="_Toc238734175" w:history="1">
+      <w:hyperlink w:anchor="_Toc238916884" w:history="1">
         <w:r>
           <w:rPr>
             <w:rStyle w:val="Hipervnculo"/>
@@ -3544,7 +3544,7 @@
             <w:noProof/>
             <w:webHidden/>
           </w:rPr>
-          <w:instrText xml:space="preserve"> PAGEREF _Toc238734175 \h </w:instrText>
+          <w:instrText xml:space="preserve"> PAGEREF _Toc238916884 \h </w:instrText>
         </w:r>
         <w:r>
           <w:rPr>
@@ -3589,7 +3589,7 @@
       <w:pPr>
         <w:pStyle w:val="Ttulo"/>
       </w:pPr>
-      <w:bookmarkStart w:id="1" w:name="_Toc238734138"/>
+      <w:bookmarkStart w:id="1" w:name="_Toc238916847"/>
       <w:r>
         <w:lastRenderedPageBreak/>
         <w:t>Foreword</w:t>
@@ -3605,7 +3605,7 @@
       <w:pPr>
         <w:pStyle w:val="Ttulo"/>
       </w:pPr>
-      <w:bookmarkStart w:id="2" w:name="_Toc238734139"/>
+      <w:bookmarkStart w:id="2" w:name="_Toc238916848"/>
       <w:r>
         <w:lastRenderedPageBreak/>
         <w:t>1. Purpose, scope, and models</w:t>
@@ -3622,7 +3622,7 @@
         <w:pStyle w:val="Ttulo1"/>
         <w:spacing w:before="280"/>
       </w:pPr>
-      <w:bookmarkStart w:id="3" w:name="_Toc238734140"/>
+      <w:bookmarkStart w:id="3" w:name="_Toc238916849"/>
       <w:r>
         <w:t>1.1 Scope of this guide</w:t>
       </w:r>
@@ -3647,7 +3647,7 @@
       <w:pPr>
         <w:pStyle w:val="Ttulo"/>
       </w:pPr>
-      <w:bookmarkStart w:id="4" w:name="_Toc238734141"/>
+      <w:bookmarkStart w:id="4" w:name="_Toc238916850"/>
       <w:r>
         <w:lastRenderedPageBreak/>
         <w:t>2. Activation and producer selection</w:t>
@@ -3659,7 +3659,7 @@
         <w:pStyle w:val="Ttulo1"/>
         <w:spacing w:before="280"/>
       </w:pPr>
-      <w:bookmarkStart w:id="5" w:name="_Toc238734142"/>
+      <w:bookmarkStart w:id="5" w:name="_Toc238916851"/>
       <w:r>
         <w:t>2.1 Console command</w:t>
       </w:r>
@@ -4117,7 +4117,7 @@
         <w:pStyle w:val="Ttulo1"/>
         <w:spacing w:before="280"/>
       </w:pPr>
-      <w:bookmarkStart w:id="6" w:name="_Toc238734143"/>
+      <w:bookmarkStart w:id="6" w:name="_Toc238916852"/>
       <w:r>
         <w:t>2.2 Conditions and special paths</w:t>
       </w:r>
@@ -4175,7 +4175,7 @@
       <w:pPr>
         <w:pStyle w:val="Ttulo"/>
       </w:pPr>
-      <w:bookmarkStart w:id="7" w:name="_Toc238734144"/>
+      <w:bookmarkStart w:id="7" w:name="_Toc238916853"/>
       <w:r>
         <w:lastRenderedPageBreak/>
         <w:t>3. Common file structure</w:t>
@@ -4187,7 +4187,7 @@
         <w:pStyle w:val="Ttulo1"/>
         <w:spacing w:before="280"/>
       </w:pPr>
-      <w:bookmarkStart w:id="8" w:name="_Toc238734145"/>
+      <w:bookmarkStart w:id="8" w:name="_Toc238916854"/>
       <w:r>
         <w:t>3.1 Physical hierarchy</w:t>
       </w:r>
@@ -4508,7 +4508,7 @@
         <w:pStyle w:val="Ttulo1"/>
         <w:spacing w:before="280"/>
       </w:pPr>
-      <w:bookmarkStart w:id="9" w:name="_Toc238734146"/>
+      <w:bookmarkStart w:id="9" w:name="_Toc238916855"/>
       <w:r>
         <w:t>3.2 Timing rules</w:t>
       </w:r>
@@ -4590,7 +4590,7 @@
       <w:pPr>
         <w:pStyle w:val="Ttulo"/>
       </w:pPr>
-      <w:bookmarkStart w:id="10" w:name="_Toc238734147"/>
+      <w:bookmarkStart w:id="10" w:name="_Toc238916856"/>
       <w:r>
         <w:lastRenderedPageBreak/>
         <w:t>4. Common framework records</w:t>
@@ -4602,7 +4602,7 @@
         <w:pStyle w:val="Ttulo1"/>
         <w:spacing w:before="280"/>
       </w:pPr>
-      <w:bookmarkStart w:id="11" w:name="_Toc238734148"/>
+      <w:bookmarkStart w:id="11" w:name="_Toc238916857"/>
       <w:r>
         <w:t>CPU — Info Cycle</w:t>
       </w:r>
@@ -4668,7 +4668,7 @@
         <w:pStyle w:val="Ttulo1"/>
         <w:spacing w:before="280"/>
       </w:pPr>
-      <w:bookmarkStart w:id="12" w:name="_Toc238734149"/>
+      <w:bookmarkStart w:id="12" w:name="_Toc238916858"/>
       <w:r>
         <w:t>CPU — Transaction about to execute</w:t>
       </w:r>
@@ -4734,7 +4734,7 @@
         <w:pStyle w:val="Ttulo1"/>
         <w:spacing w:before="280"/>
       </w:pPr>
-      <w:bookmarkStart w:id="13" w:name="_Toc238734150"/>
+      <w:bookmarkStart w:id="13" w:name="_Toc238916859"/>
       <w:r>
         <w:t>CPU — Executed instruction</w:t>
       </w:r>
@@ -4800,7 +4800,7 @@
         <w:pStyle w:val="Ttulo1"/>
         <w:spacing w:before="280"/>
       </w:pPr>
-      <w:bookmarkStart w:id="14" w:name="_Toc238734151"/>
+      <w:bookmarkStart w:id="14" w:name="_Toc238916860"/>
       <w:r>
         <w:t>CPU — Stop</w:t>
       </w:r>
@@ -4867,7 +4867,7 @@
         <w:pStyle w:val="Ttulo1"/>
         <w:spacing w:before="280"/>
       </w:pPr>
-      <w:bookmarkStart w:id="15" w:name="_Toc238734152"/>
+      <w:bookmarkStart w:id="15" w:name="_Toc238916861"/>
       <w:r>
         <w:t>CPU — Interrupts</w:t>
       </w:r>
@@ -4933,7 +4933,7 @@
         <w:pStyle w:val="Ttulo1"/>
         <w:spacing w:before="280"/>
       </w:pPr>
-      <w:bookmarkStart w:id="16" w:name="_Toc238734153"/>
+      <w:bookmarkStart w:id="16" w:name="_Toc238916862"/>
       <w:r>
         <w:t>Memory — Applied Set</w:t>
       </w:r>
@@ -4998,7 +4998,7 @@
       <w:pPr>
         <w:pStyle w:val="Ttulo"/>
       </w:pPr>
-      <w:bookmarkStart w:id="17" w:name="_Toc238734154"/>
+      <w:bookmarkStart w:id="17" w:name="_Toc238916863"/>
       <w:r>
         <w:lastRenderedPageBreak/>
         <w:t>5. Machine-specific components</w:t>
@@ -5010,7 +5010,7 @@
         <w:pStyle w:val="Ttulo1"/>
         <w:spacing w:before="280"/>
       </w:pPr>
-      <w:bookmarkStart w:id="18" w:name="_Toc238734155"/>
+      <w:bookmarkStart w:id="18" w:name="_Toc238916864"/>
       <w:r>
         <w:t>5.1 Selectable inventory</w:t>
       </w:r>
@@ -5617,7 +5617,7 @@
         <w:pStyle w:val="Ttulo1"/>
         <w:spacing w:before="280"/>
       </w:pPr>
-      <w:bookmarkStart w:id="19" w:name="_Toc238734156"/>
+      <w:bookmarkStart w:id="19" w:name="_Toc238916865"/>
       <w:r>
         <w:t>5.2 Record catalog</w:t>
       </w:r>
@@ -5627,7 +5627,7 @@
       <w:pPr>
         <w:pStyle w:val="Ttulo2"/>
       </w:pPr>
-      <w:bookmarkStart w:id="20" w:name="_Toc238734157"/>
+      <w:bookmarkStart w:id="20" w:name="_Toc238916866"/>
       <w:r>
         <w:t>VICII — Info Cycle</w:t>
       </w:r>
@@ -5652,10 +5652,10 @@
         <w:t>Fields:</w:t>
       </w:r>
       <w:r>
-        <w:t xml:space="preserve"> Raster position; Internal(IDLE, VCBASE, VC, VLMI, GAccessIndex, RC, ROW, last data, and complete badline state); CPU bus ownership(BA, AEC, windows, DMA masks, BadLineSource, and SpriteSourceMask); CPU stop prediction; Sprite DMA state(EnabledMask, ActiveMask, DisplayMask, YExpansionMask, YExpansionFlipFlopMask, and eight-entry Y, MCBASE, and MC lists); Border(Main, Vertical, and LastEventAt); Graphics mode; Memory location. List entries use sprite order 0..7 and | as separator. LastEventAt is the visible </w:t>
-      </w:r>
-      <w:r>
-        <w:t>position of the latest horizontal-comparator transition of either border flip-flop.</w:t>
+        <w:t xml:space="preserve"> Raster position; Internal(IDLE, VCBASE, VC, VLMI, GAccessIndex, RC, ROW, last data, BadlineCAccessStartedFromIdle, and complete badline state); CPU bus ownership(BA, AEC, windows, DMA masks, BadLineSource, and SpriteSourceMask); CPU stop prediction; Sprite DMA state(EnabledMask, ActiveMask, DisplayMask, YExpansionMask, YExpansionFlipFlopMask, and eight-entry Y, MCBASE, and MC lists); Border(Main, Vertical, and LastEventAt); Graphics mode; Memory location. List entries use sprite order 0..7 and | as separat</w:t>
+      </w:r>
+      <w:r>
+        <w:t>or. LastEventAt is the visible position of the latest horizontal-comparator transition of either border flip-flop.</w:t>
       </w:r>
     </w:p>
     <w:p>
@@ -5677,18 +5677,19 @@
         <w:t>Events:</w:t>
       </w:r>
       <w:r>
-        <w:t xml:space="preserve"> In shared graphics cycles the g-access event precedes the c-access event; an optional CPU-phase register-write record follows all VIC-II bus activity. Sprite DMA [Sprite,Active,Y,MCBASE,MC,YExpansion,YExpansionFlipFlop] marks the exact cycle where a sprite DMA channel starts or stops. Horizontal border transitions are retained per aligned output pixel for later composition while the hardware flip-flops advance at the physical comparator. The vertical-border rules are evaluated at the exact left comparator </w:t>
-      </w:r>
-      <w:r>
-        <w:t>and again at the final raster cycle. Sprite composition and pixel drawing occur later in the same absolute cycle.</w:t>
+        <w:t xml:space="preserve"> In shared graphics cycles the g-access event precedes the c-access event; an optional CPU-phase register-write record follows all VIC-II bus activity. BadlineCAccessStartedFromIdle records the sequencer state latched at the start of the recognition cycle: late sequences from idle defer their first c-access by one cycle, while late sequences from active display can attempt it in the recognition cycle. Sprite DMA [Sprite,Active,Y,MCBASE,MC,YExpansion,YExpansionFlipFlop] marks the exact cycle where a sprite D</w:t>
+      </w:r>
+      <w:r>
+        <w:t>MA channel starts or stops. Horizontal border transitions are retained per aligned output pixel for later composition while the hardware flip-flops advance at the physical comparator. The vertical-border rules are evaluated at the exact left comparator and again at the final raster cycle. Sprite composition and pixel drawing occur later in the same absolute cycle.</w:t>
       </w:r>
     </w:p>
     <w:p>
       <w:pPr>
         <w:pStyle w:val="Ttulo2"/>
       </w:pPr>
-      <w:bookmarkStart w:id="21" w:name="_Toc238734158"/>
-      <w:r>
+      <w:bookmarkStart w:id="21" w:name="_Toc238916867"/>
+      <w:r>
+        <w:lastRenderedPageBreak/>
         <w:t>VICII — Video Matrix / graphics pipeline / pixel composition</w:t>
       </w:r>
       <w:bookmarkEnd w:id="21"/>
@@ -5709,7 +5710,6 @@
         <w:rPr>
           <w:b/>
         </w:rPr>
-        <w:lastRenderedPageBreak/>
         <w:t>Fields:</w:t>
       </w:r>
       <w:r>
@@ -5745,7 +5745,7 @@
       <w:pPr>
         <w:pStyle w:val="Ttulo2"/>
       </w:pPr>
-      <w:bookmarkStart w:id="22" w:name="_Toc238734159"/>
+      <w:bookmarkStart w:id="22" w:name="_Toc238916868"/>
       <w:r>
         <w:t>VICII — CPU transaction prediction</w:t>
       </w:r>
@@ -5799,7 +5799,7 @@
       <w:pPr>
         <w:pStyle w:val="Ttulo2"/>
       </w:pPr>
-      <w:bookmarkStart w:id="23" w:name="_Toc238734160"/>
+      <w:bookmarkStart w:id="23" w:name="_Toc238916869"/>
       <w:r>
         <w:t>VICII — CPU stop applied / VIC-II register write</w:t>
       </w:r>
@@ -5853,7 +5853,7 @@
       <w:pPr>
         <w:pStyle w:val="Ttulo2"/>
       </w:pPr>
-      <w:bookmarkStart w:id="24" w:name="_Toc238734161"/>
+      <w:bookmarkStart w:id="24" w:name="_Toc238916870"/>
       <w:r>
         <w:t>CIA1/CIA2 — Info Cycle</w:t>
       </w:r>
@@ -5886,6 +5886,7 @@
         <w:rPr>
           <w:b/>
         </w:rPr>
+        <w:lastRenderedPageBreak/>
         <w:t>Timing:</w:t>
       </w:r>
       <w:r>
@@ -5907,9 +5908,8 @@
       <w:pPr>
         <w:pStyle w:val="Ttulo2"/>
       </w:pPr>
-      <w:bookmarkStart w:id="25" w:name="_Toc238734162"/>
-      <w:r>
-        <w:lastRenderedPageBreak/>
+      <w:bookmarkStart w:id="25" w:name="_Toc238916871"/>
+      <w:r>
         <w:t>SID — Info Cycle</w:t>
       </w:r>
       <w:bookmarkEnd w:id="25"/>
@@ -5962,7 +5962,7 @@
       <w:pPr>
         <w:pStyle w:val="Ttulo2"/>
       </w:pPr>
-      <w:bookmarkStart w:id="26" w:name="_Toc238734163"/>
+      <w:bookmarkStart w:id="26" w:name="_Toc238916872"/>
       <w:r>
         <w:t>PLA / C64 Memory</w:t>
       </w:r>
@@ -6016,7 +6016,7 @@
       <w:pPr>
         <w:pStyle w:val="Ttulo"/>
       </w:pPr>
-      <w:bookmarkStart w:id="27" w:name="_Toc238734164"/>
+      <w:bookmarkStart w:id="27" w:name="_Toc238916873"/>
       <w:r>
         <w:lastRenderedPageBreak/>
         <w:t>6. Interpretation method</w:t>
@@ -6028,7 +6028,7 @@
         <w:pStyle w:val="Ttulo1"/>
         <w:spacing w:before="280"/>
       </w:pPr>
-      <w:bookmarkStart w:id="28" w:name="_Toc238734165"/>
+      <w:bookmarkStart w:id="28" w:name="_Toc238916874"/>
       <w:r>
         <w:t>6.1 Recommended procedure</w:t>
       </w:r>
@@ -6111,7 +6111,7 @@
         <w:pStyle w:val="Ttulo1"/>
         <w:spacing w:before="280"/>
       </w:pPr>
-      <w:bookmarkStart w:id="29" w:name="_Toc238734166"/>
+      <w:bookmarkStart w:id="29" w:name="_Toc238916875"/>
       <w:r>
         <w:t>6.2 Annotated example</w:t>
       </w:r>
@@ -6235,7 +6235,7 @@
       <w:pPr>
         <w:pStyle w:val="Ttulo"/>
       </w:pPr>
-      <w:bookmarkStart w:id="30" w:name="_Toc238734167"/>
+      <w:bookmarkStart w:id="30" w:name="_Toc238916876"/>
       <w:r>
         <w:lastRenderedPageBreak/>
         <w:t>7. Limitations and maintenance</w:t>
@@ -6247,7 +6247,7 @@
         <w:pStyle w:val="Ttulo1"/>
         <w:spacing w:before="280"/>
       </w:pPr>
-      <w:bookmarkStart w:id="31" w:name="_Toc238734168"/>
+      <w:bookmarkStart w:id="31" w:name="_Toc238916877"/>
       <w:r>
         <w:t>7.1 Specific limitations</w:t>
       </w:r>
@@ -6286,7 +6286,7 @@
         <w:spacing w:after="60"/>
       </w:pPr>
       <w:r>
-        <w:t>For bad lines, BadlineCAccessStartCycle is the latch cycle, BadlineFirstCAccessCycle is the first attempted access, and BadlineBARequestCycle is the first effective BA cycle.</w:t>
+        <w:t>For bad lines, BadlineCAccessStartCycle is the latch cycle, BadlineFirstCAccessCycle is the first attempted access, BadlineCAccessStartedFromIdle preserves the sequencer state at recognition, and BadlineBARequestCycle is the first effective BA cycle.</w:t>
       </w:r>
     </w:p>
     <w:p>
@@ -6318,7 +6318,7 @@
         <w:pStyle w:val="Ttulo1"/>
         <w:spacing w:before="280"/>
       </w:pPr>
-      <w:bookmarkStart w:id="32" w:name="_Toc238734169"/>
+      <w:bookmarkStart w:id="32" w:name="_Toc238916878"/>
       <w:r>
         <w:t>7.2 Maintenance contract</w:t>
       </w:r>
@@ -6376,7 +6376,7 @@
       <w:pPr>
         <w:pStyle w:val="Ttulo"/>
       </w:pPr>
-      <w:bookmarkStart w:id="33" w:name="_Toc238734170"/>
+      <w:bookmarkStart w:id="33" w:name="_Toc238916879"/>
       <w:r>
         <w:lastRenderedPageBreak/>
         <w:t>Appendices</w:t>
@@ -6387,7 +6387,7 @@
       <w:pPr>
         <w:pStyle w:val="Ttulo1"/>
       </w:pPr>
-      <w:bookmarkStart w:id="34" w:name="_Toc238734171"/>
+      <w:bookmarkStart w:id="34" w:name="_Toc238916880"/>
       <w:r>
         <w:t>Appendix A. Provenance and revision</w:t>
       </w:r>
@@ -6409,7 +6409,7 @@
         <w:pStyle w:val="Ttulo1"/>
         <w:spacing w:before="280"/>
       </w:pPr>
-      <w:bookmarkStart w:id="35" w:name="_Toc238734172"/>
+      <w:bookmarkStart w:id="35" w:name="_Toc238916881"/>
       <w:r>
         <w:t>A.1 Watched source files</w:t>
       </w:r>
@@ -7368,7 +7368,7 @@
         <w:pStyle w:val="Ttulo1"/>
         <w:spacing w:before="280"/>
       </w:pPr>
-      <w:bookmarkStart w:id="36" w:name="_Toc238734173"/>
+      <w:bookmarkStart w:id="36" w:name="_Toc238916882"/>
       <w:r>
         <w:t>A.2 Revision history</w:t>
       </w:r>
@@ -7539,7 +7539,7 @@
       <w:pPr>
         <w:pStyle w:val="Ttulo1"/>
       </w:pPr>
-      <w:bookmarkStart w:id="37" w:name="_Toc238734174"/>
+      <w:bookmarkStart w:id="37" w:name="_Toc238916883"/>
       <w:r>
         <w:t>Illustrations</w:t>
       </w:r>
@@ -7579,7 +7579,7 @@
       <w:pPr>
         <w:pStyle w:val="Ttulo1"/>
       </w:pPr>
-      <w:bookmarkStart w:id="38" w:name="_Toc238734175"/>
+      <w:bookmarkStart w:id="38" w:name="_Toc238916884"/>
       <w:r>
         <w:lastRenderedPageBreak/>
         <w:t>Equations</w:t>
@@ -7685,7 +7685,7 @@
         <w:noProof/>
       </w:rPr>
       <w:drawing>
-        <wp:inline distT="0" distB="0" distL="0" distR="0" wp14:anchorId="69AD1317" wp14:editId="2FC253F1">
+        <wp:inline distT="0" distB="0" distL="0" distR="0" wp14:anchorId="297267B2" wp14:editId="2500DCAA">
           <wp:extent cx="576000" cy="459360"/>
           <wp:effectExtent l="0" t="0" r="0" b="0"/>
           <wp:docPr id="1" name="ARGOS framework mark" descr="ARGOS framework mark"/>
@@ -8095,10 +8095,10 @@
         <w:noProof/>
       </w:rPr>
       <w:drawing>
-        <wp:inline distT="0" distB="0" distL="0" distR="0" wp14:anchorId="4D1AFE52" wp14:editId="1F9B6B5B">
+        <wp:inline distT="0" distB="0" distL="0" distR="0" wp14:anchorId="2D1E3B84" wp14:editId="7BDDF94C">
           <wp:extent cx="1512000" cy="1205820"/>
           <wp:effectExtent l="0" t="0" r="0" b="0"/>
-          <wp:docPr id="604317547" name="ARGOS framework mark" descr="ARGOS framework mark"/>
+          <wp:docPr id="1940887432" name="ARGOS framework mark" descr="ARGOS framework mark"/>
           <wp:cNvGraphicFramePr>
             <a:graphicFrameLocks xmlns:a="http://schemas.openxmlformats.org/drawingml/2006/main" noChangeAspect="1"/>
           </wp:cNvGraphicFramePr>
@@ -11071,19 +11071,19 @@
   <w:num w:numId="26" w16cid:durableId="846600881">
     <w:abstractNumId w:val="20"/>
   </w:num>
-  <w:num w:numId="27" w16cid:durableId="683240013">
+  <w:num w:numId="27" w16cid:durableId="1254245012">
     <w:abstractNumId w:val="0"/>
   </w:num>
-  <w:num w:numId="28" w16cid:durableId="994844103">
+  <w:num w:numId="28" w16cid:durableId="999191086">
     <w:abstractNumId w:val="0"/>
   </w:num>
-  <w:num w:numId="29" w16cid:durableId="1757240351">
+  <w:num w:numId="29" w16cid:durableId="1433089091">
     <w:abstractNumId w:val="6"/>
   </w:num>
-  <w:num w:numId="30" w16cid:durableId="537470174">
+  <w:num w:numId="30" w16cid:durableId="1825469395">
     <w:abstractNumId w:val="0"/>
   </w:num>
-  <w:num w:numId="31" w16cid:durableId="1842742907">
+  <w:num w:numId="31" w16cid:durableId="1504784241">
     <w:abstractNumId w:val="0"/>
   </w:num>
 </w:numbering>

</xml_diff>

<commit_message>
Moving drawing pipeline piel by puxel. Improvements in the documentation.
</commit_message>
<xml_diff>
--- a/docs/C64Data/C64_DEBUG_File_Format.docx
+++ b/docs/C64Data/C64_DEBUG_File_Format.docx
@@ -561,7 +561,7 @@
       <w:pPr>
         <w:pStyle w:val="Ttulo1"/>
       </w:pPr>
-      <w:bookmarkStart w:id="0" w:name="_Toc238916846"/>
+      <w:bookmarkStart w:id="0" w:name="_Toc239004118"/>
       <w:r>
         <w:lastRenderedPageBreak/>
         <w:t>Contents</w:t>
@@ -596,7 +596,7 @@
       <w:r>
         <w:fldChar w:fldCharType="separate"/>
       </w:r>
-      <w:hyperlink w:anchor="_Toc238916846" w:history="1">
+      <w:hyperlink w:anchor="_Toc239004118" w:history="1">
         <w:r>
           <w:rPr>
             <w:rStyle w:val="Hipervnculo"/>
@@ -623,7 +623,7 @@
             <w:noProof/>
             <w:webHidden/>
           </w:rPr>
-          <w:instrText xml:space="preserve"> PAGEREF _Toc238916846 \h </w:instrText>
+          <w:instrText xml:space="preserve"> PAGEREF _Toc239004118 \h </w:instrText>
         </w:r>
         <w:r>
           <w:rPr>
@@ -674,7 +674,7 @@
           <w14:ligatures w14:val="standardContextual"/>
         </w:rPr>
       </w:pPr>
-      <w:hyperlink w:anchor="_Toc238916847" w:history="1">
+      <w:hyperlink w:anchor="_Toc239004119" w:history="1">
         <w:r>
           <w:rPr>
             <w:rStyle w:val="Hipervnculo"/>
@@ -701,7 +701,7 @@
             <w:noProof/>
             <w:webHidden/>
           </w:rPr>
-          <w:instrText xml:space="preserve"> PAGEREF _Toc238916847 \h </w:instrText>
+          <w:instrText xml:space="preserve"> PAGEREF _Toc239004119 \h </w:instrText>
         </w:r>
         <w:r>
           <w:rPr>
@@ -752,7 +752,7 @@
           <w14:ligatures w14:val="standardContextual"/>
         </w:rPr>
       </w:pPr>
-      <w:hyperlink w:anchor="_Toc238916848" w:history="1">
+      <w:hyperlink w:anchor="_Toc239004120" w:history="1">
         <w:r>
           <w:rPr>
             <w:rStyle w:val="Hipervnculo"/>
@@ -779,7 +779,7 @@
             <w:noProof/>
             <w:webHidden/>
           </w:rPr>
-          <w:instrText xml:space="preserve"> PAGEREF _Toc238916848 \h </w:instrText>
+          <w:instrText xml:space="preserve"> PAGEREF _Toc239004120 \h </w:instrText>
         </w:r>
         <w:r>
           <w:rPr>
@@ -829,7 +829,7 @@
           <w14:ligatures w14:val="standardContextual"/>
         </w:rPr>
       </w:pPr>
-      <w:hyperlink w:anchor="_Toc238916849" w:history="1">
+      <w:hyperlink w:anchor="_Toc239004121" w:history="1">
         <w:r>
           <w:rPr>
             <w:rStyle w:val="Hipervnculo"/>
@@ -856,7 +856,7 @@
             <w:noProof/>
             <w:webHidden/>
           </w:rPr>
-          <w:instrText xml:space="preserve"> PAGEREF _Toc238916849 \h </w:instrText>
+          <w:instrText xml:space="preserve"> PAGEREF _Toc239004121 \h </w:instrText>
         </w:r>
         <w:r>
           <w:rPr>
@@ -907,7 +907,7 @@
           <w14:ligatures w14:val="standardContextual"/>
         </w:rPr>
       </w:pPr>
-      <w:hyperlink w:anchor="_Toc238916850" w:history="1">
+      <w:hyperlink w:anchor="_Toc239004122" w:history="1">
         <w:r>
           <w:rPr>
             <w:rStyle w:val="Hipervnculo"/>
@@ -934,7 +934,7 @@
             <w:noProof/>
             <w:webHidden/>
           </w:rPr>
-          <w:instrText xml:space="preserve"> PAGEREF _Toc238916850 \h </w:instrText>
+          <w:instrText xml:space="preserve"> PAGEREF _Toc239004122 \h </w:instrText>
         </w:r>
         <w:r>
           <w:rPr>
@@ -984,7 +984,7 @@
           <w14:ligatures w14:val="standardContextual"/>
         </w:rPr>
       </w:pPr>
-      <w:hyperlink w:anchor="_Toc238916851" w:history="1">
+      <w:hyperlink w:anchor="_Toc239004123" w:history="1">
         <w:r>
           <w:rPr>
             <w:rStyle w:val="Hipervnculo"/>
@@ -1011,7 +1011,7 @@
             <w:noProof/>
             <w:webHidden/>
           </w:rPr>
-          <w:instrText xml:space="preserve"> PAGEREF _Toc238916851 \h </w:instrText>
+          <w:instrText xml:space="preserve"> PAGEREF _Toc239004123 \h </w:instrText>
         </w:r>
         <w:r>
           <w:rPr>
@@ -1061,7 +1061,7 @@
           <w14:ligatures w14:val="standardContextual"/>
         </w:rPr>
       </w:pPr>
-      <w:hyperlink w:anchor="_Toc238916852" w:history="1">
+      <w:hyperlink w:anchor="_Toc239004124" w:history="1">
         <w:r>
           <w:rPr>
             <w:rStyle w:val="Hipervnculo"/>
@@ -1088,7 +1088,7 @@
             <w:noProof/>
             <w:webHidden/>
           </w:rPr>
-          <w:instrText xml:space="preserve"> PAGEREF _Toc238916852 \h </w:instrText>
+          <w:instrText xml:space="preserve"> PAGEREF _Toc239004124 \h </w:instrText>
         </w:r>
         <w:r>
           <w:rPr>
@@ -1139,7 +1139,7 @@
           <w14:ligatures w14:val="standardContextual"/>
         </w:rPr>
       </w:pPr>
-      <w:hyperlink w:anchor="_Toc238916853" w:history="1">
+      <w:hyperlink w:anchor="_Toc239004125" w:history="1">
         <w:r>
           <w:rPr>
             <w:rStyle w:val="Hipervnculo"/>
@@ -1166,7 +1166,7 @@
             <w:noProof/>
             <w:webHidden/>
           </w:rPr>
-          <w:instrText xml:space="preserve"> PAGEREF _Toc238916853 \h </w:instrText>
+          <w:instrText xml:space="preserve"> PAGEREF _Toc239004125 \h </w:instrText>
         </w:r>
         <w:r>
           <w:rPr>
@@ -1216,7 +1216,7 @@
           <w14:ligatures w14:val="standardContextual"/>
         </w:rPr>
       </w:pPr>
-      <w:hyperlink w:anchor="_Toc238916854" w:history="1">
+      <w:hyperlink w:anchor="_Toc239004126" w:history="1">
         <w:r>
           <w:rPr>
             <w:rStyle w:val="Hipervnculo"/>
@@ -1243,7 +1243,7 @@
             <w:noProof/>
             <w:webHidden/>
           </w:rPr>
-          <w:instrText xml:space="preserve"> PAGEREF _Toc238916854 \h </w:instrText>
+          <w:instrText xml:space="preserve"> PAGEREF _Toc239004126 \h </w:instrText>
         </w:r>
         <w:r>
           <w:rPr>
@@ -1293,7 +1293,7 @@
           <w14:ligatures w14:val="standardContextual"/>
         </w:rPr>
       </w:pPr>
-      <w:hyperlink w:anchor="_Toc238916855" w:history="1">
+      <w:hyperlink w:anchor="_Toc239004127" w:history="1">
         <w:r>
           <w:rPr>
             <w:rStyle w:val="Hipervnculo"/>
@@ -1320,7 +1320,7 @@
             <w:noProof/>
             <w:webHidden/>
           </w:rPr>
-          <w:instrText xml:space="preserve"> PAGEREF _Toc238916855 \h </w:instrText>
+          <w:instrText xml:space="preserve"> PAGEREF _Toc239004127 \h </w:instrText>
         </w:r>
         <w:r>
           <w:rPr>
@@ -1371,7 +1371,7 @@
           <w14:ligatures w14:val="standardContextual"/>
         </w:rPr>
       </w:pPr>
-      <w:hyperlink w:anchor="_Toc238916856" w:history="1">
+      <w:hyperlink w:anchor="_Toc239004128" w:history="1">
         <w:r>
           <w:rPr>
             <w:rStyle w:val="Hipervnculo"/>
@@ -1398,7 +1398,7 @@
             <w:noProof/>
             <w:webHidden/>
           </w:rPr>
-          <w:instrText xml:space="preserve"> PAGEREF _Toc238916856 \h </w:instrText>
+          <w:instrText xml:space="preserve"> PAGEREF _Toc239004128 \h </w:instrText>
         </w:r>
         <w:r>
           <w:rPr>
@@ -1448,7 +1448,7 @@
           <w14:ligatures w14:val="standardContextual"/>
         </w:rPr>
       </w:pPr>
-      <w:hyperlink w:anchor="_Toc238916857" w:history="1">
+      <w:hyperlink w:anchor="_Toc239004129" w:history="1">
         <w:r>
           <w:rPr>
             <w:rStyle w:val="Hipervnculo"/>
@@ -1475,7 +1475,7 @@
             <w:noProof/>
             <w:webHidden/>
           </w:rPr>
-          <w:instrText xml:space="preserve"> PAGEREF _Toc238916857 \h </w:instrText>
+          <w:instrText xml:space="preserve"> PAGEREF _Toc239004129 \h </w:instrText>
         </w:r>
         <w:r>
           <w:rPr>
@@ -1525,7 +1525,7 @@
           <w14:ligatures w14:val="standardContextual"/>
         </w:rPr>
       </w:pPr>
-      <w:hyperlink w:anchor="_Toc238916858" w:history="1">
+      <w:hyperlink w:anchor="_Toc239004130" w:history="1">
         <w:r>
           <w:rPr>
             <w:rStyle w:val="Hipervnculo"/>
@@ -1552,7 +1552,7 @@
             <w:noProof/>
             <w:webHidden/>
           </w:rPr>
-          <w:instrText xml:space="preserve"> PAGEREF _Toc238916858 \h </w:instrText>
+          <w:instrText xml:space="preserve"> PAGEREF _Toc239004130 \h </w:instrText>
         </w:r>
         <w:r>
           <w:rPr>
@@ -1602,7 +1602,7 @@
           <w14:ligatures w14:val="standardContextual"/>
         </w:rPr>
       </w:pPr>
-      <w:hyperlink w:anchor="_Toc238916859" w:history="1">
+      <w:hyperlink w:anchor="_Toc239004131" w:history="1">
         <w:r>
           <w:rPr>
             <w:rStyle w:val="Hipervnculo"/>
@@ -1629,7 +1629,7 @@
             <w:noProof/>
             <w:webHidden/>
           </w:rPr>
-          <w:instrText xml:space="preserve"> PAGEREF _Toc238916859 \h </w:instrText>
+          <w:instrText xml:space="preserve"> PAGEREF _Toc239004131 \h </w:instrText>
         </w:r>
         <w:r>
           <w:rPr>
@@ -1679,7 +1679,7 @@
           <w14:ligatures w14:val="standardContextual"/>
         </w:rPr>
       </w:pPr>
-      <w:hyperlink w:anchor="_Toc238916860" w:history="1">
+      <w:hyperlink w:anchor="_Toc239004132" w:history="1">
         <w:r>
           <w:rPr>
             <w:rStyle w:val="Hipervnculo"/>
@@ -1706,7 +1706,7 @@
             <w:noProof/>
             <w:webHidden/>
           </w:rPr>
-          <w:instrText xml:space="preserve"> PAGEREF _Toc238916860 \h </w:instrText>
+          <w:instrText xml:space="preserve"> PAGEREF _Toc239004132 \h </w:instrText>
         </w:r>
         <w:r>
           <w:rPr>
@@ -1756,7 +1756,7 @@
           <w14:ligatures w14:val="standardContextual"/>
         </w:rPr>
       </w:pPr>
-      <w:hyperlink w:anchor="_Toc238916861" w:history="1">
+      <w:hyperlink w:anchor="_Toc239004133" w:history="1">
         <w:r>
           <w:rPr>
             <w:rStyle w:val="Hipervnculo"/>
@@ -1783,7 +1783,7 @@
             <w:noProof/>
             <w:webHidden/>
           </w:rPr>
-          <w:instrText xml:space="preserve"> PAGEREF _Toc238916861 \h </w:instrText>
+          <w:instrText xml:space="preserve"> PAGEREF _Toc239004133 \h </w:instrText>
         </w:r>
         <w:r>
           <w:rPr>
@@ -1833,7 +1833,7 @@
           <w14:ligatures w14:val="standardContextual"/>
         </w:rPr>
       </w:pPr>
-      <w:hyperlink w:anchor="_Toc238916862" w:history="1">
+      <w:hyperlink w:anchor="_Toc239004134" w:history="1">
         <w:r>
           <w:rPr>
             <w:rStyle w:val="Hipervnculo"/>
@@ -1860,7 +1860,7 @@
             <w:noProof/>
             <w:webHidden/>
           </w:rPr>
-          <w:instrText xml:space="preserve"> PAGEREF _Toc238916862 \h </w:instrText>
+          <w:instrText xml:space="preserve"> PAGEREF _Toc239004134 \h </w:instrText>
         </w:r>
         <w:r>
           <w:rPr>
@@ -1911,7 +1911,7 @@
           <w14:ligatures w14:val="standardContextual"/>
         </w:rPr>
       </w:pPr>
-      <w:hyperlink w:anchor="_Toc238916863" w:history="1">
+      <w:hyperlink w:anchor="_Toc239004135" w:history="1">
         <w:r>
           <w:rPr>
             <w:rStyle w:val="Hipervnculo"/>
@@ -1938,7 +1938,7 @@
             <w:noProof/>
             <w:webHidden/>
           </w:rPr>
-          <w:instrText xml:space="preserve"> PAGEREF _Toc238916863 \h </w:instrText>
+          <w:instrText xml:space="preserve"> PAGEREF _Toc239004135 \h </w:instrText>
         </w:r>
         <w:r>
           <w:rPr>
@@ -1988,7 +1988,7 @@
           <w14:ligatures w14:val="standardContextual"/>
         </w:rPr>
       </w:pPr>
-      <w:hyperlink w:anchor="_Toc238916864" w:history="1">
+      <w:hyperlink w:anchor="_Toc239004136" w:history="1">
         <w:r>
           <w:rPr>
             <w:rStyle w:val="Hipervnculo"/>
@@ -2015,7 +2015,7 @@
             <w:noProof/>
             <w:webHidden/>
           </w:rPr>
-          <w:instrText xml:space="preserve"> PAGEREF _Toc238916864 \h </w:instrText>
+          <w:instrText xml:space="preserve"> PAGEREF _Toc239004136 \h </w:instrText>
         </w:r>
         <w:r>
           <w:rPr>
@@ -2065,7 +2065,7 @@
           <w14:ligatures w14:val="standardContextual"/>
         </w:rPr>
       </w:pPr>
-      <w:hyperlink w:anchor="_Toc238916865" w:history="1">
+      <w:hyperlink w:anchor="_Toc239004137" w:history="1">
         <w:r>
           <w:rPr>
             <w:rStyle w:val="Hipervnculo"/>
@@ -2092,7 +2092,7 @@
             <w:noProof/>
             <w:webHidden/>
           </w:rPr>
-          <w:instrText xml:space="preserve"> PAGEREF _Toc238916865 \h </w:instrText>
+          <w:instrText xml:space="preserve"> PAGEREF _Toc239004137 \h </w:instrText>
         </w:r>
         <w:r>
           <w:rPr>
@@ -2140,7 +2140,7 @@
           <w14:ligatures w14:val="standardContextual"/>
         </w:rPr>
       </w:pPr>
-      <w:hyperlink w:anchor="_Toc238916866" w:history="1">
+      <w:hyperlink w:anchor="_Toc239004138" w:history="1">
         <w:r>
           <w:rPr>
             <w:rStyle w:val="Hipervnculo"/>
@@ -2167,7 +2167,7 @@
             <w:noProof/>
             <w:webHidden/>
           </w:rPr>
-          <w:instrText xml:space="preserve"> PAGEREF _Toc238916866 \h </w:instrText>
+          <w:instrText xml:space="preserve"> PAGEREF _Toc239004138 \h </w:instrText>
         </w:r>
         <w:r>
           <w:rPr>
@@ -2215,7 +2215,7 @@
           <w14:ligatures w14:val="standardContextual"/>
         </w:rPr>
       </w:pPr>
-      <w:hyperlink w:anchor="_Toc238916867" w:history="1">
+      <w:hyperlink w:anchor="_Toc239004139" w:history="1">
         <w:r>
           <w:rPr>
             <w:rStyle w:val="Hipervnculo"/>
@@ -2242,7 +2242,7 @@
             <w:noProof/>
             <w:webHidden/>
           </w:rPr>
-          <w:instrText xml:space="preserve"> PAGEREF _Toc238916867 \h </w:instrText>
+          <w:instrText xml:space="preserve"> PAGEREF _Toc239004139 \h </w:instrText>
         </w:r>
         <w:r>
           <w:rPr>
@@ -2290,7 +2290,7 @@
           <w14:ligatures w14:val="standardContextual"/>
         </w:rPr>
       </w:pPr>
-      <w:hyperlink w:anchor="_Toc238916868" w:history="1">
+      <w:hyperlink w:anchor="_Toc239004140" w:history="1">
         <w:r>
           <w:rPr>
             <w:rStyle w:val="Hipervnculo"/>
@@ -2317,7 +2317,7 @@
             <w:noProof/>
             <w:webHidden/>
           </w:rPr>
-          <w:instrText xml:space="preserve"> PAGEREF _Toc238916868 \h </w:instrText>
+          <w:instrText xml:space="preserve"> PAGEREF _Toc239004140 \h </w:instrText>
         </w:r>
         <w:r>
           <w:rPr>
@@ -2365,7 +2365,7 @@
           <w14:ligatures w14:val="standardContextual"/>
         </w:rPr>
       </w:pPr>
-      <w:hyperlink w:anchor="_Toc238916869" w:history="1">
+      <w:hyperlink w:anchor="_Toc239004141" w:history="1">
         <w:r>
           <w:rPr>
             <w:rStyle w:val="Hipervnculo"/>
@@ -2392,7 +2392,7 @@
             <w:noProof/>
             <w:webHidden/>
           </w:rPr>
-          <w:instrText xml:space="preserve"> PAGEREF _Toc238916869 \h </w:instrText>
+          <w:instrText xml:space="preserve"> PAGEREF _Toc239004141 \h </w:instrText>
         </w:r>
         <w:r>
           <w:rPr>
@@ -2440,7 +2440,7 @@
           <w14:ligatures w14:val="standardContextual"/>
         </w:rPr>
       </w:pPr>
-      <w:hyperlink w:anchor="_Toc238916870" w:history="1">
+      <w:hyperlink w:anchor="_Toc239004142" w:history="1">
         <w:r>
           <w:rPr>
             <w:rStyle w:val="Hipervnculo"/>
@@ -2467,7 +2467,7 @@
             <w:noProof/>
             <w:webHidden/>
           </w:rPr>
-          <w:instrText xml:space="preserve"> PAGEREF _Toc238916870 \h </w:instrText>
+          <w:instrText xml:space="preserve"> PAGEREF _Toc239004142 \h </w:instrText>
         </w:r>
         <w:r>
           <w:rPr>
@@ -2487,7 +2487,7 @@
             <w:noProof/>
             <w:webHidden/>
           </w:rPr>
-          <w:t>10</w:t>
+          <w:t>11</w:t>
         </w:r>
         <w:r>
           <w:rPr>
@@ -2515,7 +2515,7 @@
           <w14:ligatures w14:val="standardContextual"/>
         </w:rPr>
       </w:pPr>
-      <w:hyperlink w:anchor="_Toc238916871" w:history="1">
+      <w:hyperlink w:anchor="_Toc239004143" w:history="1">
         <w:r>
           <w:rPr>
             <w:rStyle w:val="Hipervnculo"/>
@@ -2542,7 +2542,7 @@
             <w:noProof/>
             <w:webHidden/>
           </w:rPr>
-          <w:instrText xml:space="preserve"> PAGEREF _Toc238916871 \h </w:instrText>
+          <w:instrText xml:space="preserve"> PAGEREF _Toc239004143 \h </w:instrText>
         </w:r>
         <w:r>
           <w:rPr>
@@ -2590,7 +2590,7 @@
           <w14:ligatures w14:val="standardContextual"/>
         </w:rPr>
       </w:pPr>
-      <w:hyperlink w:anchor="_Toc238916872" w:history="1">
+      <w:hyperlink w:anchor="_Toc239004144" w:history="1">
         <w:r>
           <w:rPr>
             <w:rStyle w:val="Hipervnculo"/>
@@ -2617,7 +2617,7 @@
             <w:noProof/>
             <w:webHidden/>
           </w:rPr>
-          <w:instrText xml:space="preserve"> PAGEREF _Toc238916872 \h </w:instrText>
+          <w:instrText xml:space="preserve"> PAGEREF _Toc239004144 \h </w:instrText>
         </w:r>
         <w:r>
           <w:rPr>
@@ -2668,7 +2668,7 @@
           <w14:ligatures w14:val="standardContextual"/>
         </w:rPr>
       </w:pPr>
-      <w:hyperlink w:anchor="_Toc238916873" w:history="1">
+      <w:hyperlink w:anchor="_Toc239004145" w:history="1">
         <w:r>
           <w:rPr>
             <w:rStyle w:val="Hipervnculo"/>
@@ -2695,7 +2695,7 @@
             <w:noProof/>
             <w:webHidden/>
           </w:rPr>
-          <w:instrText xml:space="preserve"> PAGEREF _Toc238916873 \h </w:instrText>
+          <w:instrText xml:space="preserve"> PAGEREF _Toc239004145 \h </w:instrText>
         </w:r>
         <w:r>
           <w:rPr>
@@ -2745,7 +2745,7 @@
           <w14:ligatures w14:val="standardContextual"/>
         </w:rPr>
       </w:pPr>
-      <w:hyperlink w:anchor="_Toc238916874" w:history="1">
+      <w:hyperlink w:anchor="_Toc239004146" w:history="1">
         <w:r>
           <w:rPr>
             <w:rStyle w:val="Hipervnculo"/>
@@ -2772,7 +2772,7 @@
             <w:noProof/>
             <w:webHidden/>
           </w:rPr>
-          <w:instrText xml:space="preserve"> PAGEREF _Toc238916874 \h </w:instrText>
+          <w:instrText xml:space="preserve"> PAGEREF _Toc239004146 \h </w:instrText>
         </w:r>
         <w:r>
           <w:rPr>
@@ -2822,7 +2822,7 @@
           <w14:ligatures w14:val="standardContextual"/>
         </w:rPr>
       </w:pPr>
-      <w:hyperlink w:anchor="_Toc238916875" w:history="1">
+      <w:hyperlink w:anchor="_Toc239004147" w:history="1">
         <w:r>
           <w:rPr>
             <w:rStyle w:val="Hipervnculo"/>
@@ -2849,7 +2849,7 @@
             <w:noProof/>
             <w:webHidden/>
           </w:rPr>
-          <w:instrText xml:space="preserve"> PAGEREF _Toc238916875 \h </w:instrText>
+          <w:instrText xml:space="preserve"> PAGEREF _Toc239004147 \h </w:instrText>
         </w:r>
         <w:r>
           <w:rPr>
@@ -2900,7 +2900,7 @@
           <w14:ligatures w14:val="standardContextual"/>
         </w:rPr>
       </w:pPr>
-      <w:hyperlink w:anchor="_Toc238916876" w:history="1">
+      <w:hyperlink w:anchor="_Toc239004148" w:history="1">
         <w:r>
           <w:rPr>
             <w:rStyle w:val="Hipervnculo"/>
@@ -2927,7 +2927,7 @@
             <w:noProof/>
             <w:webHidden/>
           </w:rPr>
-          <w:instrText xml:space="preserve"> PAGEREF _Toc238916876 \h </w:instrText>
+          <w:instrText xml:space="preserve"> PAGEREF _Toc239004148 \h </w:instrText>
         </w:r>
         <w:r>
           <w:rPr>
@@ -2977,7 +2977,7 @@
           <w14:ligatures w14:val="standardContextual"/>
         </w:rPr>
       </w:pPr>
-      <w:hyperlink w:anchor="_Toc238916877" w:history="1">
+      <w:hyperlink w:anchor="_Toc239004149" w:history="1">
         <w:r>
           <w:rPr>
             <w:rStyle w:val="Hipervnculo"/>
@@ -3004,7 +3004,7 @@
             <w:noProof/>
             <w:webHidden/>
           </w:rPr>
-          <w:instrText xml:space="preserve"> PAGEREF _Toc238916877 \h </w:instrText>
+          <w:instrText xml:space="preserve"> PAGEREF _Toc239004149 \h </w:instrText>
         </w:r>
         <w:r>
           <w:rPr>
@@ -3054,7 +3054,7 @@
           <w14:ligatures w14:val="standardContextual"/>
         </w:rPr>
       </w:pPr>
-      <w:hyperlink w:anchor="_Toc238916878" w:history="1">
+      <w:hyperlink w:anchor="_Toc239004150" w:history="1">
         <w:r>
           <w:rPr>
             <w:rStyle w:val="Hipervnculo"/>
@@ -3081,7 +3081,7 @@
             <w:noProof/>
             <w:webHidden/>
           </w:rPr>
-          <w:instrText xml:space="preserve"> PAGEREF _Toc238916878 \h </w:instrText>
+          <w:instrText xml:space="preserve"> PAGEREF _Toc239004150 \h </w:instrText>
         </w:r>
         <w:r>
           <w:rPr>
@@ -3132,7 +3132,7 @@
           <w14:ligatures w14:val="standardContextual"/>
         </w:rPr>
       </w:pPr>
-      <w:hyperlink w:anchor="_Toc238916879" w:history="1">
+      <w:hyperlink w:anchor="_Toc239004151" w:history="1">
         <w:r>
           <w:rPr>
             <w:rStyle w:val="Hipervnculo"/>
@@ -3159,7 +3159,7 @@
             <w:noProof/>
             <w:webHidden/>
           </w:rPr>
-          <w:instrText xml:space="preserve"> PAGEREF _Toc238916879 \h </w:instrText>
+          <w:instrText xml:space="preserve"> PAGEREF _Toc239004151 \h </w:instrText>
         </w:r>
         <w:r>
           <w:rPr>
@@ -3209,7 +3209,7 @@
           <w14:ligatures w14:val="standardContextual"/>
         </w:rPr>
       </w:pPr>
-      <w:hyperlink w:anchor="_Toc238916880" w:history="1">
+      <w:hyperlink w:anchor="_Toc239004152" w:history="1">
         <w:r>
           <w:rPr>
             <w:rStyle w:val="Hipervnculo"/>
@@ -3236,7 +3236,7 @@
             <w:noProof/>
             <w:webHidden/>
           </w:rPr>
-          <w:instrText xml:space="preserve"> PAGEREF _Toc238916880 \h </w:instrText>
+          <w:instrText xml:space="preserve"> PAGEREF _Toc239004152 \h </w:instrText>
         </w:r>
         <w:r>
           <w:rPr>
@@ -3286,7 +3286,7 @@
           <w14:ligatures w14:val="standardContextual"/>
         </w:rPr>
       </w:pPr>
-      <w:hyperlink w:anchor="_Toc238916881" w:history="1">
+      <w:hyperlink w:anchor="_Toc239004153" w:history="1">
         <w:r>
           <w:rPr>
             <w:rStyle w:val="Hipervnculo"/>
@@ -3313,7 +3313,7 @@
             <w:noProof/>
             <w:webHidden/>
           </w:rPr>
-          <w:instrText xml:space="preserve"> PAGEREF _Toc238916881 \h </w:instrText>
+          <w:instrText xml:space="preserve"> PAGEREF _Toc239004153 \h </w:instrText>
         </w:r>
         <w:r>
           <w:rPr>
@@ -3363,7 +3363,7 @@
           <w14:ligatures w14:val="standardContextual"/>
         </w:rPr>
       </w:pPr>
-      <w:hyperlink w:anchor="_Toc238916882" w:history="1">
+      <w:hyperlink w:anchor="_Toc239004154" w:history="1">
         <w:r>
           <w:rPr>
             <w:rStyle w:val="Hipervnculo"/>
@@ -3390,7 +3390,7 @@
             <w:noProof/>
             <w:webHidden/>
           </w:rPr>
-          <w:instrText xml:space="preserve"> PAGEREF _Toc238916882 \h </w:instrText>
+          <w:instrText xml:space="preserve"> PAGEREF _Toc239004154 \h </w:instrText>
         </w:r>
         <w:r>
           <w:rPr>
@@ -3440,7 +3440,7 @@
           <w14:ligatures w14:val="standardContextual"/>
         </w:rPr>
       </w:pPr>
-      <w:hyperlink w:anchor="_Toc238916883" w:history="1">
+      <w:hyperlink w:anchor="_Toc239004155" w:history="1">
         <w:r>
           <w:rPr>
             <w:rStyle w:val="Hipervnculo"/>
@@ -3467,7 +3467,7 @@
             <w:noProof/>
             <w:webHidden/>
           </w:rPr>
-          <w:instrText xml:space="preserve"> PAGEREF _Toc238916883 \h </w:instrText>
+          <w:instrText xml:space="preserve"> PAGEREF _Toc239004155 \h </w:instrText>
         </w:r>
         <w:r>
           <w:rPr>
@@ -3517,7 +3517,7 @@
           <w14:ligatures w14:val="standardContextual"/>
         </w:rPr>
       </w:pPr>
-      <w:hyperlink w:anchor="_Toc238916884" w:history="1">
+      <w:hyperlink w:anchor="_Toc239004156" w:history="1">
         <w:r>
           <w:rPr>
             <w:rStyle w:val="Hipervnculo"/>
@@ -3544,7 +3544,7 @@
             <w:noProof/>
             <w:webHidden/>
           </w:rPr>
-          <w:instrText xml:space="preserve"> PAGEREF _Toc238916884 \h </w:instrText>
+          <w:instrText xml:space="preserve"> PAGEREF _Toc239004156 \h </w:instrText>
         </w:r>
         <w:r>
           <w:rPr>
@@ -3589,7 +3589,7 @@
       <w:pPr>
         <w:pStyle w:val="Ttulo"/>
       </w:pPr>
-      <w:bookmarkStart w:id="1" w:name="_Toc238916847"/>
+      <w:bookmarkStart w:id="1" w:name="_Toc239004119"/>
       <w:r>
         <w:lastRenderedPageBreak/>
         <w:t>Foreword</w:t>
@@ -3605,7 +3605,7 @@
       <w:pPr>
         <w:pStyle w:val="Ttulo"/>
       </w:pPr>
-      <w:bookmarkStart w:id="2" w:name="_Toc238916848"/>
+      <w:bookmarkStart w:id="2" w:name="_Toc239004120"/>
       <w:r>
         <w:lastRenderedPageBreak/>
         <w:t>1. Purpose, scope, and models</w:t>
@@ -3622,7 +3622,7 @@
         <w:pStyle w:val="Ttulo1"/>
         <w:spacing w:before="280"/>
       </w:pPr>
-      <w:bookmarkStart w:id="3" w:name="_Toc238916849"/>
+      <w:bookmarkStart w:id="3" w:name="_Toc239004121"/>
       <w:r>
         <w:t>1.1 Scope of this guide</w:t>
       </w:r>
@@ -3647,7 +3647,7 @@
       <w:pPr>
         <w:pStyle w:val="Ttulo"/>
       </w:pPr>
-      <w:bookmarkStart w:id="4" w:name="_Toc238916850"/>
+      <w:bookmarkStart w:id="4" w:name="_Toc239004122"/>
       <w:r>
         <w:lastRenderedPageBreak/>
         <w:t>2. Activation and producer selection</w:t>
@@ -3659,7 +3659,7 @@
         <w:pStyle w:val="Ttulo1"/>
         <w:spacing w:before="280"/>
       </w:pPr>
-      <w:bookmarkStart w:id="5" w:name="_Toc238916851"/>
+      <w:bookmarkStart w:id="5" w:name="_Toc239004123"/>
       <w:r>
         <w:t>2.1 Console command</w:t>
       </w:r>
@@ -4117,7 +4117,7 @@
         <w:pStyle w:val="Ttulo1"/>
         <w:spacing w:before="280"/>
       </w:pPr>
-      <w:bookmarkStart w:id="6" w:name="_Toc238916852"/>
+      <w:bookmarkStart w:id="6" w:name="_Toc239004124"/>
       <w:r>
         <w:t>2.2 Conditions and special paths</w:t>
       </w:r>
@@ -4175,7 +4175,7 @@
       <w:pPr>
         <w:pStyle w:val="Ttulo"/>
       </w:pPr>
-      <w:bookmarkStart w:id="7" w:name="_Toc238916853"/>
+      <w:bookmarkStart w:id="7" w:name="_Toc239004125"/>
       <w:r>
         <w:lastRenderedPageBreak/>
         <w:t>3. Common file structure</w:t>
@@ -4187,7 +4187,7 @@
         <w:pStyle w:val="Ttulo1"/>
         <w:spacing w:before="280"/>
       </w:pPr>
-      <w:bookmarkStart w:id="8" w:name="_Toc238916854"/>
+      <w:bookmarkStart w:id="8" w:name="_Toc239004126"/>
       <w:r>
         <w:t>3.1 Physical hierarchy</w:t>
       </w:r>
@@ -4508,7 +4508,7 @@
         <w:pStyle w:val="Ttulo1"/>
         <w:spacing w:before="280"/>
       </w:pPr>
-      <w:bookmarkStart w:id="9" w:name="_Toc238916855"/>
+      <w:bookmarkStart w:id="9" w:name="_Toc239004127"/>
       <w:r>
         <w:t>3.2 Timing rules</w:t>
       </w:r>
@@ -4590,7 +4590,7 @@
       <w:pPr>
         <w:pStyle w:val="Ttulo"/>
       </w:pPr>
-      <w:bookmarkStart w:id="10" w:name="_Toc238916856"/>
+      <w:bookmarkStart w:id="10" w:name="_Toc239004128"/>
       <w:r>
         <w:lastRenderedPageBreak/>
         <w:t>4. Common framework records</w:t>
@@ -4602,7 +4602,7 @@
         <w:pStyle w:val="Ttulo1"/>
         <w:spacing w:before="280"/>
       </w:pPr>
-      <w:bookmarkStart w:id="11" w:name="_Toc238916857"/>
+      <w:bookmarkStart w:id="11" w:name="_Toc239004129"/>
       <w:r>
         <w:t>CPU — Info Cycle</w:t>
       </w:r>
@@ -4668,7 +4668,7 @@
         <w:pStyle w:val="Ttulo1"/>
         <w:spacing w:before="280"/>
       </w:pPr>
-      <w:bookmarkStart w:id="12" w:name="_Toc238916858"/>
+      <w:bookmarkStart w:id="12" w:name="_Toc239004130"/>
       <w:r>
         <w:t>CPU — Transaction about to execute</w:t>
       </w:r>
@@ -4734,7 +4734,7 @@
         <w:pStyle w:val="Ttulo1"/>
         <w:spacing w:before="280"/>
       </w:pPr>
-      <w:bookmarkStart w:id="13" w:name="_Toc238916859"/>
+      <w:bookmarkStart w:id="13" w:name="_Toc239004131"/>
       <w:r>
         <w:t>CPU — Executed instruction</w:t>
       </w:r>
@@ -4800,7 +4800,7 @@
         <w:pStyle w:val="Ttulo1"/>
         <w:spacing w:before="280"/>
       </w:pPr>
-      <w:bookmarkStart w:id="14" w:name="_Toc238916860"/>
+      <w:bookmarkStart w:id="14" w:name="_Toc239004132"/>
       <w:r>
         <w:t>CPU — Stop</w:t>
       </w:r>
@@ -4867,7 +4867,7 @@
         <w:pStyle w:val="Ttulo1"/>
         <w:spacing w:before="280"/>
       </w:pPr>
-      <w:bookmarkStart w:id="15" w:name="_Toc238916861"/>
+      <w:bookmarkStart w:id="15" w:name="_Toc239004133"/>
       <w:r>
         <w:t>CPU — Interrupts</w:t>
       </w:r>
@@ -4933,7 +4933,7 @@
         <w:pStyle w:val="Ttulo1"/>
         <w:spacing w:before="280"/>
       </w:pPr>
-      <w:bookmarkStart w:id="16" w:name="_Toc238916862"/>
+      <w:bookmarkStart w:id="16" w:name="_Toc239004134"/>
       <w:r>
         <w:t>Memory — Applied Set</w:t>
       </w:r>
@@ -4998,7 +4998,7 @@
       <w:pPr>
         <w:pStyle w:val="Ttulo"/>
       </w:pPr>
-      <w:bookmarkStart w:id="17" w:name="_Toc238916863"/>
+      <w:bookmarkStart w:id="17" w:name="_Toc239004135"/>
       <w:r>
         <w:lastRenderedPageBreak/>
         <w:t>5. Machine-specific components</w:t>
@@ -5010,7 +5010,7 @@
         <w:pStyle w:val="Ttulo1"/>
         <w:spacing w:before="280"/>
       </w:pPr>
-      <w:bookmarkStart w:id="18" w:name="_Toc238916864"/>
+      <w:bookmarkStart w:id="18" w:name="_Toc239004136"/>
       <w:r>
         <w:t>5.1 Selectable inventory</w:t>
       </w:r>
@@ -5617,7 +5617,7 @@
         <w:pStyle w:val="Ttulo1"/>
         <w:spacing w:before="280"/>
       </w:pPr>
-      <w:bookmarkStart w:id="19" w:name="_Toc238916865"/>
+      <w:bookmarkStart w:id="19" w:name="_Toc239004137"/>
       <w:r>
         <w:t>5.2 Record catalog</w:t>
       </w:r>
@@ -5627,7 +5627,7 @@
       <w:pPr>
         <w:pStyle w:val="Ttulo2"/>
       </w:pPr>
-      <w:bookmarkStart w:id="20" w:name="_Toc238916866"/>
+      <w:bookmarkStart w:id="20" w:name="_Toc239004138"/>
       <w:r>
         <w:t>VICII — Info Cycle</w:t>
       </w:r>
@@ -5687,7 +5687,7 @@
       <w:pPr>
         <w:pStyle w:val="Ttulo2"/>
       </w:pPr>
-      <w:bookmarkStart w:id="21" w:name="_Toc238916867"/>
+      <w:bookmarkStart w:id="21" w:name="_Toc239004139"/>
       <w:r>
         <w:lastRenderedPageBreak/>
         <w:t>VICII — Video Matrix / graphics pipeline / pixel composition</w:t>
@@ -5713,7 +5713,10 @@
         <w:t>Fields:</w:t>
       </w:r>
       <w:r>
-        <w:t xml:space="preserve"> Reading Video Matrix &amp; Color RAM: Screen, Color, VLMI, VC, and Invalid. Reading Graphics: Data, GAccessIndex, VLMI, VC, RC, and Idle. Drawing pixels: Raster, FirstPixel, LastPixel, XScroll, GraphicPixel, FirstByte, and LastByte. FirstPixel/LastPixel are inclusive positions inside the current eight-pixel slice; GraphicPixel is the first source pixel of that span; FirstByte/LastByte are OUT when the complete span lies beyond graphics pixels 0..319. Drawing sprite: sprite number and latched X,Y position.</w:t>
+        <w:t xml:space="preserve"> Reading Video Matrix &amp; Color RAM: Screen, Color, VLMI, VC, and Invalid. Reading Graphics: Data, GAccessIndex, VLMI, VC, RC, and Idle. Drawing pixels: Raster, FirstPixel, LastPixel, XScroll, OutputPixel, ShiftActive, ShiftPixel, PendingReload, StagedAccess, and ReloadInSpan. FirstPixel/LastPixel are inclusive positions inside the current eight-pixel slice. OutputPixel is the first screen-relative graphics position of the span before border masking. ShiftActive and ShiftPixel describe the persistent output b</w:t>
+      </w:r>
+      <w:r>
+        <w:t>yte before the span consumes it. PendingReload identifies the preceding cycle's input latch; StagedAccess identifies the g-access captured in the current cycle but not yet available to XSCROLL. ReloadInSpan indicates that the span reaches the XSCROLL reload comparator while pending data is available. Drawing sprite: sprite number and latched X,Y position.</w:t>
       </w:r>
     </w:p>
     <w:p>
@@ -5724,10 +5727,10 @@
         <w:t>Timing:</w:t>
       </w:r>
       <w:r>
-        <w:t xml:space="preserve"> c-access runs in phi2 of cycles 15..54 and prepares the matrix/color entry for the following g-access. g-access runs in phi1 of cycles 16..55, is logged before VC/VLMI/GAccessIndex advance, and therefore precedes c-access when both occur in one recovered CPU cycle. Drawing pixels is appended during final composition. A steady slice emits one span 0..7; a visual CPU register write emits span 0..3 with the state captured before the write and span 4..7 with the state captured after it. Drawing sprite is emitt</w:t>
-      </w:r>
-      <w:r>
-        <w:t>ed when the horizontal comparator latches: pixels 0..3 are compared before the CPU write and pixels 4..7 after it.</w:t>
+        <w:t xml:space="preserve"> c-access runs in phi2 of cycles 15..54 and prepares the matrix/color entry for the following g-access. g-access runs in phi1 of cycles 16..55, stages its graphics/matrix/color triplet, is logged before VC/VLMI/GAccessIndex advance, and therefore precedes c-access when both occur in one recovered CPU cycle. After the complete current output slice has been consumed, the staged triplet replaces the pending input latch for the following cycle; consequently g-accesses 16..55 feed output slices 17..56. Drawing p</w:t>
+      </w:r>
+      <w:r>
+        <w:t>ixels is appended before its span advances the persistent shift register. A steady slice emits one span 0..7; a visual CPU register write emits span 0..3 with the state captured before the write and span 4..7 with the state captured after it. Drawing sprite is emitted when the horizontal comparator latches: pixels 0..3 are compared before the CPU write and pixels 4..7 after it.</w:t>
       </w:r>
     </w:p>
     <w:p>
@@ -5738,14 +5741,17 @@
         <w:t>Events:</w:t>
       </w:r>
       <w:r>
-        <w:t xml:space="preserve"> Cycle 15 contains only the first c-access; cycles 16..54 log g-access and then c-access; cycle 55 contains only the final g-access. Invalid=1 identifies a DMA-delay/FLI c-access that supplied fallback bus data. Each pixel record maps its output span to the inclusive source-byte interval selected using that span's XSCROLL and clipping to graphics pixels 0..319. Once a sprite X position is latched, a later write cannot reposition its running sequencer.</w:t>
+        <w:t xml:space="preserve"> Cycle 15 contains only the first c-access; cycles 16..54 log g-access and then c-access; cycle 55 contains only the final g-access. Invalid=1 identifies a DMA-delay/FLI c-access that supplied fallback bus data. XSCROLL selects the pixel that transfers the single pending latch from the preceding cycle to the active eight-pixel shift data; the active byte can therefore continue into the following VIC-II cycle. A pending byte whose comparator is missed is replaced when the current cycle's staged g-access comm</w:t>
+      </w:r>
+      <w:r>
+        <w:t>its after drawing. The shift stream advances even where graphics are outside pixels 0..319 or later hidden by the border. Once a sprite X position is latched, a later write cannot reposition its running sequencer.</w:t>
       </w:r>
     </w:p>
     <w:p>
       <w:pPr>
         <w:pStyle w:val="Ttulo2"/>
       </w:pPr>
-      <w:bookmarkStart w:id="22" w:name="_Toc238916868"/>
+      <w:bookmarkStart w:id="22" w:name="_Toc239004140"/>
       <w:r>
         <w:t>VICII — CPU transaction prediction</w:t>
       </w:r>
@@ -5799,7 +5805,7 @@
       <w:pPr>
         <w:pStyle w:val="Ttulo2"/>
       </w:pPr>
-      <w:bookmarkStart w:id="23" w:name="_Toc238916869"/>
+      <w:bookmarkStart w:id="23" w:name="_Toc239004141"/>
       <w:r>
         <w:t>VICII — CPU stop applied / VIC-II register write</w:t>
       </w:r>
@@ -5843,6 +5849,7 @@
         <w:rPr>
           <w:b/>
         </w:rPr>
+        <w:lastRenderedPageBreak/>
         <w:t>Events:</w:t>
       </w:r>
       <w:r>
@@ -5853,7 +5860,7 @@
       <w:pPr>
         <w:pStyle w:val="Ttulo2"/>
       </w:pPr>
-      <w:bookmarkStart w:id="24" w:name="_Toc238916870"/>
+      <w:bookmarkStart w:id="24" w:name="_Toc239004142"/>
       <w:r>
         <w:t>CIA1/CIA2 — Info Cycle</w:t>
       </w:r>
@@ -5886,7 +5893,6 @@
         <w:rPr>
           <w:b/>
         </w:rPr>
-        <w:lastRenderedPageBreak/>
         <w:t>Timing:</w:t>
       </w:r>
       <w:r>
@@ -5908,7 +5914,7 @@
       <w:pPr>
         <w:pStyle w:val="Ttulo2"/>
       </w:pPr>
-      <w:bookmarkStart w:id="25" w:name="_Toc238916871"/>
+      <w:bookmarkStart w:id="25" w:name="_Toc239004143"/>
       <w:r>
         <w:t>SID — Info Cycle</w:t>
       </w:r>
@@ -5962,7 +5968,7 @@
       <w:pPr>
         <w:pStyle w:val="Ttulo2"/>
       </w:pPr>
-      <w:bookmarkStart w:id="26" w:name="_Toc238916872"/>
+      <w:bookmarkStart w:id="26" w:name="_Toc239004144"/>
       <w:r>
         <w:t>PLA / C64 Memory</w:t>
       </w:r>
@@ -6016,7 +6022,7 @@
       <w:pPr>
         <w:pStyle w:val="Ttulo"/>
       </w:pPr>
-      <w:bookmarkStart w:id="27" w:name="_Toc238916873"/>
+      <w:bookmarkStart w:id="27" w:name="_Toc239004145"/>
       <w:r>
         <w:lastRenderedPageBreak/>
         <w:t>6. Interpretation method</w:t>
@@ -6028,7 +6034,7 @@
         <w:pStyle w:val="Ttulo1"/>
         <w:spacing w:before="280"/>
       </w:pPr>
-      <w:bookmarkStart w:id="28" w:name="_Toc238916874"/>
+      <w:bookmarkStart w:id="28" w:name="_Toc239004146"/>
       <w:r>
         <w:t>6.1 Recommended procedure</w:t>
       </w:r>
@@ -6111,7 +6117,7 @@
         <w:pStyle w:val="Ttulo1"/>
         <w:spacing w:before="280"/>
       </w:pPr>
-      <w:bookmarkStart w:id="29" w:name="_Toc238916875"/>
+      <w:bookmarkStart w:id="29" w:name="_Toc239004147"/>
       <w:r>
         <w:t>6.2 Annotated example</w:t>
       </w:r>
@@ -6161,6 +6167,12 @@
           <w:sz w:val="15"/>
         </w:rPr>
         <w:br/>
+      </w:r>
+      <w:r>
+        <w:rPr>
+          <w:rFonts w:ascii="Consolas" w:hAnsi="Consolas"/>
+          <w:sz w:val="15"/>
+        </w:rPr>
         <w:t>VICII   171065245   CPU transaction prediction</w:t>
       </w:r>
       <w:r>
@@ -6193,12 +6205,6 @@
           <w:sz w:val="15"/>
         </w:rPr>
         <w:br/>
-      </w:r>
-      <w:r>
-        <w:rPr>
-          <w:rFonts w:ascii="Consolas" w:hAnsi="Consolas"/>
-          <w:sz w:val="15"/>
-        </w:rPr>
         <w:t xml:space="preserve">                    Raster position     :Column=28(128),Row=297(297),17</w:t>
       </w:r>
       <w:r>
@@ -6215,7 +6221,13 @@
           <w:sz w:val="15"/>
         </w:rPr>
         <w:br/>
-        <w:t xml:space="preserve">                    Drawing pixels [Raster=32,FirstPixel=0,LastPixel=7,XScroll=3,GraphicPixel=5,FirstByte=0,LastByte=1]</w:t>
+      </w:r>
+      <w:r>
+        <w:rPr>
+          <w:rFonts w:ascii="Consolas" w:hAnsi="Consolas"/>
+          <w:sz w:val="15"/>
+        </w:rPr>
+        <w:t xml:space="preserve">                    Drawing pixels [Raster=32,FirstPixel=0,LastPixel=7,XScroll=3,OutputPixel=8,ShiftActive=1,ShiftPixel=5,PendingReload=1,StagedAccess=1,ReloadInSpan=1]</w:t>
       </w:r>
       <w:r>
         <w:rPr>
@@ -6235,7 +6247,7 @@
       <w:pPr>
         <w:pStyle w:val="Ttulo"/>
       </w:pPr>
-      <w:bookmarkStart w:id="30" w:name="_Toc238916876"/>
+      <w:bookmarkStart w:id="30" w:name="_Toc239004148"/>
       <w:r>
         <w:lastRenderedPageBreak/>
         <w:t>7. Limitations and maintenance</w:t>
@@ -6247,7 +6259,7 @@
         <w:pStyle w:val="Ttulo1"/>
         <w:spacing w:before="280"/>
       </w:pPr>
-      <w:bookmarkStart w:id="31" w:name="_Toc238916877"/>
+      <w:bookmarkStart w:id="31" w:name="_Toc239004149"/>
       <w:r>
         <w:t>7.1 Specific limitations</w:t>
       </w:r>
@@ -6318,7 +6330,7 @@
         <w:pStyle w:val="Ttulo1"/>
         <w:spacing w:before="280"/>
       </w:pPr>
-      <w:bookmarkStart w:id="32" w:name="_Toc238916878"/>
+      <w:bookmarkStart w:id="32" w:name="_Toc239004150"/>
       <w:r>
         <w:t>7.2 Maintenance contract</w:t>
       </w:r>
@@ -6376,7 +6388,7 @@
       <w:pPr>
         <w:pStyle w:val="Ttulo"/>
       </w:pPr>
-      <w:bookmarkStart w:id="33" w:name="_Toc238916879"/>
+      <w:bookmarkStart w:id="33" w:name="_Toc239004151"/>
       <w:r>
         <w:lastRenderedPageBreak/>
         <w:t>Appendices</w:t>
@@ -6387,7 +6399,7 @@
       <w:pPr>
         <w:pStyle w:val="Ttulo1"/>
       </w:pPr>
-      <w:bookmarkStart w:id="34" w:name="_Toc238916880"/>
+      <w:bookmarkStart w:id="34" w:name="_Toc239004152"/>
       <w:r>
         <w:t>Appendix A. Provenance and revision</w:t>
       </w:r>
@@ -6409,7 +6421,7 @@
         <w:pStyle w:val="Ttulo1"/>
         <w:spacing w:before="280"/>
       </w:pPr>
-      <w:bookmarkStart w:id="35" w:name="_Toc238916881"/>
+      <w:bookmarkStart w:id="35" w:name="_Toc239004153"/>
       <w:r>
         <w:t>A.1 Watched source files</w:t>
       </w:r>
@@ -7368,7 +7380,7 @@
         <w:pStyle w:val="Ttulo1"/>
         <w:spacing w:before="280"/>
       </w:pPr>
-      <w:bookmarkStart w:id="36" w:name="_Toc238916882"/>
+      <w:bookmarkStart w:id="36" w:name="_Toc239004154"/>
       <w:r>
         <w:t>A.2 Revision history</w:t>
       </w:r>
@@ -7539,7 +7551,7 @@
       <w:pPr>
         <w:pStyle w:val="Ttulo1"/>
       </w:pPr>
-      <w:bookmarkStart w:id="37" w:name="_Toc238916883"/>
+      <w:bookmarkStart w:id="37" w:name="_Toc239004155"/>
       <w:r>
         <w:t>Illustrations</w:t>
       </w:r>
@@ -7579,7 +7591,7 @@
       <w:pPr>
         <w:pStyle w:val="Ttulo1"/>
       </w:pPr>
-      <w:bookmarkStart w:id="38" w:name="_Toc238916884"/>
+      <w:bookmarkStart w:id="38" w:name="_Toc239004156"/>
       <w:r>
         <w:lastRenderedPageBreak/>
         <w:t>Equations</w:t>
@@ -7685,7 +7697,7 @@
         <w:noProof/>
       </w:rPr>
       <w:drawing>
-        <wp:inline distT="0" distB="0" distL="0" distR="0" wp14:anchorId="297267B2" wp14:editId="2500DCAA">
+        <wp:inline distT="0" distB="0" distL="0" distR="0" wp14:anchorId="2E5C4BA9" wp14:editId="25CF529C">
           <wp:extent cx="576000" cy="459360"/>
           <wp:effectExtent l="0" t="0" r="0" b="0"/>
           <wp:docPr id="1" name="ARGOS framework mark" descr="ARGOS framework mark"/>
@@ -8095,10 +8107,10 @@
         <w:noProof/>
       </w:rPr>
       <w:drawing>
-        <wp:inline distT="0" distB="0" distL="0" distR="0" wp14:anchorId="2D1E3B84" wp14:editId="7BDDF94C">
+        <wp:inline distT="0" distB="0" distL="0" distR="0" wp14:anchorId="1DA0F7B3" wp14:editId="434B5D60">
           <wp:extent cx="1512000" cy="1205820"/>
           <wp:effectExtent l="0" t="0" r="0" b="0"/>
-          <wp:docPr id="1940887432" name="ARGOS framework mark" descr="ARGOS framework mark"/>
+          <wp:docPr id="1942409528" name="ARGOS framework mark" descr="ARGOS framework mark"/>
           <wp:cNvGraphicFramePr>
             <a:graphicFrameLocks xmlns:a="http://schemas.openxmlformats.org/drawingml/2006/main" noChangeAspect="1"/>
           </wp:cNvGraphicFramePr>
@@ -11071,19 +11083,19 @@
   <w:num w:numId="26" w16cid:durableId="846600881">
     <w:abstractNumId w:val="20"/>
   </w:num>
-  <w:num w:numId="27" w16cid:durableId="1254245012">
+  <w:num w:numId="27" w16cid:durableId="1925020211">
     <w:abstractNumId w:val="0"/>
   </w:num>
-  <w:num w:numId="28" w16cid:durableId="999191086">
+  <w:num w:numId="28" w16cid:durableId="2134253768">
     <w:abstractNumId w:val="0"/>
   </w:num>
-  <w:num w:numId="29" w16cid:durableId="1433089091">
+  <w:num w:numId="29" w16cid:durableId="1842891509">
     <w:abstractNumId w:val="6"/>
   </w:num>
-  <w:num w:numId="30" w16cid:durableId="1825469395">
+  <w:num w:numId="30" w16cid:durableId="1078095809">
     <w:abstractNumId w:val="0"/>
   </w:num>
-  <w:num w:numId="31" w16cid:durableId="1504784241">
+  <w:num w:numId="31" w16cid:durableId="1088038836">
     <w:abstractNumId w:val="0"/>
   </w:num>
 </w:numbering>

</xml_diff>

<commit_message>
VICII: More detail in debugging and BA low signal is now drawn when VICIIEvents = 0n.
</commit_message>
<xml_diff>
--- a/docs/C64Data/C64_DEBUG_File_Format.docx
+++ b/docs/C64Data/C64_DEBUG_File_Format.docx
@@ -561,9 +561,8 @@
       <w:pPr>
         <w:pStyle w:val="Ttulo1"/>
       </w:pPr>
-      <w:bookmarkStart w:id="0" w:name="_Toc239004118"/>
-      <w:r>
-        <w:lastRenderedPageBreak/>
+      <w:bookmarkStart w:id="0" w:name="_Toc239950015"/>
+      <w:r>
         <w:t>Contents</w:t>
       </w:r>
       <w:bookmarkEnd w:id="0"/>
@@ -596,7 +595,7 @@
       <w:r>
         <w:fldChar w:fldCharType="separate"/>
       </w:r>
-      <w:hyperlink w:anchor="_Toc239004118" w:history="1">
+      <w:hyperlink w:anchor="_Toc239950015" w:history="1">
         <w:r>
           <w:rPr>
             <w:rStyle w:val="Hipervnculo"/>
@@ -623,7 +622,7 @@
             <w:noProof/>
             <w:webHidden/>
           </w:rPr>
-          <w:instrText xml:space="preserve"> PAGEREF _Toc239004118 \h </w:instrText>
+          <w:instrText xml:space="preserve"> PAGEREF _Toc239950015 \h </w:instrText>
         </w:r>
         <w:r>
           <w:rPr>
@@ -674,7 +673,7 @@
           <w14:ligatures w14:val="standardContextual"/>
         </w:rPr>
       </w:pPr>
-      <w:hyperlink w:anchor="_Toc239004119" w:history="1">
+      <w:hyperlink w:anchor="_Toc239950016" w:history="1">
         <w:r>
           <w:rPr>
             <w:rStyle w:val="Hipervnculo"/>
@@ -701,7 +700,7 @@
             <w:noProof/>
             <w:webHidden/>
           </w:rPr>
-          <w:instrText xml:space="preserve"> PAGEREF _Toc239004119 \h </w:instrText>
+          <w:instrText xml:space="preserve"> PAGEREF _Toc239950016 \h </w:instrText>
         </w:r>
         <w:r>
           <w:rPr>
@@ -752,7 +751,7 @@
           <w14:ligatures w14:val="standardContextual"/>
         </w:rPr>
       </w:pPr>
-      <w:hyperlink w:anchor="_Toc239004120" w:history="1">
+      <w:hyperlink w:anchor="_Toc239950017" w:history="1">
         <w:r>
           <w:rPr>
             <w:rStyle w:val="Hipervnculo"/>
@@ -779,7 +778,7 @@
             <w:noProof/>
             <w:webHidden/>
           </w:rPr>
-          <w:instrText xml:space="preserve"> PAGEREF _Toc239004120 \h </w:instrText>
+          <w:instrText xml:space="preserve"> PAGEREF _Toc239950017 \h </w:instrText>
         </w:r>
         <w:r>
           <w:rPr>
@@ -829,7 +828,7 @@
           <w14:ligatures w14:val="standardContextual"/>
         </w:rPr>
       </w:pPr>
-      <w:hyperlink w:anchor="_Toc239004121" w:history="1">
+      <w:hyperlink w:anchor="_Toc239950018" w:history="1">
         <w:r>
           <w:rPr>
             <w:rStyle w:val="Hipervnculo"/>
@@ -856,7 +855,7 @@
             <w:noProof/>
             <w:webHidden/>
           </w:rPr>
-          <w:instrText xml:space="preserve"> PAGEREF _Toc239004121 \h </w:instrText>
+          <w:instrText xml:space="preserve"> PAGEREF _Toc239950018 \h </w:instrText>
         </w:r>
         <w:r>
           <w:rPr>
@@ -907,7 +906,7 @@
           <w14:ligatures w14:val="standardContextual"/>
         </w:rPr>
       </w:pPr>
-      <w:hyperlink w:anchor="_Toc239004122" w:history="1">
+      <w:hyperlink w:anchor="_Toc239950019" w:history="1">
         <w:r>
           <w:rPr>
             <w:rStyle w:val="Hipervnculo"/>
@@ -934,7 +933,7 @@
             <w:noProof/>
             <w:webHidden/>
           </w:rPr>
-          <w:instrText xml:space="preserve"> PAGEREF _Toc239004122 \h </w:instrText>
+          <w:instrText xml:space="preserve"> PAGEREF _Toc239950019 \h </w:instrText>
         </w:r>
         <w:r>
           <w:rPr>
@@ -984,7 +983,7 @@
           <w14:ligatures w14:val="standardContextual"/>
         </w:rPr>
       </w:pPr>
-      <w:hyperlink w:anchor="_Toc239004123" w:history="1">
+      <w:hyperlink w:anchor="_Toc239950020" w:history="1">
         <w:r>
           <w:rPr>
             <w:rStyle w:val="Hipervnculo"/>
@@ -1011,7 +1010,7 @@
             <w:noProof/>
             <w:webHidden/>
           </w:rPr>
-          <w:instrText xml:space="preserve"> PAGEREF _Toc239004123 \h </w:instrText>
+          <w:instrText xml:space="preserve"> PAGEREF _Toc239950020 \h </w:instrText>
         </w:r>
         <w:r>
           <w:rPr>
@@ -1061,7 +1060,7 @@
           <w14:ligatures w14:val="standardContextual"/>
         </w:rPr>
       </w:pPr>
-      <w:hyperlink w:anchor="_Toc239004124" w:history="1">
+      <w:hyperlink w:anchor="_Toc239950021" w:history="1">
         <w:r>
           <w:rPr>
             <w:rStyle w:val="Hipervnculo"/>
@@ -1088,7 +1087,7 @@
             <w:noProof/>
             <w:webHidden/>
           </w:rPr>
-          <w:instrText xml:space="preserve"> PAGEREF _Toc239004124 \h </w:instrText>
+          <w:instrText xml:space="preserve"> PAGEREF _Toc239950021 \h </w:instrText>
         </w:r>
         <w:r>
           <w:rPr>
@@ -1139,7 +1138,7 @@
           <w14:ligatures w14:val="standardContextual"/>
         </w:rPr>
       </w:pPr>
-      <w:hyperlink w:anchor="_Toc239004125" w:history="1">
+      <w:hyperlink w:anchor="_Toc239950022" w:history="1">
         <w:r>
           <w:rPr>
             <w:rStyle w:val="Hipervnculo"/>
@@ -1166,7 +1165,7 @@
             <w:noProof/>
             <w:webHidden/>
           </w:rPr>
-          <w:instrText xml:space="preserve"> PAGEREF _Toc239004125 \h </w:instrText>
+          <w:instrText xml:space="preserve"> PAGEREF _Toc239950022 \h </w:instrText>
         </w:r>
         <w:r>
           <w:rPr>
@@ -1216,7 +1215,7 @@
           <w14:ligatures w14:val="standardContextual"/>
         </w:rPr>
       </w:pPr>
-      <w:hyperlink w:anchor="_Toc239004126" w:history="1">
+      <w:hyperlink w:anchor="_Toc239950023" w:history="1">
         <w:r>
           <w:rPr>
             <w:rStyle w:val="Hipervnculo"/>
@@ -1243,7 +1242,7 @@
             <w:noProof/>
             <w:webHidden/>
           </w:rPr>
-          <w:instrText xml:space="preserve"> PAGEREF _Toc239004126 \h </w:instrText>
+          <w:instrText xml:space="preserve"> PAGEREF _Toc239950023 \h </w:instrText>
         </w:r>
         <w:r>
           <w:rPr>
@@ -1293,7 +1292,7 @@
           <w14:ligatures w14:val="standardContextual"/>
         </w:rPr>
       </w:pPr>
-      <w:hyperlink w:anchor="_Toc239004127" w:history="1">
+      <w:hyperlink w:anchor="_Toc239950024" w:history="1">
         <w:r>
           <w:rPr>
             <w:rStyle w:val="Hipervnculo"/>
@@ -1320,7 +1319,7 @@
             <w:noProof/>
             <w:webHidden/>
           </w:rPr>
-          <w:instrText xml:space="preserve"> PAGEREF _Toc239004127 \h </w:instrText>
+          <w:instrText xml:space="preserve"> PAGEREF _Toc239950024 \h </w:instrText>
         </w:r>
         <w:r>
           <w:rPr>
@@ -1371,7 +1370,7 @@
           <w14:ligatures w14:val="standardContextual"/>
         </w:rPr>
       </w:pPr>
-      <w:hyperlink w:anchor="_Toc239004128" w:history="1">
+      <w:hyperlink w:anchor="_Toc239950025" w:history="1">
         <w:r>
           <w:rPr>
             <w:rStyle w:val="Hipervnculo"/>
@@ -1398,7 +1397,7 @@
             <w:noProof/>
             <w:webHidden/>
           </w:rPr>
-          <w:instrText xml:space="preserve"> PAGEREF _Toc239004128 \h </w:instrText>
+          <w:instrText xml:space="preserve"> PAGEREF _Toc239950025 \h </w:instrText>
         </w:r>
         <w:r>
           <w:rPr>
@@ -1448,7 +1447,7 @@
           <w14:ligatures w14:val="standardContextual"/>
         </w:rPr>
       </w:pPr>
-      <w:hyperlink w:anchor="_Toc239004129" w:history="1">
+      <w:hyperlink w:anchor="_Toc239950026" w:history="1">
         <w:r>
           <w:rPr>
             <w:rStyle w:val="Hipervnculo"/>
@@ -1475,7 +1474,7 @@
             <w:noProof/>
             <w:webHidden/>
           </w:rPr>
-          <w:instrText xml:space="preserve"> PAGEREF _Toc239004129 \h </w:instrText>
+          <w:instrText xml:space="preserve"> PAGEREF _Toc239950026 \h </w:instrText>
         </w:r>
         <w:r>
           <w:rPr>
@@ -1525,7 +1524,7 @@
           <w14:ligatures w14:val="standardContextual"/>
         </w:rPr>
       </w:pPr>
-      <w:hyperlink w:anchor="_Toc239004130" w:history="1">
+      <w:hyperlink w:anchor="_Toc239950027" w:history="1">
         <w:r>
           <w:rPr>
             <w:rStyle w:val="Hipervnculo"/>
@@ -1552,7 +1551,7 @@
             <w:noProof/>
             <w:webHidden/>
           </w:rPr>
-          <w:instrText xml:space="preserve"> PAGEREF _Toc239004130 \h </w:instrText>
+          <w:instrText xml:space="preserve"> PAGEREF _Toc239950027 \h </w:instrText>
         </w:r>
         <w:r>
           <w:rPr>
@@ -1602,7 +1601,7 @@
           <w14:ligatures w14:val="standardContextual"/>
         </w:rPr>
       </w:pPr>
-      <w:hyperlink w:anchor="_Toc239004131" w:history="1">
+      <w:hyperlink w:anchor="_Toc239950028" w:history="1">
         <w:r>
           <w:rPr>
             <w:rStyle w:val="Hipervnculo"/>
@@ -1629,7 +1628,7 @@
             <w:noProof/>
             <w:webHidden/>
           </w:rPr>
-          <w:instrText xml:space="preserve"> PAGEREF _Toc239004131 \h </w:instrText>
+          <w:instrText xml:space="preserve"> PAGEREF _Toc239950028 \h </w:instrText>
         </w:r>
         <w:r>
           <w:rPr>
@@ -1679,7 +1678,7 @@
           <w14:ligatures w14:val="standardContextual"/>
         </w:rPr>
       </w:pPr>
-      <w:hyperlink w:anchor="_Toc239004132" w:history="1">
+      <w:hyperlink w:anchor="_Toc239950029" w:history="1">
         <w:r>
           <w:rPr>
             <w:rStyle w:val="Hipervnculo"/>
@@ -1706,7 +1705,7 @@
             <w:noProof/>
             <w:webHidden/>
           </w:rPr>
-          <w:instrText xml:space="preserve"> PAGEREF _Toc239004132 \h </w:instrText>
+          <w:instrText xml:space="preserve"> PAGEREF _Toc239950029 \h </w:instrText>
         </w:r>
         <w:r>
           <w:rPr>
@@ -1756,7 +1755,7 @@
           <w14:ligatures w14:val="standardContextual"/>
         </w:rPr>
       </w:pPr>
-      <w:hyperlink w:anchor="_Toc239004133" w:history="1">
+      <w:hyperlink w:anchor="_Toc239950030" w:history="1">
         <w:r>
           <w:rPr>
             <w:rStyle w:val="Hipervnculo"/>
@@ -1783,7 +1782,7 @@
             <w:noProof/>
             <w:webHidden/>
           </w:rPr>
-          <w:instrText xml:space="preserve"> PAGEREF _Toc239004133 \h </w:instrText>
+          <w:instrText xml:space="preserve"> PAGEREF _Toc239950030 \h </w:instrText>
         </w:r>
         <w:r>
           <w:rPr>
@@ -1833,7 +1832,7 @@
           <w14:ligatures w14:val="standardContextual"/>
         </w:rPr>
       </w:pPr>
-      <w:hyperlink w:anchor="_Toc239004134" w:history="1">
+      <w:hyperlink w:anchor="_Toc239950031" w:history="1">
         <w:r>
           <w:rPr>
             <w:rStyle w:val="Hipervnculo"/>
@@ -1860,7 +1859,7 @@
             <w:noProof/>
             <w:webHidden/>
           </w:rPr>
-          <w:instrText xml:space="preserve"> PAGEREF _Toc239004134 \h </w:instrText>
+          <w:instrText xml:space="preserve"> PAGEREF _Toc239950031 \h </w:instrText>
         </w:r>
         <w:r>
           <w:rPr>
@@ -1911,7 +1910,7 @@
           <w14:ligatures w14:val="standardContextual"/>
         </w:rPr>
       </w:pPr>
-      <w:hyperlink w:anchor="_Toc239004135" w:history="1">
+      <w:hyperlink w:anchor="_Toc239950032" w:history="1">
         <w:r>
           <w:rPr>
             <w:rStyle w:val="Hipervnculo"/>
@@ -1938,7 +1937,7 @@
             <w:noProof/>
             <w:webHidden/>
           </w:rPr>
-          <w:instrText xml:space="preserve"> PAGEREF _Toc239004135 \h </w:instrText>
+          <w:instrText xml:space="preserve"> PAGEREF _Toc239950032 \h </w:instrText>
         </w:r>
         <w:r>
           <w:rPr>
@@ -1988,7 +1987,7 @@
           <w14:ligatures w14:val="standardContextual"/>
         </w:rPr>
       </w:pPr>
-      <w:hyperlink w:anchor="_Toc239004136" w:history="1">
+      <w:hyperlink w:anchor="_Toc239950033" w:history="1">
         <w:r>
           <w:rPr>
             <w:rStyle w:val="Hipervnculo"/>
@@ -2015,7 +2014,7 @@
             <w:noProof/>
             <w:webHidden/>
           </w:rPr>
-          <w:instrText xml:space="preserve"> PAGEREF _Toc239004136 \h </w:instrText>
+          <w:instrText xml:space="preserve"> PAGEREF _Toc239950033 \h </w:instrText>
         </w:r>
         <w:r>
           <w:rPr>
@@ -2065,7 +2064,7 @@
           <w14:ligatures w14:val="standardContextual"/>
         </w:rPr>
       </w:pPr>
-      <w:hyperlink w:anchor="_Toc239004137" w:history="1">
+      <w:hyperlink w:anchor="_Toc239950034" w:history="1">
         <w:r>
           <w:rPr>
             <w:rStyle w:val="Hipervnculo"/>
@@ -2092,7 +2091,7 @@
             <w:noProof/>
             <w:webHidden/>
           </w:rPr>
-          <w:instrText xml:space="preserve"> PAGEREF _Toc239004137 \h </w:instrText>
+          <w:instrText xml:space="preserve"> PAGEREF _Toc239950034 \h </w:instrText>
         </w:r>
         <w:r>
           <w:rPr>
@@ -2140,7 +2139,7 @@
           <w14:ligatures w14:val="standardContextual"/>
         </w:rPr>
       </w:pPr>
-      <w:hyperlink w:anchor="_Toc239004138" w:history="1">
+      <w:hyperlink w:anchor="_Toc239950035" w:history="1">
         <w:r>
           <w:rPr>
             <w:rStyle w:val="Hipervnculo"/>
@@ -2167,7 +2166,7 @@
             <w:noProof/>
             <w:webHidden/>
           </w:rPr>
-          <w:instrText xml:space="preserve"> PAGEREF _Toc239004138 \h </w:instrText>
+          <w:instrText xml:space="preserve"> PAGEREF _Toc239950035 \h </w:instrText>
         </w:r>
         <w:r>
           <w:rPr>
@@ -2215,7 +2214,7 @@
           <w14:ligatures w14:val="standardContextual"/>
         </w:rPr>
       </w:pPr>
-      <w:hyperlink w:anchor="_Toc239004139" w:history="1">
+      <w:hyperlink w:anchor="_Toc239950036" w:history="1">
         <w:r>
           <w:rPr>
             <w:rStyle w:val="Hipervnculo"/>
@@ -2242,7 +2241,7 @@
             <w:noProof/>
             <w:webHidden/>
           </w:rPr>
-          <w:instrText xml:space="preserve"> PAGEREF _Toc239004139 \h </w:instrText>
+          <w:instrText xml:space="preserve"> PAGEREF _Toc239950036 \h </w:instrText>
         </w:r>
         <w:r>
           <w:rPr>
@@ -2290,7 +2289,7 @@
           <w14:ligatures w14:val="standardContextual"/>
         </w:rPr>
       </w:pPr>
-      <w:hyperlink w:anchor="_Toc239004140" w:history="1">
+      <w:hyperlink w:anchor="_Toc239950037" w:history="1">
         <w:r>
           <w:rPr>
             <w:rStyle w:val="Hipervnculo"/>
@@ -2317,7 +2316,7 @@
             <w:noProof/>
             <w:webHidden/>
           </w:rPr>
-          <w:instrText xml:space="preserve"> PAGEREF _Toc239004140 \h </w:instrText>
+          <w:instrText xml:space="preserve"> PAGEREF _Toc239950037 \h </w:instrText>
         </w:r>
         <w:r>
           <w:rPr>
@@ -2365,7 +2364,7 @@
           <w14:ligatures w14:val="standardContextual"/>
         </w:rPr>
       </w:pPr>
-      <w:hyperlink w:anchor="_Toc239004141" w:history="1">
+      <w:hyperlink w:anchor="_Toc239950038" w:history="1">
         <w:r>
           <w:rPr>
             <w:rStyle w:val="Hipervnculo"/>
@@ -2392,7 +2391,7 @@
             <w:noProof/>
             <w:webHidden/>
           </w:rPr>
-          <w:instrText xml:space="preserve"> PAGEREF _Toc239004141 \h </w:instrText>
+          <w:instrText xml:space="preserve"> PAGEREF _Toc239950038 \h </w:instrText>
         </w:r>
         <w:r>
           <w:rPr>
@@ -2440,7 +2439,7 @@
           <w14:ligatures w14:val="standardContextual"/>
         </w:rPr>
       </w:pPr>
-      <w:hyperlink w:anchor="_Toc239004142" w:history="1">
+      <w:hyperlink w:anchor="_Toc239950039" w:history="1">
         <w:r>
           <w:rPr>
             <w:rStyle w:val="Hipervnculo"/>
@@ -2467,7 +2466,7 @@
             <w:noProof/>
             <w:webHidden/>
           </w:rPr>
-          <w:instrText xml:space="preserve"> PAGEREF _Toc239004142 \h </w:instrText>
+          <w:instrText xml:space="preserve"> PAGEREF _Toc239950039 \h </w:instrText>
         </w:r>
         <w:r>
           <w:rPr>
@@ -2515,7 +2514,7 @@
           <w14:ligatures w14:val="standardContextual"/>
         </w:rPr>
       </w:pPr>
-      <w:hyperlink w:anchor="_Toc239004143" w:history="1">
+      <w:hyperlink w:anchor="_Toc239950040" w:history="1">
         <w:r>
           <w:rPr>
             <w:rStyle w:val="Hipervnculo"/>
@@ -2542,7 +2541,7 @@
             <w:noProof/>
             <w:webHidden/>
           </w:rPr>
-          <w:instrText xml:space="preserve"> PAGEREF _Toc239004143 \h </w:instrText>
+          <w:instrText xml:space="preserve"> PAGEREF _Toc239950040 \h </w:instrText>
         </w:r>
         <w:r>
           <w:rPr>
@@ -2590,7 +2589,7 @@
           <w14:ligatures w14:val="standardContextual"/>
         </w:rPr>
       </w:pPr>
-      <w:hyperlink w:anchor="_Toc239004144" w:history="1">
+      <w:hyperlink w:anchor="_Toc239950041" w:history="1">
         <w:r>
           <w:rPr>
             <w:rStyle w:val="Hipervnculo"/>
@@ -2617,7 +2616,7 @@
             <w:noProof/>
             <w:webHidden/>
           </w:rPr>
-          <w:instrText xml:space="preserve"> PAGEREF _Toc239004144 \h </w:instrText>
+          <w:instrText xml:space="preserve"> PAGEREF _Toc239950041 \h </w:instrText>
         </w:r>
         <w:r>
           <w:rPr>
@@ -2668,7 +2667,7 @@
           <w14:ligatures w14:val="standardContextual"/>
         </w:rPr>
       </w:pPr>
-      <w:hyperlink w:anchor="_Toc239004145" w:history="1">
+      <w:hyperlink w:anchor="_Toc239950042" w:history="1">
         <w:r>
           <w:rPr>
             <w:rStyle w:val="Hipervnculo"/>
@@ -2695,7 +2694,7 @@
             <w:noProof/>
             <w:webHidden/>
           </w:rPr>
-          <w:instrText xml:space="preserve"> PAGEREF _Toc239004145 \h </w:instrText>
+          <w:instrText xml:space="preserve"> PAGEREF _Toc239950042 \h </w:instrText>
         </w:r>
         <w:r>
           <w:rPr>
@@ -2745,7 +2744,7 @@
           <w14:ligatures w14:val="standardContextual"/>
         </w:rPr>
       </w:pPr>
-      <w:hyperlink w:anchor="_Toc239004146" w:history="1">
+      <w:hyperlink w:anchor="_Toc239950043" w:history="1">
         <w:r>
           <w:rPr>
             <w:rStyle w:val="Hipervnculo"/>
@@ -2772,7 +2771,7 @@
             <w:noProof/>
             <w:webHidden/>
           </w:rPr>
-          <w:instrText xml:space="preserve"> PAGEREF _Toc239004146 \h </w:instrText>
+          <w:instrText xml:space="preserve"> PAGEREF _Toc239950043 \h </w:instrText>
         </w:r>
         <w:r>
           <w:rPr>
@@ -2822,7 +2821,7 @@
           <w14:ligatures w14:val="standardContextual"/>
         </w:rPr>
       </w:pPr>
-      <w:hyperlink w:anchor="_Toc239004147" w:history="1">
+      <w:hyperlink w:anchor="_Toc239950044" w:history="1">
         <w:r>
           <w:rPr>
             <w:rStyle w:val="Hipervnculo"/>
@@ -2849,7 +2848,7 @@
             <w:noProof/>
             <w:webHidden/>
           </w:rPr>
-          <w:instrText xml:space="preserve"> PAGEREF _Toc239004147 \h </w:instrText>
+          <w:instrText xml:space="preserve"> PAGEREF _Toc239950044 \h </w:instrText>
         </w:r>
         <w:r>
           <w:rPr>
@@ -2900,7 +2899,7 @@
           <w14:ligatures w14:val="standardContextual"/>
         </w:rPr>
       </w:pPr>
-      <w:hyperlink w:anchor="_Toc239004148" w:history="1">
+      <w:hyperlink w:anchor="_Toc239950045" w:history="1">
         <w:r>
           <w:rPr>
             <w:rStyle w:val="Hipervnculo"/>
@@ -2927,7 +2926,7 @@
             <w:noProof/>
             <w:webHidden/>
           </w:rPr>
-          <w:instrText xml:space="preserve"> PAGEREF _Toc239004148 \h </w:instrText>
+          <w:instrText xml:space="preserve"> PAGEREF _Toc239950045 \h </w:instrText>
         </w:r>
         <w:r>
           <w:rPr>
@@ -2977,7 +2976,7 @@
           <w14:ligatures w14:val="standardContextual"/>
         </w:rPr>
       </w:pPr>
-      <w:hyperlink w:anchor="_Toc239004149" w:history="1">
+      <w:hyperlink w:anchor="_Toc239950046" w:history="1">
         <w:r>
           <w:rPr>
             <w:rStyle w:val="Hipervnculo"/>
@@ -3004,7 +3003,7 @@
             <w:noProof/>
             <w:webHidden/>
           </w:rPr>
-          <w:instrText xml:space="preserve"> PAGEREF _Toc239004149 \h </w:instrText>
+          <w:instrText xml:space="preserve"> PAGEREF _Toc239950046 \h </w:instrText>
         </w:r>
         <w:r>
           <w:rPr>
@@ -3054,7 +3053,7 @@
           <w14:ligatures w14:val="standardContextual"/>
         </w:rPr>
       </w:pPr>
-      <w:hyperlink w:anchor="_Toc239004150" w:history="1">
+      <w:hyperlink w:anchor="_Toc239950047" w:history="1">
         <w:r>
           <w:rPr>
             <w:rStyle w:val="Hipervnculo"/>
@@ -3081,7 +3080,7 @@
             <w:noProof/>
             <w:webHidden/>
           </w:rPr>
-          <w:instrText xml:space="preserve"> PAGEREF _Toc239004150 \h </w:instrText>
+          <w:instrText xml:space="preserve"> PAGEREF _Toc239950047 \h </w:instrText>
         </w:r>
         <w:r>
           <w:rPr>
@@ -3132,7 +3131,7 @@
           <w14:ligatures w14:val="standardContextual"/>
         </w:rPr>
       </w:pPr>
-      <w:hyperlink w:anchor="_Toc239004151" w:history="1">
+      <w:hyperlink w:anchor="_Toc239950048" w:history="1">
         <w:r>
           <w:rPr>
             <w:rStyle w:val="Hipervnculo"/>
@@ -3159,7 +3158,7 @@
             <w:noProof/>
             <w:webHidden/>
           </w:rPr>
-          <w:instrText xml:space="preserve"> PAGEREF _Toc239004151 \h </w:instrText>
+          <w:instrText xml:space="preserve"> PAGEREF _Toc239950048 \h </w:instrText>
         </w:r>
         <w:r>
           <w:rPr>
@@ -3209,7 +3208,7 @@
           <w14:ligatures w14:val="standardContextual"/>
         </w:rPr>
       </w:pPr>
-      <w:hyperlink w:anchor="_Toc239004152" w:history="1">
+      <w:hyperlink w:anchor="_Toc239950049" w:history="1">
         <w:r>
           <w:rPr>
             <w:rStyle w:val="Hipervnculo"/>
@@ -3236,7 +3235,7 @@
             <w:noProof/>
             <w:webHidden/>
           </w:rPr>
-          <w:instrText xml:space="preserve"> PAGEREF _Toc239004152 \h </w:instrText>
+          <w:instrText xml:space="preserve"> PAGEREF _Toc239950049 \h </w:instrText>
         </w:r>
         <w:r>
           <w:rPr>
@@ -3286,7 +3285,7 @@
           <w14:ligatures w14:val="standardContextual"/>
         </w:rPr>
       </w:pPr>
-      <w:hyperlink w:anchor="_Toc239004153" w:history="1">
+      <w:hyperlink w:anchor="_Toc239950050" w:history="1">
         <w:r>
           <w:rPr>
             <w:rStyle w:val="Hipervnculo"/>
@@ -3313,7 +3312,7 @@
             <w:noProof/>
             <w:webHidden/>
           </w:rPr>
-          <w:instrText xml:space="preserve"> PAGEREF _Toc239004153 \h </w:instrText>
+          <w:instrText xml:space="preserve"> PAGEREF _Toc239950050 \h </w:instrText>
         </w:r>
         <w:r>
           <w:rPr>
@@ -3363,7 +3362,7 @@
           <w14:ligatures w14:val="standardContextual"/>
         </w:rPr>
       </w:pPr>
-      <w:hyperlink w:anchor="_Toc239004154" w:history="1">
+      <w:hyperlink w:anchor="_Toc239950051" w:history="1">
         <w:r>
           <w:rPr>
             <w:rStyle w:val="Hipervnculo"/>
@@ -3390,7 +3389,7 @@
             <w:noProof/>
             <w:webHidden/>
           </w:rPr>
-          <w:instrText xml:space="preserve"> PAGEREF _Toc239004154 \h </w:instrText>
+          <w:instrText xml:space="preserve"> PAGEREF _Toc239950051 \h </w:instrText>
         </w:r>
         <w:r>
           <w:rPr>
@@ -3440,7 +3439,7 @@
           <w14:ligatures w14:val="standardContextual"/>
         </w:rPr>
       </w:pPr>
-      <w:hyperlink w:anchor="_Toc239004155" w:history="1">
+      <w:hyperlink w:anchor="_Toc239950052" w:history="1">
         <w:r>
           <w:rPr>
             <w:rStyle w:val="Hipervnculo"/>
@@ -3467,7 +3466,7 @@
             <w:noProof/>
             <w:webHidden/>
           </w:rPr>
-          <w:instrText xml:space="preserve"> PAGEREF _Toc239004155 \h </w:instrText>
+          <w:instrText xml:space="preserve"> PAGEREF _Toc239950052 \h </w:instrText>
         </w:r>
         <w:r>
           <w:rPr>
@@ -3517,7 +3516,7 @@
           <w14:ligatures w14:val="standardContextual"/>
         </w:rPr>
       </w:pPr>
-      <w:hyperlink w:anchor="_Toc239004156" w:history="1">
+      <w:hyperlink w:anchor="_Toc239950053" w:history="1">
         <w:r>
           <w:rPr>
             <w:rStyle w:val="Hipervnculo"/>
@@ -3544,7 +3543,7 @@
             <w:noProof/>
             <w:webHidden/>
           </w:rPr>
-          <w:instrText xml:space="preserve"> PAGEREF _Toc239004156 \h </w:instrText>
+          <w:instrText xml:space="preserve"> PAGEREF _Toc239950053 \h </w:instrText>
         </w:r>
         <w:r>
           <w:rPr>
@@ -3589,9 +3588,8 @@
       <w:pPr>
         <w:pStyle w:val="Ttulo"/>
       </w:pPr>
-      <w:bookmarkStart w:id="1" w:name="_Toc239004119"/>
-      <w:r>
-        <w:lastRenderedPageBreak/>
+      <w:bookmarkStart w:id="1" w:name="_Toc239950016"/>
+      <w:r>
         <w:t>Foreword</w:t>
       </w:r>
       <w:bookmarkEnd w:id="1"/>
@@ -3605,9 +3603,8 @@
       <w:pPr>
         <w:pStyle w:val="Ttulo"/>
       </w:pPr>
-      <w:bookmarkStart w:id="2" w:name="_Toc239004120"/>
-      <w:r>
-        <w:lastRenderedPageBreak/>
+      <w:bookmarkStart w:id="2" w:name="_Toc239950017"/>
+      <w:r>
         <w:t>1. Purpose, scope, and models</w:t>
       </w:r>
       <w:bookmarkEnd w:id="2"/>
@@ -3622,7 +3619,7 @@
         <w:pStyle w:val="Ttulo1"/>
         <w:spacing w:before="280"/>
       </w:pPr>
-      <w:bookmarkStart w:id="3" w:name="_Toc239004121"/>
+      <w:bookmarkStart w:id="3" w:name="_Toc239950018"/>
       <w:r>
         <w:t>1.1 Scope of this guide</w:t>
       </w:r>
@@ -3647,9 +3644,8 @@
       <w:pPr>
         <w:pStyle w:val="Ttulo"/>
       </w:pPr>
-      <w:bookmarkStart w:id="4" w:name="_Toc239004122"/>
-      <w:r>
-        <w:lastRenderedPageBreak/>
+      <w:bookmarkStart w:id="4" w:name="_Toc239950019"/>
+      <w:r>
         <w:t>2. Activation and producer selection</w:t>
       </w:r>
       <w:bookmarkEnd w:id="4"/>
@@ -3659,7 +3655,7 @@
         <w:pStyle w:val="Ttulo1"/>
         <w:spacing w:before="280"/>
       </w:pPr>
-      <w:bookmarkStart w:id="5" w:name="_Toc239004123"/>
+      <w:bookmarkStart w:id="5" w:name="_Toc239950020"/>
       <w:r>
         <w:t>2.1 Console command</w:t>
       </w:r>
@@ -4117,7 +4113,7 @@
         <w:pStyle w:val="Ttulo1"/>
         <w:spacing w:before="280"/>
       </w:pPr>
-      <w:bookmarkStart w:id="6" w:name="_Toc239004124"/>
+      <w:bookmarkStart w:id="6" w:name="_Toc239950021"/>
       <w:r>
         <w:t>2.2 Conditions and special paths</w:t>
       </w:r>
@@ -4175,9 +4171,8 @@
       <w:pPr>
         <w:pStyle w:val="Ttulo"/>
       </w:pPr>
-      <w:bookmarkStart w:id="7" w:name="_Toc239004125"/>
-      <w:r>
-        <w:lastRenderedPageBreak/>
+      <w:bookmarkStart w:id="7" w:name="_Toc239950022"/>
+      <w:r>
         <w:t>3. Common file structure</w:t>
       </w:r>
       <w:bookmarkEnd w:id="7"/>
@@ -4187,7 +4182,7 @@
         <w:pStyle w:val="Ttulo1"/>
         <w:spacing w:before="280"/>
       </w:pPr>
-      <w:bookmarkStart w:id="8" w:name="_Toc239004126"/>
+      <w:bookmarkStart w:id="8" w:name="_Toc239950023"/>
       <w:r>
         <w:t>3.1 Physical hierarchy</w:t>
       </w:r>
@@ -4508,7 +4503,7 @@
         <w:pStyle w:val="Ttulo1"/>
         <w:spacing w:before="280"/>
       </w:pPr>
-      <w:bookmarkStart w:id="9" w:name="_Toc239004127"/>
+      <w:bookmarkStart w:id="9" w:name="_Toc239950024"/>
       <w:r>
         <w:t>3.2 Timing rules</w:t>
       </w:r>
@@ -4590,9 +4585,8 @@
       <w:pPr>
         <w:pStyle w:val="Ttulo"/>
       </w:pPr>
-      <w:bookmarkStart w:id="10" w:name="_Toc239004128"/>
-      <w:r>
-        <w:lastRenderedPageBreak/>
+      <w:bookmarkStart w:id="10" w:name="_Toc239950025"/>
+      <w:r>
         <w:t>4. Common framework records</w:t>
       </w:r>
       <w:bookmarkEnd w:id="10"/>
@@ -4602,7 +4596,7 @@
         <w:pStyle w:val="Ttulo1"/>
         <w:spacing w:before="280"/>
       </w:pPr>
-      <w:bookmarkStart w:id="11" w:name="_Toc239004129"/>
+      <w:bookmarkStart w:id="11" w:name="_Toc239950026"/>
       <w:r>
         <w:t>CPU — Info Cycle</w:t>
       </w:r>
@@ -4668,7 +4662,7 @@
         <w:pStyle w:val="Ttulo1"/>
         <w:spacing w:before="280"/>
       </w:pPr>
-      <w:bookmarkStart w:id="12" w:name="_Toc239004130"/>
+      <w:bookmarkStart w:id="12" w:name="_Toc239950027"/>
       <w:r>
         <w:t>CPU — Transaction about to execute</w:t>
       </w:r>
@@ -4734,7 +4728,7 @@
         <w:pStyle w:val="Ttulo1"/>
         <w:spacing w:before="280"/>
       </w:pPr>
-      <w:bookmarkStart w:id="13" w:name="_Toc239004131"/>
+      <w:bookmarkStart w:id="13" w:name="_Toc239950028"/>
       <w:r>
         <w:t>CPU — Executed instruction</w:t>
       </w:r>
@@ -4800,7 +4794,7 @@
         <w:pStyle w:val="Ttulo1"/>
         <w:spacing w:before="280"/>
       </w:pPr>
-      <w:bookmarkStart w:id="14" w:name="_Toc239004132"/>
+      <w:bookmarkStart w:id="14" w:name="_Toc239950029"/>
       <w:r>
         <w:t>CPU — Stop</w:t>
       </w:r>
@@ -4855,7 +4849,6 @@
         <w:rPr>
           <w:b/>
         </w:rPr>
-        <w:lastRenderedPageBreak/>
         <w:t>Status:</w:t>
       </w:r>
       <w:r>
@@ -4867,7 +4860,7 @@
         <w:pStyle w:val="Ttulo1"/>
         <w:spacing w:before="280"/>
       </w:pPr>
-      <w:bookmarkStart w:id="15" w:name="_Toc239004133"/>
+      <w:bookmarkStart w:id="15" w:name="_Toc239950030"/>
       <w:r>
         <w:t>CPU — Interrupts</w:t>
       </w:r>
@@ -4933,7 +4926,7 @@
         <w:pStyle w:val="Ttulo1"/>
         <w:spacing w:before="280"/>
       </w:pPr>
-      <w:bookmarkStart w:id="16" w:name="_Toc239004134"/>
+      <w:bookmarkStart w:id="16" w:name="_Toc239950031"/>
       <w:r>
         <w:t>Memory — Applied Set</w:t>
       </w:r>
@@ -4998,9 +4991,8 @@
       <w:pPr>
         <w:pStyle w:val="Ttulo"/>
       </w:pPr>
-      <w:bookmarkStart w:id="17" w:name="_Toc239004135"/>
-      <w:r>
-        <w:lastRenderedPageBreak/>
+      <w:bookmarkStart w:id="17" w:name="_Toc239950032"/>
+      <w:r>
         <w:t>5. Machine-specific components</w:t>
       </w:r>
       <w:bookmarkEnd w:id="17"/>
@@ -5010,7 +5002,7 @@
         <w:pStyle w:val="Ttulo1"/>
         <w:spacing w:before="280"/>
       </w:pPr>
-      <w:bookmarkStart w:id="18" w:name="_Toc239004136"/>
+      <w:bookmarkStart w:id="18" w:name="_Toc239950033"/>
       <w:r>
         <w:t>5.1 Selectable inventory</w:t>
       </w:r>
@@ -5617,7 +5609,7 @@
         <w:pStyle w:val="Ttulo1"/>
         <w:spacing w:before="280"/>
       </w:pPr>
-      <w:bookmarkStart w:id="19" w:name="_Toc239004137"/>
+      <w:bookmarkStart w:id="19" w:name="_Toc239950034"/>
       <w:r>
         <w:t>5.2 Record catalog</w:t>
       </w:r>
@@ -5627,7 +5619,7 @@
       <w:pPr>
         <w:pStyle w:val="Ttulo2"/>
       </w:pPr>
-      <w:bookmarkStart w:id="20" w:name="_Toc239004138"/>
+      <w:bookmarkStart w:id="20" w:name="_Toc239950035"/>
       <w:r>
         <w:t>VICII — Info Cycle</w:t>
       </w:r>
@@ -5687,9 +5679,8 @@
       <w:pPr>
         <w:pStyle w:val="Ttulo2"/>
       </w:pPr>
-      <w:bookmarkStart w:id="21" w:name="_Toc239004139"/>
-      <w:r>
-        <w:lastRenderedPageBreak/>
+      <w:bookmarkStart w:id="21" w:name="_Toc239950036"/>
+      <w:r>
         <w:t>VICII — Video Matrix / graphics pipeline / pixel composition</w:t>
       </w:r>
       <w:bookmarkEnd w:id="21"/>
@@ -5713,10 +5704,13 @@
         <w:t>Fields:</w:t>
       </w:r>
       <w:r>
-        <w:t xml:space="preserve"> Reading Video Matrix &amp; Color RAM: Screen, Color, VLMI, VC, and Invalid. Reading Graphics: Data, GAccessIndex, VLMI, VC, RC, and Idle. Drawing pixels: Raster, FirstPixel, LastPixel, XScroll, OutputPixel, ShiftActive, ShiftPixel, PendingReload, StagedAccess, and ReloadInSpan. FirstPixel/LastPixel are inclusive positions inside the current eight-pixel slice. OutputPixel is the first screen-relative graphics position of the span before border masking. ShiftActive and ShiftPixel describe the persistent output b</w:t>
-      </w:r>
-      <w:r>
-        <w:t>yte before the span consumes it. PendingReload identifies the preceding cycle's input latch; StagedAccess identifies the g-access captured in the current cycle but not yet available to XSCROLL. ReloadInSpan indicates that the span reaches the XSCROLL reload comparator while pending data is available. Drawing sprite: sprite number and latched X,Y position.</w:t>
+        <w:t xml:space="preserve"> Reading Video Matrix &amp; Color RAM: Screen, Color, VLMI, VC, and Invalid. Reading Graphics: Address, Data, Screen, Color, GAccessIndex, VLMI, VC, RC, Idle, Mode, CharacterBase, and BitmapBase. Address is the exact VIC-visible address used by the completed memory read; Screen and Color are the values aligned with Data in the graphics fetch buffer. Drawing pixels: Raster, FirstPixel, LastPixel, XScroll, OutputPixel, ShiftActive, ShiftPixel, OutputData/Screen/Color, PendingReload, PendingData/Screen/Color, Stag</w:t>
+      </w:r>
+      <w:r>
+        <w:t>edAccess, StagedData/Screen/Color, ReloadInSpan, and ReloadPixel. FirstPixel/LastPixel are inclusive positions inside the current eight-pixel slice. OutputPixel is the first screen-relative graphics position of the span before border masking. Output*, Pending*, and Staged* expose the complete graphics/matrix/color triplet at each sequencer stage. ReloadPixel is the XSCROLL comparator position when the current span can reload pending data, or - when it cannot. Drawing sprite: sprite number and latched X,Y po</w:t>
+      </w:r>
+      <w:r>
+        <w:t>sition.</w:t>
       </w:r>
     </w:p>
     <w:p>
@@ -5741,17 +5735,17 @@
         <w:t>Events:</w:t>
       </w:r>
       <w:r>
-        <w:t xml:space="preserve"> Cycle 15 contains only the first c-access; cycles 16..54 log g-access and then c-access; cycle 55 contains only the final g-access. Invalid=1 identifies a DMA-delay/FLI c-access that supplied fallback bus data. XSCROLL selects the pixel that transfers the single pending latch from the preceding cycle to the active eight-pixel shift data; the active byte can therefore continue into the following VIC-II cycle. A pending byte whose comparator is missed is replaced when the current cycle's staged g-access comm</w:t>
-      </w:r>
-      <w:r>
-        <w:t>its after drawing. The shift stream advances even where graphics are outside pixels 0..319 or later hidden by the border. Once a sprite X position is latched, a later write cannot reposition its running sequencer.</w:t>
+        <w:t xml:space="preserve"> Cycle 15 contains only the first c-access; cycles 16..54 log g-access and then c-access; cycle 55 contains only the final g-access. Invalid=1 identifies a DMA-delay/FLI c-access that supplied fallback bus data. XSCROLL selects ReloadPixel, which transfers the complete pending triplet from the preceding cycle to the active output stage; the active byte can therefore continue into the following VIC-II cycle. A pending byte whose comparator is missed is replaced when the current cycle's staged g-access commit</w:t>
+      </w:r>
+      <w:r>
+        <w:t>s after drawing. The shift stream advances even where graphics are outside pixels 0..319 or later hidden by the border. Once a sprite X position is latched, a later write cannot reposition its running sequencer.</w:t>
       </w:r>
     </w:p>
     <w:p>
       <w:pPr>
         <w:pStyle w:val="Ttulo2"/>
       </w:pPr>
-      <w:bookmarkStart w:id="22" w:name="_Toc239004140"/>
+      <w:bookmarkStart w:id="22" w:name="_Toc239950037"/>
       <w:r>
         <w:t>VICII — CPU transaction prediction</w:t>
       </w:r>
@@ -5805,7 +5799,7 @@
       <w:pPr>
         <w:pStyle w:val="Ttulo2"/>
       </w:pPr>
-      <w:bookmarkStart w:id="23" w:name="_Toc239004141"/>
+      <w:bookmarkStart w:id="23" w:name="_Toc239950038"/>
       <w:r>
         <w:t>VICII — CPU stop applied / VIC-II register write</w:t>
       </w:r>
@@ -5849,7 +5843,6 @@
         <w:rPr>
           <w:b/>
         </w:rPr>
-        <w:lastRenderedPageBreak/>
         <w:t>Events:</w:t>
       </w:r>
       <w:r>
@@ -5860,7 +5853,7 @@
       <w:pPr>
         <w:pStyle w:val="Ttulo2"/>
       </w:pPr>
-      <w:bookmarkStart w:id="24" w:name="_Toc239004142"/>
+      <w:bookmarkStart w:id="24" w:name="_Toc239950039"/>
       <w:r>
         <w:t>CIA1/CIA2 — Info Cycle</w:t>
       </w:r>
@@ -5914,7 +5907,7 @@
       <w:pPr>
         <w:pStyle w:val="Ttulo2"/>
       </w:pPr>
-      <w:bookmarkStart w:id="25" w:name="_Toc239004143"/>
+      <w:bookmarkStart w:id="25" w:name="_Toc239950040"/>
       <w:r>
         <w:t>SID — Info Cycle</w:t>
       </w:r>
@@ -5968,7 +5961,7 @@
       <w:pPr>
         <w:pStyle w:val="Ttulo2"/>
       </w:pPr>
-      <w:bookmarkStart w:id="26" w:name="_Toc239004144"/>
+      <w:bookmarkStart w:id="26" w:name="_Toc239950041"/>
       <w:r>
         <w:t>PLA / C64 Memory</w:t>
       </w:r>
@@ -6022,9 +6015,8 @@
       <w:pPr>
         <w:pStyle w:val="Ttulo"/>
       </w:pPr>
-      <w:bookmarkStart w:id="27" w:name="_Toc239004145"/>
-      <w:r>
-        <w:lastRenderedPageBreak/>
+      <w:bookmarkStart w:id="27" w:name="_Toc239950042"/>
+      <w:r>
         <w:t>6. Interpretation method</w:t>
       </w:r>
       <w:bookmarkEnd w:id="27"/>
@@ -6034,7 +6026,7 @@
         <w:pStyle w:val="Ttulo1"/>
         <w:spacing w:before="280"/>
       </w:pPr>
-      <w:bookmarkStart w:id="28" w:name="_Toc239004146"/>
+      <w:bookmarkStart w:id="28" w:name="_Toc239950043"/>
       <w:r>
         <w:t>6.1 Recommended procedure</w:t>
       </w:r>
@@ -6117,7 +6109,7 @@
         <w:pStyle w:val="Ttulo1"/>
         <w:spacing w:before="280"/>
       </w:pPr>
-      <w:bookmarkStart w:id="29" w:name="_Toc239004147"/>
+      <w:bookmarkStart w:id="29" w:name="_Toc239950044"/>
       <w:r>
         <w:t>6.2 Annotated example</w:t>
       </w:r>
@@ -6213,7 +6205,7 @@
           <w:sz w:val="15"/>
         </w:rPr>
         <w:br/>
-        <w:t xml:space="preserve">                    Reading Graphics [Data=$3c,GAccessIndex=1,VLMI=1,VC=41,RC=2,Idle=0]</w:t>
+        <w:t xml:space="preserve">                    Reading Graphics [Address=$30ca,Data=3c,Screen=19,Color=1,GAccessIndex=1,VLMI=1,VC=41,RC=2,Idle=0,Mode=0,CharacterBase=$3000,BitmapBase=$2000]</w:t>
       </w:r>
       <w:r>
         <w:rPr>
@@ -6227,7 +6219,7 @@
           <w:rFonts w:ascii="Consolas" w:hAnsi="Consolas"/>
           <w:sz w:val="15"/>
         </w:rPr>
-        <w:t xml:space="preserve">                    Drawing pixels [Raster=32,FirstPixel=0,LastPixel=7,XScroll=3,OutputPixel=8,ShiftActive=1,ShiftPixel=5,PendingReload=1,StagedAccess=1,ReloadInSpan=1]</w:t>
+        <w:t xml:space="preserve">                    Drawing pixels [Raster=32,FirstPixel=0,LastPixel=7,XScroll=3,OutputPixel=8,ShiftActive=1,ShiftPixel=5,OutputData=7e,OutputScreen=18,OutputColor=1,PendingReload=1,PendingData=3c,PendingScreen=19,PendingColor=1,StagedAccess=1,StagedData=55,StagedScreen=1a,StagedColor=1,ReloadInSpan=1,ReloadPixel=3]</w:t>
       </w:r>
       <w:r>
         <w:rPr>
@@ -6247,9 +6239,8 @@
       <w:pPr>
         <w:pStyle w:val="Ttulo"/>
       </w:pPr>
-      <w:bookmarkStart w:id="30" w:name="_Toc239004148"/>
-      <w:r>
-        <w:lastRenderedPageBreak/>
+      <w:bookmarkStart w:id="30" w:name="_Toc239950045"/>
+      <w:r>
         <w:t>7. Limitations and maintenance</w:t>
       </w:r>
       <w:bookmarkEnd w:id="30"/>
@@ -6259,7 +6250,7 @@
         <w:pStyle w:val="Ttulo1"/>
         <w:spacing w:before="280"/>
       </w:pPr>
-      <w:bookmarkStart w:id="31" w:name="_Toc239004149"/>
+      <w:bookmarkStart w:id="31" w:name="_Toc239950046"/>
       <w:r>
         <w:t>7.1 Specific limitations</w:t>
       </w:r>
@@ -6330,7 +6321,7 @@
         <w:pStyle w:val="Ttulo1"/>
         <w:spacing w:before="280"/>
       </w:pPr>
-      <w:bookmarkStart w:id="32" w:name="_Toc239004150"/>
+      <w:bookmarkStart w:id="32" w:name="_Toc239950047"/>
       <w:r>
         <w:t>7.2 Maintenance contract</w:t>
       </w:r>
@@ -6388,9 +6379,8 @@
       <w:pPr>
         <w:pStyle w:val="Ttulo"/>
       </w:pPr>
-      <w:bookmarkStart w:id="33" w:name="_Toc239004151"/>
-      <w:r>
-        <w:lastRenderedPageBreak/>
+      <w:bookmarkStart w:id="33" w:name="_Toc239950048"/>
+      <w:r>
         <w:t>Appendices</w:t>
       </w:r>
       <w:bookmarkEnd w:id="33"/>
@@ -6399,7 +6389,7 @@
       <w:pPr>
         <w:pStyle w:val="Ttulo1"/>
       </w:pPr>
-      <w:bookmarkStart w:id="34" w:name="_Toc239004152"/>
+      <w:bookmarkStart w:id="34" w:name="_Toc239950049"/>
       <w:r>
         <w:t>Appendix A. Provenance and revision</w:t>
       </w:r>
@@ -6412,7 +6402,6 @@
     </w:p>
     <w:p>
       <w:r>
-        <w:lastRenderedPageBreak/>
         <w:t>Structured sources: .codex/documentation/debug-files/sources/debug-common.yaml and .codex/documentation/debug-files/sources/c64.yaml.</w:t>
       </w:r>
     </w:p>
@@ -6421,7 +6410,7 @@
         <w:pStyle w:val="Ttulo1"/>
         <w:spacing w:before="280"/>
       </w:pPr>
-      <w:bookmarkStart w:id="35" w:name="_Toc239004153"/>
+      <w:bookmarkStart w:id="35" w:name="_Toc239950050"/>
       <w:r>
         <w:t>A.1 Watched source files</w:t>
       </w:r>
@@ -7380,7 +7369,7 @@
         <w:pStyle w:val="Ttulo1"/>
         <w:spacing w:before="280"/>
       </w:pPr>
-      <w:bookmarkStart w:id="36" w:name="_Toc239004154"/>
+      <w:bookmarkStart w:id="36" w:name="_Toc239950051"/>
       <w:r>
         <w:t>A.2 Revision history</w:t>
       </w:r>
@@ -7551,7 +7540,7 @@
       <w:pPr>
         <w:pStyle w:val="Ttulo1"/>
       </w:pPr>
-      <w:bookmarkStart w:id="37" w:name="_Toc239004155"/>
+      <w:bookmarkStart w:id="37" w:name="_Toc239950052"/>
       <w:r>
         <w:t>Illustrations</w:t>
       </w:r>
@@ -7576,7 +7565,7 @@
           <w:bCs/>
           <w:noProof/>
         </w:rPr>
-        <w:t>No se encuentran elementos de tabla de ilustraciones.</w:t>
+        <w:t>No table of illustrations entries were found.</w:t>
       </w:r>
       <w:r>
         <w:fldChar w:fldCharType="end"/>
@@ -7591,9 +7580,8 @@
       <w:pPr>
         <w:pStyle w:val="Ttulo1"/>
       </w:pPr>
-      <w:bookmarkStart w:id="38" w:name="_Toc239004156"/>
-      <w:r>
-        <w:lastRenderedPageBreak/>
+      <w:bookmarkStart w:id="38" w:name="_Toc239950053"/>
+      <w:r>
         <w:t>Equations</w:t>
       </w:r>
       <w:bookmarkEnd w:id="38"/>
@@ -7617,7 +7605,7 @@
           <w:bCs/>
           <w:noProof/>
         </w:rPr>
-        <w:t>No se encuentran elementos de tabla de ilustraciones.</w:t>
+        <w:t>No table of illustrations entries were found.</w:t>
       </w:r>
       <w:r>
         <w:fldChar w:fldCharType="end"/>
@@ -7697,7 +7685,7 @@
         <w:noProof/>
       </w:rPr>
       <w:drawing>
-        <wp:inline distT="0" distB="0" distL="0" distR="0" wp14:anchorId="2E5C4BA9" wp14:editId="25CF529C">
+        <wp:inline distT="0" distB="0" distL="0" distR="0" wp14:anchorId="59967B4D" wp14:editId="7D052F5B">
           <wp:extent cx="576000" cy="459360"/>
           <wp:effectExtent l="0" t="0" r="0" b="0"/>
           <wp:docPr id="1" name="ARGOS framework mark" descr="ARGOS framework mark"/>
@@ -8107,10 +8095,10 @@
         <w:noProof/>
       </w:rPr>
       <w:drawing>
-        <wp:inline distT="0" distB="0" distL="0" distR="0" wp14:anchorId="1DA0F7B3" wp14:editId="434B5D60">
+        <wp:inline distT="0" distB="0" distL="0" distR="0" wp14:anchorId="4AF6B5F6" wp14:editId="75AF7A9A">
           <wp:extent cx="1512000" cy="1205820"/>
           <wp:effectExtent l="0" t="0" r="0" b="0"/>
-          <wp:docPr id="1942409528" name="ARGOS framework mark" descr="ARGOS framework mark"/>
+          <wp:docPr id="794265521" name="ARGOS framework mark" descr="ARGOS framework mark"/>
           <wp:cNvGraphicFramePr>
             <a:graphicFrameLocks xmlns:a="http://schemas.openxmlformats.org/drawingml/2006/main" noChangeAspect="1"/>
           </wp:cNvGraphicFramePr>
@@ -11083,19 +11071,19 @@
   <w:num w:numId="26" w16cid:durableId="846600881">
     <w:abstractNumId w:val="20"/>
   </w:num>
-  <w:num w:numId="27" w16cid:durableId="1925020211">
+  <w:num w:numId="27" w16cid:durableId="1651717082">
     <w:abstractNumId w:val="0"/>
   </w:num>
-  <w:num w:numId="28" w16cid:durableId="2134253768">
+  <w:num w:numId="28" w16cid:durableId="44109301">
     <w:abstractNumId w:val="0"/>
   </w:num>
-  <w:num w:numId="29" w16cid:durableId="1842891509">
+  <w:num w:numId="29" w16cid:durableId="779303771">
     <w:abstractNumId w:val="6"/>
   </w:num>
-  <w:num w:numId="30" w16cid:durableId="1078095809">
+  <w:num w:numId="30" w16cid:durableId="1190030080">
     <w:abstractNumId w:val="0"/>
   </w:num>
-  <w:num w:numId="31" w16cid:durableId="1088038836">
+  <w:num w:numId="31" w16cid:durableId="1474443744">
     <w:abstractNumId w:val="0"/>
   </w:num>
 </w:numbering>

</xml_diff>